<commit_message>
Add variant Excel charts and restyle Andrew Word report
Duplicate charge/discharge value tables for C×10 and C×10/r×10,
build matching dual-axis I(t)/U(t) charts, put input data in a Word
table, recolor plots, and rewrite the conclusion with the same meaning.

Co-authored-by: itkodovaya <itkodovaya@users.noreply.github.com>
</commit_message>
<xml_diff>
--- a/Andrew/задание 1.docx
+++ b/Andrew/задание 1.docx
@@ -8889,203 +8889,537 @@
         <w:t>Исходные данные</w:t>
       </w:r>
     </w:p>
-    <w:p>
-      <w:pPr>
-        <w:pStyle w:val="a6"/>
-        <w:numPr>
-          <w:ilvl w:val="0"/>
-          <w:numId w:val="1"/>
-        </w:numPr>
-        <w:spacing w:before="0" w:beforeAutospacing="0" w:after="0" w:afterAutospacing="0"/>
-        <w:rPr>
-          <w:sz w:val="28"/>
-          <w:szCs w:val="28"/>
-        </w:rPr>
-      </w:pPr>
-      <m:oMath>
-        <m:r>
-          <w:rPr>
-            <w:rFonts w:ascii="Cambria Math" w:hAnsi="Cambria Math"/>
-            <w:sz w:val="28"/>
-            <w:szCs w:val="28"/>
-          </w:rPr>
-          <m:t xml:space="preserve">E=12 </m:t>
-        </m:r>
-        <m:r>
-          <w:rPr>
-            <w:rFonts w:ascii="Cambria Math" w:hAnsi="Cambria Math"/>
-            <w:sz w:val="28"/>
-            <w:szCs w:val="28"/>
-            <w:lang w:val="en-US"/>
-          </w:rPr>
-          <m:t>В</m:t>
-        </m:r>
-        <m:r>
-          <w:rPr>
-            <w:rFonts w:ascii="Cambria Math" w:hAnsi="Cambria Math"/>
-            <w:sz w:val="28"/>
-            <w:szCs w:val="28"/>
-          </w:rPr>
-          <m:t>;</m:t>
-        </m:r>
-      </m:oMath>
-    </w:p>
-    <w:p>
-      <w:pPr>
-        <w:pStyle w:val="a6"/>
-        <w:numPr>
-          <w:ilvl w:val="0"/>
-          <w:numId w:val="1"/>
-        </w:numPr>
-        <w:spacing w:before="0" w:beforeAutospacing="0" w:after="0" w:afterAutospacing="0"/>
-        <w:rPr>
-          <w:i/>
-          <w:sz w:val="28"/>
-          <w:szCs w:val="28"/>
-        </w:rPr>
-      </w:pPr>
-      <m:oMath>
-        <m:r>
-          <w:rPr>
-            <w:rFonts w:ascii="Cambria Math" w:hAnsi="Cambria Math"/>
-            <w:sz w:val="28"/>
-            <w:szCs w:val="28"/>
-            <w:lang w:val="en-US"/>
-          </w:rPr>
-          <m:t>C</m:t>
-        </m:r>
-        <m:r>
-          <w:rPr>
-            <w:rFonts w:ascii="Cambria Math" w:hAnsi="Cambria Math"/>
-            <w:sz w:val="28"/>
-            <w:szCs w:val="28"/>
-          </w:rPr>
-          <m:t>=4*</m:t>
-        </m:r>
-        <m:sSup>
-          <m:sSupPr>
-            <m:ctrlPr>
-              <w:rPr>
-                <w:rFonts w:ascii="Cambria Math" w:hAnsi="Cambria Math"/>
-                <w:i/>
-                <w:sz w:val="28"/>
-                <w:szCs w:val="28"/>
-              </w:rPr>
-            </m:ctrlPr>
-          </m:sSupPr>
-          <m:e>
-            <m:r>
-              <w:rPr>
-                <w:rFonts w:ascii="Cambria Math" w:hAnsi="Cambria Math"/>
-                <w:sz w:val="28"/>
-                <w:szCs w:val="28"/>
-              </w:rPr>
-              <m:t>10</m:t>
-            </m:r>
-          </m:e>
-          <m:sup>
-            <m:r>
-              <w:rPr>
-                <w:rFonts w:ascii="Cambria Math" w:hAnsi="Cambria Math"/>
-                <w:sz w:val="28"/>
-                <w:szCs w:val="28"/>
-              </w:rPr>
-              <m:t>-4</m:t>
-            </m:r>
-          </m:sup>
-        </m:sSup>
-        <m:r>
-          <w:rPr>
-            <w:rFonts w:ascii="Cambria Math" w:hAnsi="Cambria Math"/>
-            <w:sz w:val="28"/>
-            <w:szCs w:val="28"/>
-          </w:rPr>
-          <m:t xml:space="preserve"> Ф;</m:t>
-        </m:r>
-      </m:oMath>
-    </w:p>
-    <w:p>
-      <w:pPr>
-        <w:pStyle w:val="a6"/>
-        <w:numPr>
-          <w:ilvl w:val="0"/>
-          <w:numId w:val="1"/>
-        </w:numPr>
-        <w:spacing w:before="0" w:beforeAutospacing="0" w:after="0" w:afterAutospacing="0"/>
-        <w:rPr>
-          <w:i/>
-          <w:sz w:val="28"/>
-          <w:szCs w:val="28"/>
-        </w:rPr>
-      </w:pPr>
-      <m:oMath>
-        <m:r>
-          <w:rPr>
-            <w:rFonts w:ascii="Cambria Math" w:hAnsi="Cambria Math"/>
-            <w:sz w:val="28"/>
-            <w:szCs w:val="28"/>
-          </w:rPr>
-          <m:t>R=100 Ом;</m:t>
-        </m:r>
-      </m:oMath>
-    </w:p>
-    <w:p>
-      <w:pPr>
-        <w:pStyle w:val="a6"/>
-        <w:numPr>
-          <w:ilvl w:val="0"/>
-          <w:numId w:val="1"/>
-        </w:numPr>
-        <w:spacing w:before="0" w:beforeAutospacing="0" w:after="0" w:afterAutospacing="0"/>
-        <w:rPr>
-          <w:sz w:val="28"/>
-          <w:szCs w:val="28"/>
-        </w:rPr>
-      </w:pPr>
-      <m:oMath>
-        <m:r>
-          <w:rPr>
-            <w:rFonts w:ascii="Cambria Math" w:hAnsi="Cambria Math"/>
-            <w:sz w:val="28"/>
-            <w:szCs w:val="28"/>
-          </w:rPr>
-          <m:t>r1=4 Ом</m:t>
-        </m:r>
-        <m:r>
-          <w:rPr>
-            <w:rFonts w:ascii="Cambria Math" w:hAnsi="Cambria Math"/>
-            <w:sz w:val="28"/>
-            <w:szCs w:val="28"/>
-            <w:lang w:val="en-US"/>
-          </w:rPr>
-          <m:t>;</m:t>
-        </m:r>
-      </m:oMath>
-    </w:p>
-    <w:p>
-      <w:pPr>
-        <w:pStyle w:val="a6"/>
-        <w:numPr>
-          <w:ilvl w:val="0"/>
-          <w:numId w:val="1"/>
-        </w:numPr>
-        <w:spacing w:before="0" w:beforeAutospacing="0" w:after="0" w:afterAutospacing="0"/>
-        <w:rPr>
-          <w:sz w:val="28"/>
-          <w:szCs w:val="28"/>
-        </w:rPr>
-      </w:pPr>
-      <m:oMath>
-        <m:r>
-          <w:rPr>
-            <w:rFonts w:ascii="Cambria Math" w:hAnsi="Cambria Math"/>
-            <w:sz w:val="28"/>
-            <w:szCs w:val="28"/>
-          </w:rPr>
-          <m:t>r2=40 Ом.</m:t>
-        </m:r>
-      </m:oMath>
-    </w:p>
+    <w:tbl>
+      <w:tblPr>
+        <w:tblStyle w:val="a7"/>
+        <w:tblW w:type="auto" w:w="0"/>
+        <w:jc w:val="center"/>
+        <w:tblLook w:firstColumn="1" w:firstRow="1" w:lastColumn="0" w:lastRow="0" w:noHBand="0" w:noVBand="1" w:val="04A0"/>
+        <w:jc w:val="center"/>
+        <w:tblW w:w="8400" w:type="dxa"/>
+      </w:tblPr>
+      <w:tblGrid>
+        <w:gridCol w:w="3118"/>
+        <w:gridCol w:w="3118"/>
+        <w:gridCol w:w="3118"/>
+      </w:tblGrid>
+      <w:tr>
+        <w:tc>
+          <w:tcPr>
+            <w:tcW w:type="dxa" w:w="3118"/>
+            <w:shd w:val="clear" w:color="auto" w:fill="6A0DAD"/>
+            <w:tcBorders>
+              <w:top w:val="single" w:sz="8" w:space="0" w:color="6A0DAD"/>
+              <w:left w:val="single" w:sz="8" w:space="0" w:color="6A0DAD"/>
+              <w:bottom w:val="single" w:sz="8" w:space="0" w:color="6A0DAD"/>
+              <w:right w:val="single" w:sz="8" w:space="0" w:color="6A0DAD"/>
+            </w:tcBorders>
+            <w:tcW w:w="2800" w:type="dxa"/>
+          </w:tcPr>
+          <w:p>
+            <w:pPr>
+              <w:jc w:val="center"/>
+            </w:pPr>
+            <w:r/>
+            <w:r>
+              <w:rPr>
+                <w:rFonts w:ascii="Times New Roman" w:hAnsi="Times New Roman" w:eastAsia="Times New Roman"/>
+                <w:b/>
+                <w:color w:val="FFFFFF"/>
+                <w:sz w:val="26"/>
+              </w:rPr>
+              <w:t>Параметр</w:t>
+            </w:r>
+          </w:p>
+        </w:tc>
+        <w:tc>
+          <w:tcPr>
+            <w:tcW w:type="dxa" w:w="3118"/>
+            <w:shd w:val="clear" w:color="auto" w:fill="6A0DAD"/>
+            <w:tcBorders>
+              <w:top w:val="single" w:sz="8" w:space="0" w:color="6A0DAD"/>
+              <w:left w:val="single" w:sz="8" w:space="0" w:color="6A0DAD"/>
+              <w:bottom w:val="single" w:sz="8" w:space="0" w:color="6A0DAD"/>
+              <w:right w:val="single" w:sz="8" w:space="0" w:color="6A0DAD"/>
+            </w:tcBorders>
+            <w:tcW w:w="2800" w:type="dxa"/>
+          </w:tcPr>
+          <w:p>
+            <w:pPr>
+              <w:jc w:val="center"/>
+            </w:pPr>
+            <w:r/>
+            <w:r>
+              <w:rPr>
+                <w:rFonts w:ascii="Times New Roman" w:hAnsi="Times New Roman" w:eastAsia="Times New Roman"/>
+                <w:b/>
+                <w:color w:val="FFFFFF"/>
+                <w:sz w:val="26"/>
+              </w:rPr>
+              <w:t>Значение</w:t>
+            </w:r>
+          </w:p>
+        </w:tc>
+        <w:tc>
+          <w:tcPr>
+            <w:tcW w:type="dxa" w:w="3118"/>
+            <w:shd w:val="clear" w:color="auto" w:fill="6A0DAD"/>
+            <w:tcBorders>
+              <w:top w:val="single" w:sz="8" w:space="0" w:color="6A0DAD"/>
+              <w:left w:val="single" w:sz="8" w:space="0" w:color="6A0DAD"/>
+              <w:bottom w:val="single" w:sz="8" w:space="0" w:color="6A0DAD"/>
+              <w:right w:val="single" w:sz="8" w:space="0" w:color="6A0DAD"/>
+            </w:tcBorders>
+            <w:tcW w:w="2800" w:type="dxa"/>
+          </w:tcPr>
+          <w:p>
+            <w:pPr>
+              <w:jc w:val="center"/>
+            </w:pPr>
+            <w:r/>
+            <w:r>
+              <w:rPr>
+                <w:rFonts w:ascii="Times New Roman" w:hAnsi="Times New Roman" w:eastAsia="Times New Roman"/>
+                <w:b/>
+                <w:color w:val="FFFFFF"/>
+                <w:sz w:val="26"/>
+              </w:rPr>
+              <w:t>Единица измерения</w:t>
+            </w:r>
+          </w:p>
+        </w:tc>
+      </w:tr>
+      <w:tr>
+        <w:tc>
+          <w:tcPr>
+            <w:tcW w:type="dxa" w:w="3118"/>
+            <w:shd w:val="clear" w:color="auto" w:fill="F5EEF8"/>
+            <w:tcBorders>
+              <w:top w:val="single" w:sz="8" w:space="0" w:color="6A0DAD"/>
+              <w:left w:val="single" w:sz="8" w:space="0" w:color="6A0DAD"/>
+              <w:bottom w:val="single" w:sz="8" w:space="0" w:color="6A0DAD"/>
+              <w:right w:val="single" w:sz="8" w:space="0" w:color="6A0DAD"/>
+            </w:tcBorders>
+            <w:tcW w:w="2800" w:type="dxa"/>
+          </w:tcPr>
+          <w:p>
+            <w:pPr>
+              <w:jc w:val="center"/>
+            </w:pPr>
+            <w:r/>
+            <w:r>
+              <w:rPr>
+                <w:rFonts w:ascii="Times New Roman" w:hAnsi="Times New Roman" w:eastAsia="Times New Roman"/>
+                <w:b w:val="0"/>
+                <w:color w:val="1C2833"/>
+                <w:sz w:val="26"/>
+              </w:rPr>
+              <w:t>ЭДС источника E</w:t>
+            </w:r>
+          </w:p>
+        </w:tc>
+        <w:tc>
+          <w:tcPr>
+            <w:tcW w:type="dxa" w:w="3118"/>
+            <w:shd w:val="clear" w:color="auto" w:fill="F5EEF8"/>
+            <w:tcBorders>
+              <w:top w:val="single" w:sz="8" w:space="0" w:color="6A0DAD"/>
+              <w:left w:val="single" w:sz="8" w:space="0" w:color="6A0DAD"/>
+              <w:bottom w:val="single" w:sz="8" w:space="0" w:color="6A0DAD"/>
+              <w:right w:val="single" w:sz="8" w:space="0" w:color="6A0DAD"/>
+            </w:tcBorders>
+            <w:tcW w:w="2800" w:type="dxa"/>
+          </w:tcPr>
+          <w:p>
+            <w:pPr>
+              <w:jc w:val="center"/>
+            </w:pPr>
+            <w:r/>
+            <w:r>
+              <w:rPr>
+                <w:rFonts w:ascii="Times New Roman" w:hAnsi="Times New Roman" w:eastAsia="Times New Roman"/>
+                <w:b w:val="0"/>
+                <w:color w:val="1C2833"/>
+                <w:sz w:val="26"/>
+              </w:rPr>
+              <w:t>12</w:t>
+            </w:r>
+          </w:p>
+        </w:tc>
+        <w:tc>
+          <w:tcPr>
+            <w:tcW w:type="dxa" w:w="3118"/>
+            <w:shd w:val="clear" w:color="auto" w:fill="F5EEF8"/>
+            <w:tcBorders>
+              <w:top w:val="single" w:sz="8" w:space="0" w:color="6A0DAD"/>
+              <w:left w:val="single" w:sz="8" w:space="0" w:color="6A0DAD"/>
+              <w:bottom w:val="single" w:sz="8" w:space="0" w:color="6A0DAD"/>
+              <w:right w:val="single" w:sz="8" w:space="0" w:color="6A0DAD"/>
+            </w:tcBorders>
+            <w:tcW w:w="2800" w:type="dxa"/>
+          </w:tcPr>
+          <w:p>
+            <w:pPr>
+              <w:jc w:val="center"/>
+            </w:pPr>
+            <w:r/>
+            <w:r>
+              <w:rPr>
+                <w:rFonts w:ascii="Times New Roman" w:hAnsi="Times New Roman" w:eastAsia="Times New Roman"/>
+                <w:b w:val="0"/>
+                <w:color w:val="1C2833"/>
+                <w:sz w:val="26"/>
+              </w:rPr>
+              <w:t>В</w:t>
+            </w:r>
+          </w:p>
+        </w:tc>
+      </w:tr>
+      <w:tr>
+        <w:tc>
+          <w:tcPr>
+            <w:tcW w:type="dxa" w:w="3118"/>
+            <w:shd w:val="clear" w:color="auto" w:fill="FFFFFF"/>
+            <w:tcBorders>
+              <w:top w:val="single" w:sz="8" w:space="0" w:color="6A0DAD"/>
+              <w:left w:val="single" w:sz="8" w:space="0" w:color="6A0DAD"/>
+              <w:bottom w:val="single" w:sz="8" w:space="0" w:color="6A0DAD"/>
+              <w:right w:val="single" w:sz="8" w:space="0" w:color="6A0DAD"/>
+            </w:tcBorders>
+            <w:tcW w:w="2800" w:type="dxa"/>
+          </w:tcPr>
+          <w:p>
+            <w:pPr>
+              <w:jc w:val="center"/>
+            </w:pPr>
+            <w:r/>
+            <w:r>
+              <w:rPr>
+                <w:rFonts w:ascii="Times New Roman" w:hAnsi="Times New Roman" w:eastAsia="Times New Roman"/>
+                <w:b w:val="0"/>
+                <w:color w:val="1C2833"/>
+                <w:sz w:val="26"/>
+              </w:rPr>
+              <w:t>Ёмкость конденсатора C</w:t>
+            </w:r>
+          </w:p>
+        </w:tc>
+        <w:tc>
+          <w:tcPr>
+            <w:tcW w:type="dxa" w:w="3118"/>
+            <w:shd w:val="clear" w:color="auto" w:fill="FFFFFF"/>
+            <w:tcBorders>
+              <w:top w:val="single" w:sz="8" w:space="0" w:color="6A0DAD"/>
+              <w:left w:val="single" w:sz="8" w:space="0" w:color="6A0DAD"/>
+              <w:bottom w:val="single" w:sz="8" w:space="0" w:color="6A0DAD"/>
+              <w:right w:val="single" w:sz="8" w:space="0" w:color="6A0DAD"/>
+            </w:tcBorders>
+            <w:tcW w:w="2800" w:type="dxa"/>
+          </w:tcPr>
+          <w:p>
+            <w:pPr>
+              <w:jc w:val="center"/>
+            </w:pPr>
+            <w:r/>
+            <w:r>
+              <w:rPr>
+                <w:rFonts w:ascii="Times New Roman" w:hAnsi="Times New Roman" w:eastAsia="Times New Roman"/>
+                <w:b w:val="0"/>
+                <w:color w:val="1C2833"/>
+                <w:sz w:val="26"/>
+              </w:rPr>
+              <w:t>4·10⁻⁴</w:t>
+            </w:r>
+          </w:p>
+        </w:tc>
+        <w:tc>
+          <w:tcPr>
+            <w:tcW w:type="dxa" w:w="3118"/>
+            <w:shd w:val="clear" w:color="auto" w:fill="FFFFFF"/>
+            <w:tcBorders>
+              <w:top w:val="single" w:sz="8" w:space="0" w:color="6A0DAD"/>
+              <w:left w:val="single" w:sz="8" w:space="0" w:color="6A0DAD"/>
+              <w:bottom w:val="single" w:sz="8" w:space="0" w:color="6A0DAD"/>
+              <w:right w:val="single" w:sz="8" w:space="0" w:color="6A0DAD"/>
+            </w:tcBorders>
+            <w:tcW w:w="2800" w:type="dxa"/>
+          </w:tcPr>
+          <w:p>
+            <w:pPr>
+              <w:jc w:val="center"/>
+            </w:pPr>
+            <w:r/>
+            <w:r>
+              <w:rPr>
+                <w:rFonts w:ascii="Times New Roman" w:hAnsi="Times New Roman" w:eastAsia="Times New Roman"/>
+                <w:b w:val="0"/>
+                <w:color w:val="1C2833"/>
+                <w:sz w:val="26"/>
+              </w:rPr>
+              <w:t>Ф</w:t>
+            </w:r>
+          </w:p>
+        </w:tc>
+      </w:tr>
+      <w:tr>
+        <w:tc>
+          <w:tcPr>
+            <w:tcW w:type="dxa" w:w="3118"/>
+            <w:shd w:val="clear" w:color="auto" w:fill="F5EEF8"/>
+            <w:tcBorders>
+              <w:top w:val="single" w:sz="8" w:space="0" w:color="6A0DAD"/>
+              <w:left w:val="single" w:sz="8" w:space="0" w:color="6A0DAD"/>
+              <w:bottom w:val="single" w:sz="8" w:space="0" w:color="6A0DAD"/>
+              <w:right w:val="single" w:sz="8" w:space="0" w:color="6A0DAD"/>
+            </w:tcBorders>
+            <w:tcW w:w="2800" w:type="dxa"/>
+          </w:tcPr>
+          <w:p>
+            <w:pPr>
+              <w:jc w:val="center"/>
+            </w:pPr>
+            <w:r/>
+            <w:r>
+              <w:rPr>
+                <w:rFonts w:ascii="Times New Roman" w:hAnsi="Times New Roman" w:eastAsia="Times New Roman"/>
+                <w:b w:val="0"/>
+                <w:color w:val="1C2833"/>
+                <w:sz w:val="26"/>
+              </w:rPr>
+              <w:t>Сопротивление резистора R</w:t>
+            </w:r>
+          </w:p>
+        </w:tc>
+        <w:tc>
+          <w:tcPr>
+            <w:tcW w:type="dxa" w:w="3118"/>
+            <w:shd w:val="clear" w:color="auto" w:fill="F5EEF8"/>
+            <w:tcBorders>
+              <w:top w:val="single" w:sz="8" w:space="0" w:color="6A0DAD"/>
+              <w:left w:val="single" w:sz="8" w:space="0" w:color="6A0DAD"/>
+              <w:bottom w:val="single" w:sz="8" w:space="0" w:color="6A0DAD"/>
+              <w:right w:val="single" w:sz="8" w:space="0" w:color="6A0DAD"/>
+            </w:tcBorders>
+            <w:tcW w:w="2800" w:type="dxa"/>
+          </w:tcPr>
+          <w:p>
+            <w:pPr>
+              <w:jc w:val="center"/>
+            </w:pPr>
+            <w:r/>
+            <w:r>
+              <w:rPr>
+                <w:rFonts w:ascii="Times New Roman" w:hAnsi="Times New Roman" w:eastAsia="Times New Roman"/>
+                <w:b w:val="0"/>
+                <w:color w:val="1C2833"/>
+                <w:sz w:val="26"/>
+              </w:rPr>
+              <w:t>100</w:t>
+            </w:r>
+          </w:p>
+        </w:tc>
+        <w:tc>
+          <w:tcPr>
+            <w:tcW w:type="dxa" w:w="3118"/>
+            <w:shd w:val="clear" w:color="auto" w:fill="F5EEF8"/>
+            <w:tcBorders>
+              <w:top w:val="single" w:sz="8" w:space="0" w:color="6A0DAD"/>
+              <w:left w:val="single" w:sz="8" w:space="0" w:color="6A0DAD"/>
+              <w:bottom w:val="single" w:sz="8" w:space="0" w:color="6A0DAD"/>
+              <w:right w:val="single" w:sz="8" w:space="0" w:color="6A0DAD"/>
+            </w:tcBorders>
+            <w:tcW w:w="2800" w:type="dxa"/>
+          </w:tcPr>
+          <w:p>
+            <w:pPr>
+              <w:jc w:val="center"/>
+            </w:pPr>
+            <w:r/>
+            <w:r>
+              <w:rPr>
+                <w:rFonts w:ascii="Times New Roman" w:hAnsi="Times New Roman" w:eastAsia="Times New Roman"/>
+                <w:b w:val="0"/>
+                <w:color w:val="1C2833"/>
+                <w:sz w:val="26"/>
+              </w:rPr>
+              <w:t>Ом</w:t>
+            </w:r>
+          </w:p>
+        </w:tc>
+      </w:tr>
+      <w:tr>
+        <w:tc>
+          <w:tcPr>
+            <w:tcW w:type="dxa" w:w="3118"/>
+            <w:shd w:val="clear" w:color="auto" w:fill="FFFFFF"/>
+            <w:tcBorders>
+              <w:top w:val="single" w:sz="8" w:space="0" w:color="6A0DAD"/>
+              <w:left w:val="single" w:sz="8" w:space="0" w:color="6A0DAD"/>
+              <w:bottom w:val="single" w:sz="8" w:space="0" w:color="6A0DAD"/>
+              <w:right w:val="single" w:sz="8" w:space="0" w:color="6A0DAD"/>
+            </w:tcBorders>
+            <w:tcW w:w="2800" w:type="dxa"/>
+          </w:tcPr>
+          <w:p>
+            <w:pPr>
+              <w:jc w:val="center"/>
+            </w:pPr>
+            <w:r/>
+            <w:r>
+              <w:rPr>
+                <w:rFonts w:ascii="Times New Roman" w:hAnsi="Times New Roman" w:eastAsia="Times New Roman"/>
+                <w:b w:val="0"/>
+                <w:color w:val="1C2833"/>
+                <w:sz w:val="26"/>
+              </w:rPr>
+              <w:t>Сопротивление лампы Л1  r1</w:t>
+            </w:r>
+          </w:p>
+        </w:tc>
+        <w:tc>
+          <w:tcPr>
+            <w:tcW w:type="dxa" w:w="3118"/>
+            <w:shd w:val="clear" w:color="auto" w:fill="FFFFFF"/>
+            <w:tcBorders>
+              <w:top w:val="single" w:sz="8" w:space="0" w:color="6A0DAD"/>
+              <w:left w:val="single" w:sz="8" w:space="0" w:color="6A0DAD"/>
+              <w:bottom w:val="single" w:sz="8" w:space="0" w:color="6A0DAD"/>
+              <w:right w:val="single" w:sz="8" w:space="0" w:color="6A0DAD"/>
+            </w:tcBorders>
+            <w:tcW w:w="2800" w:type="dxa"/>
+          </w:tcPr>
+          <w:p>
+            <w:pPr>
+              <w:jc w:val="center"/>
+            </w:pPr>
+            <w:r/>
+            <w:r>
+              <w:rPr>
+                <w:rFonts w:ascii="Times New Roman" w:hAnsi="Times New Roman" w:eastAsia="Times New Roman"/>
+                <w:b w:val="0"/>
+                <w:color w:val="1C2833"/>
+                <w:sz w:val="26"/>
+              </w:rPr>
+              <w:t>4</w:t>
+            </w:r>
+          </w:p>
+        </w:tc>
+        <w:tc>
+          <w:tcPr>
+            <w:tcW w:type="dxa" w:w="3118"/>
+            <w:shd w:val="clear" w:color="auto" w:fill="FFFFFF"/>
+            <w:tcBorders>
+              <w:top w:val="single" w:sz="8" w:space="0" w:color="6A0DAD"/>
+              <w:left w:val="single" w:sz="8" w:space="0" w:color="6A0DAD"/>
+              <w:bottom w:val="single" w:sz="8" w:space="0" w:color="6A0DAD"/>
+              <w:right w:val="single" w:sz="8" w:space="0" w:color="6A0DAD"/>
+            </w:tcBorders>
+            <w:tcW w:w="2800" w:type="dxa"/>
+          </w:tcPr>
+          <w:p>
+            <w:pPr>
+              <w:jc w:val="center"/>
+            </w:pPr>
+            <w:r/>
+            <w:r>
+              <w:rPr>
+                <w:rFonts w:ascii="Times New Roman" w:hAnsi="Times New Roman" w:eastAsia="Times New Roman"/>
+                <w:b w:val="0"/>
+                <w:color w:val="1C2833"/>
+                <w:sz w:val="26"/>
+              </w:rPr>
+              <w:t>Ом</w:t>
+            </w:r>
+          </w:p>
+        </w:tc>
+      </w:tr>
+      <w:tr>
+        <w:tc>
+          <w:tcPr>
+            <w:tcW w:type="dxa" w:w="3118"/>
+            <w:shd w:val="clear" w:color="auto" w:fill="F5EEF8"/>
+            <w:tcBorders>
+              <w:top w:val="single" w:sz="8" w:space="0" w:color="6A0DAD"/>
+              <w:left w:val="single" w:sz="8" w:space="0" w:color="6A0DAD"/>
+              <w:bottom w:val="single" w:sz="8" w:space="0" w:color="6A0DAD"/>
+              <w:right w:val="single" w:sz="8" w:space="0" w:color="6A0DAD"/>
+            </w:tcBorders>
+            <w:tcW w:w="2800" w:type="dxa"/>
+          </w:tcPr>
+          <w:p>
+            <w:pPr>
+              <w:jc w:val="center"/>
+            </w:pPr>
+            <w:r/>
+            <w:r>
+              <w:rPr>
+                <w:rFonts w:ascii="Times New Roman" w:hAnsi="Times New Roman" w:eastAsia="Times New Roman"/>
+                <w:b w:val="0"/>
+                <w:color w:val="1C2833"/>
+                <w:sz w:val="26"/>
+              </w:rPr>
+              <w:t>Сопротивление лампы Л2  r2</w:t>
+            </w:r>
+          </w:p>
+        </w:tc>
+        <w:tc>
+          <w:tcPr>
+            <w:tcW w:type="dxa" w:w="3118"/>
+            <w:shd w:val="clear" w:color="auto" w:fill="F5EEF8"/>
+            <w:tcBorders>
+              <w:top w:val="single" w:sz="8" w:space="0" w:color="6A0DAD"/>
+              <w:left w:val="single" w:sz="8" w:space="0" w:color="6A0DAD"/>
+              <w:bottom w:val="single" w:sz="8" w:space="0" w:color="6A0DAD"/>
+              <w:right w:val="single" w:sz="8" w:space="0" w:color="6A0DAD"/>
+            </w:tcBorders>
+            <w:tcW w:w="2800" w:type="dxa"/>
+          </w:tcPr>
+          <w:p>
+            <w:pPr>
+              <w:jc w:val="center"/>
+            </w:pPr>
+            <w:r/>
+            <w:r>
+              <w:rPr>
+                <w:rFonts w:ascii="Times New Roman" w:hAnsi="Times New Roman" w:eastAsia="Times New Roman"/>
+                <w:b w:val="0"/>
+                <w:color w:val="1C2833"/>
+                <w:sz w:val="26"/>
+              </w:rPr>
+              <w:t>40</w:t>
+            </w:r>
+          </w:p>
+        </w:tc>
+        <w:tc>
+          <w:tcPr>
+            <w:tcW w:type="dxa" w:w="3118"/>
+            <w:shd w:val="clear" w:color="auto" w:fill="F5EEF8"/>
+            <w:tcBorders>
+              <w:top w:val="single" w:sz="8" w:space="0" w:color="6A0DAD"/>
+              <w:left w:val="single" w:sz="8" w:space="0" w:color="6A0DAD"/>
+              <w:bottom w:val="single" w:sz="8" w:space="0" w:color="6A0DAD"/>
+              <w:right w:val="single" w:sz="8" w:space="0" w:color="6A0DAD"/>
+            </w:tcBorders>
+            <w:tcW w:w="2800" w:type="dxa"/>
+          </w:tcPr>
+          <w:p>
+            <w:pPr>
+              <w:jc w:val="center"/>
+            </w:pPr>
+            <w:r/>
+            <w:r>
+              <w:rPr>
+                <w:rFonts w:ascii="Times New Roman" w:hAnsi="Times New Roman" w:eastAsia="Times New Roman"/>
+                <w:b w:val="0"/>
+                <w:color w:val="1C2833"/>
+                <w:sz w:val="26"/>
+              </w:rPr>
+              <w:t>Ом</w:t>
+            </w:r>
+          </w:p>
+        </w:tc>
+      </w:tr>
+    </w:tbl>
     <w:p>
       <w:pPr>
         <w:spacing w:after="0"/>
@@ -15572,175 +15906,11 @@
       </w:pPr>
       <w:r>
         <w:rPr>
-          <w:rFonts w:ascii="Times New Roman" w:hAnsi="Times New Roman" w:cs="Times New Roman"/>
+          <w:rFonts w:ascii="Times New Roman" w:hAnsi="Times New Roman" w:eastAsia="Times New Roman"/>
+          <w:b w:val="0"/>
           <w:sz w:val="28"/>
         </w:rPr>
-        <w:t>Изменения силы тока и напряжения при заряде (разряде) происходит по экспоненциальному закону. Увеличивая</w:t>
-      </w:r>
-      <w:r>
-        <w:rPr>
-          <w:rFonts w:ascii="Times New Roman" w:hAnsi="Times New Roman" w:cs="Times New Roman"/>
-          <w:sz w:val="28"/>
-        </w:rPr>
-        <w:t xml:space="preserve"> ем</w:t>
-      </w:r>
-      <w:r>
-        <w:rPr>
-          <w:rFonts w:ascii="Times New Roman" w:hAnsi="Times New Roman" w:cs="Times New Roman"/>
-          <w:sz w:val="28"/>
-        </w:rPr>
-        <w:t>кость</w:t>
-      </w:r>
-      <w:r>
-        <w:rPr>
-          <w:rFonts w:ascii="Times New Roman" w:hAnsi="Times New Roman" w:cs="Times New Roman"/>
-          <w:sz w:val="28"/>
-        </w:rPr>
-        <w:t xml:space="preserve"> конденсатора и его сопротивлени</w:t>
-      </w:r>
-      <w:r>
-        <w:rPr>
-          <w:rFonts w:ascii="Times New Roman" w:hAnsi="Times New Roman" w:cs="Times New Roman"/>
-          <w:sz w:val="28"/>
-        </w:rPr>
-        <w:t>е,</w:t>
-      </w:r>
-      <w:r>
-        <w:rPr>
-          <w:rFonts w:ascii="Times New Roman" w:hAnsi="Times New Roman" w:cs="Times New Roman"/>
-          <w:sz w:val="28"/>
-        </w:rPr>
-        <w:t xml:space="preserve"> время заряда (разряда) </w:t>
-      </w:r>
-      <w:r>
-        <w:rPr>
-          <w:rFonts w:ascii="Times New Roman" w:hAnsi="Times New Roman" w:cs="Times New Roman"/>
-          <w:bCs/>
-          <w:sz w:val="28"/>
-        </w:rPr>
-        <w:t>увеличивается</w:t>
-      </w:r>
-      <w:r>
-        <w:rPr>
-          <w:rFonts w:ascii="Times New Roman" w:hAnsi="Times New Roman" w:cs="Times New Roman"/>
-          <w:sz w:val="28"/>
-        </w:rPr>
-        <w:t xml:space="preserve">. При уменьшении емкости конденсатора и его сопротивления время его заряда (разряда) </w:t>
-      </w:r>
-      <w:r>
-        <w:rPr>
-          <w:rFonts w:ascii="Times New Roman" w:hAnsi="Times New Roman" w:cs="Times New Roman"/>
-          <w:bCs/>
-          <w:sz w:val="28"/>
-        </w:rPr>
-        <w:t>уменьшается</w:t>
-      </w:r>
-      <w:r>
-        <w:rPr>
-          <w:rFonts w:ascii="Times New Roman" w:hAnsi="Times New Roman" w:cs="Times New Roman"/>
-          <w:sz w:val="28"/>
-        </w:rPr>
-        <w:t>.</w:t>
-      </w:r>
-      <w:r>
-        <w:rPr>
-          <w:rFonts w:ascii="Times New Roman" w:hAnsi="Times New Roman" w:cs="Times New Roman"/>
-          <w:sz w:val="28"/>
-        </w:rPr>
-        <w:t xml:space="preserve"> Длительность переходного процесса определяется </w:t>
-      </w:r>
-      <w:r>
-        <w:rPr>
-          <w:rFonts w:ascii="Times New Roman" w:hAnsi="Times New Roman" w:cs="Times New Roman"/>
-          <w:sz w:val="28"/>
-        </w:rPr>
-        <w:t>показателем релаксации</w:t>
-      </w:r>
-      <w:r>
-        <w:rPr>
-          <w:rFonts w:ascii="Times New Roman" w:hAnsi="Times New Roman" w:cs="Times New Roman"/>
-          <w:sz w:val="28"/>
-        </w:rPr>
-        <w:t xml:space="preserve"> </w:t>
-      </w:r>
-      <w:r>
-        <w:rPr>
-          <w:rFonts w:ascii="Times New Roman" w:hAnsi="Times New Roman" w:cs="Times New Roman"/>
-          <w:sz w:val="28"/>
-        </w:rPr>
-        <w:t>[</w:t>
-      </w:r>
-      <w:r>
-        <w:rPr>
-          <w:rFonts w:ascii="Times New Roman" w:hAnsi="Times New Roman" w:cs="Times New Roman"/>
-          <w:sz w:val="28"/>
-          <w:lang w:val="en-US"/>
-        </w:rPr>
-        <w:t>R</w:t>
-      </w:r>
-      <w:r>
-        <w:rPr>
-          <w:rFonts w:ascii="Times New Roman" w:hAnsi="Times New Roman" w:cs="Times New Roman"/>
-          <w:sz w:val="28"/>
-        </w:rPr>
-        <w:t>*</w:t>
-      </w:r>
-      <w:r>
-        <w:rPr>
-          <w:rFonts w:ascii="Times New Roman" w:hAnsi="Times New Roman" w:cs="Times New Roman"/>
-          <w:sz w:val="28"/>
-          <w:lang w:val="en-US"/>
-        </w:rPr>
-        <w:t>c</w:t>
-      </w:r>
-      <w:r>
-        <w:rPr>
-          <w:rFonts w:ascii="Times New Roman" w:hAnsi="Times New Roman" w:cs="Times New Roman"/>
-          <w:sz w:val="28"/>
-        </w:rPr>
-        <w:t>]</w:t>
-      </w:r>
-      <w:r>
-        <w:rPr>
-          <w:rFonts w:ascii="Times New Roman" w:hAnsi="Times New Roman" w:cs="Times New Roman"/>
-          <w:sz w:val="28"/>
-        </w:rPr>
-        <w:t xml:space="preserve"> </w:t>
-      </w:r>
-      <w:r>
-        <w:rPr>
-          <w:rFonts w:ascii="Times New Roman" w:hAnsi="Times New Roman" w:cs="Times New Roman"/>
-          <w:sz w:val="28"/>
-        </w:rPr>
-        <w:t>=</w:t>
-      </w:r>
-      <w:r>
-        <w:rPr>
-          <w:rFonts w:ascii="Times New Roman" w:hAnsi="Times New Roman" w:cs="Times New Roman"/>
-          <w:sz w:val="28"/>
-        </w:rPr>
-        <w:t xml:space="preserve"> </w:t>
-      </w:r>
-      <w:r>
-        <w:rPr>
-          <w:rFonts w:ascii="Times New Roman" w:hAnsi="Times New Roman" w:cs="Times New Roman"/>
-          <w:sz w:val="28"/>
-        </w:rPr>
-        <w:t>сек</w:t>
-      </w:r>
-      <w:r>
-        <w:rPr>
-          <w:rFonts w:ascii="Times New Roman" w:hAnsi="Times New Roman" w:cs="Times New Roman"/>
-          <w:sz w:val="28"/>
-        </w:rPr>
-        <w:t>унды</w:t>
-      </w:r>
-      <w:r>
-        <w:rPr>
-          <w:rFonts w:ascii="Times New Roman" w:hAnsi="Times New Roman" w:cs="Times New Roman"/>
-          <w:sz w:val="28"/>
-        </w:rPr>
-        <w:t>.</w:t>
+        <w:t>Сила тока и напряжение на конденсаторе при заряде и разряде изменяются по экспоненциальному закону. Рост ёмкости конденсатора и сопротивления цепи растягивает переходный процесс во времени, а уменьшение этих величин, напротив, ускоряет заряд и разряд. Длительность переходного процесса определяется постоянной времени RC, которая измеряется в секундах.</w:t>
       </w:r>
     </w:p>
     <w:p>

</xml_diff>

<commit_message>
Add Andrew assignment files to Task-1
Place the provided Word and Excel reports in Andrew/задание 1.

Co-authored-by: itkodovaya <itkodovaya@users.noreply.github.com>
</commit_message>
<xml_diff>
--- a/Andrew/задание 1.docx
+++ b/Andrew/задание 1.docx
@@ -1,6 +1,6 @@
 
 <file path=word/document.xml><?xml version="1.0" encoding="utf-8"?>
-<w:document xmlns:wpc="http://schemas.microsoft.com/office/word/2010/wordprocessingCanvas" xmlns:cx="http://schemas.microsoft.com/office/drawing/2014/chartex" xmlns:mc="http://schemas.openxmlformats.org/markup-compatibility/2006" xmlns:o="urn:schemas-microsoft-com:office:office" xmlns:r="http://schemas.openxmlformats.org/officeDocument/2006/relationships" xmlns:m="http://schemas.openxmlformats.org/officeDocument/2006/math" xmlns:v="urn:schemas-microsoft-com:vml" xmlns:wp14="http://schemas.microsoft.com/office/word/2010/wordprocessingDrawing" xmlns:wp="http://schemas.openxmlformats.org/drawingml/2006/wordprocessingDrawing" xmlns:w10="urn:schemas-microsoft-com:office:word" xmlns:w="http://schemas.openxmlformats.org/wordprocessingml/2006/main" xmlns:w14="http://schemas.microsoft.com/office/word/2010/wordml" xmlns:w15="http://schemas.microsoft.com/office/word/2012/wordml" xmlns:w16se="http://schemas.microsoft.com/office/word/2015/wordml/symex" xmlns:wpg="http://schemas.microsoft.com/office/word/2010/wordprocessingGroup" xmlns:wpi="http://schemas.microsoft.com/office/word/2010/wordprocessingInk" xmlns:wne="http://schemas.microsoft.com/office/word/2006/wordml" xmlns:wps="http://schemas.microsoft.com/office/word/2010/wordprocessingShape" mc:Ignorable="w14 w15 w16se wp14">
+<w:document xmlns:wpc="http://schemas.microsoft.com/office/word/2010/wordprocessingCanvas" xmlns:cx="http://schemas.microsoft.com/office/drawing/2014/chartex" xmlns:cx1="http://schemas.microsoft.com/office/drawing/2015/9/8/chartex" xmlns:cx2="http://schemas.microsoft.com/office/drawing/2015/10/21/chartex" xmlns:cx3="http://schemas.microsoft.com/office/drawing/2016/5/9/chartex" xmlns:cx4="http://schemas.microsoft.com/office/drawing/2016/5/10/chartex" xmlns:cx5="http://schemas.microsoft.com/office/drawing/2016/5/11/chartex" xmlns:cx6="http://schemas.microsoft.com/office/drawing/2016/5/12/chartex" xmlns:cx7="http://schemas.microsoft.com/office/drawing/2016/5/13/chartex" xmlns:cx8="http://schemas.microsoft.com/office/drawing/2016/5/14/chartex" xmlns:mc="http://schemas.openxmlformats.org/markup-compatibility/2006" xmlns:aink="http://schemas.microsoft.com/office/drawing/2016/ink" xmlns:am3d="http://schemas.microsoft.com/office/drawing/2017/model3d" xmlns:o="urn:schemas-microsoft-com:office:office" xmlns:oel="http://schemas.microsoft.com/office/2019/extlst" xmlns:r="http://schemas.openxmlformats.org/officeDocument/2006/relationships" xmlns:m="http://schemas.openxmlformats.org/officeDocument/2006/math" xmlns:v="urn:schemas-microsoft-com:vml" xmlns:wp14="http://schemas.microsoft.com/office/word/2010/wordprocessingDrawing" xmlns:wp="http://schemas.openxmlformats.org/drawingml/2006/wordprocessingDrawing" xmlns:w10="urn:schemas-microsoft-com:office:word" xmlns:w="http://schemas.openxmlformats.org/wordprocessingml/2006/main" xmlns:w14="http://schemas.microsoft.com/office/word/2010/wordml" xmlns:w15="http://schemas.microsoft.com/office/word/2012/wordml" xmlns:w16cex="http://schemas.microsoft.com/office/word/2018/wordml/cex" xmlns:w16cid="http://schemas.microsoft.com/office/word/2016/wordml/cid" xmlns:w16="http://schemas.microsoft.com/office/word/2018/wordml" xmlns:w16sdtdh="http://schemas.microsoft.com/office/word/2020/wordml/sdtdatahash" xmlns:w16se="http://schemas.microsoft.com/office/word/2015/wordml/symex" xmlns:wpg="http://schemas.microsoft.com/office/word/2010/wordprocessingGroup" xmlns:wpi="http://schemas.microsoft.com/office/word/2010/wordprocessingInk" xmlns:wne="http://schemas.microsoft.com/office/word/2006/wordml" xmlns:wps="http://schemas.microsoft.com/office/word/2010/wordprocessingShape" mc:Ignorable="w14 w15 w16se w16cid w16 w16cex w16sdtdh wp14">
   <w:body>
     <w:p>
       <w:pPr>
@@ -121,9 +121,7 @@
           <w:i w:val="0"/>
         </w:rPr>
       </w:pPr>
-      <w:bookmarkStart w:id="1" w:name="_GoBack"/>
     </w:p>
-    <w:bookmarkEnd w:id="1"/>
     <w:p>
       <w:pPr>
         <w:pStyle w:val="FR1"/>
@@ -380,7 +378,7 @@
         <mc:AlternateContent>
           <mc:Choice Requires="wps">
             <w:drawing>
-              <wp:anchor distT="0" distB="0" distL="114300" distR="114300" simplePos="0" relativeHeight="251662336" behindDoc="0" locked="0" layoutInCell="1" allowOverlap="1" wp14:anchorId="381E5DB5" wp14:editId="7FFDAA16">
+              <wp:anchor distT="0" distB="0" distL="114300" distR="114300" simplePos="0" relativeHeight="251662336" behindDoc="0" locked="0" layoutInCell="1" allowOverlap="1" wp14:anchorId="69E927BC" wp14:editId="30A64957">
                 <wp:simplePos x="0" y="0"/>
                 <wp:positionH relativeFrom="column">
                   <wp:posOffset>786765</wp:posOffset>
@@ -493,7 +491,7 @@
               </wp:anchor>
             </w:drawing>
           </mc:Choice>
-          <mc:Fallback xmlns:w16sdtdh="http://schemas.microsoft.com/office/word/2020/wordml/sdtdatahash" xmlns:w16="http://schemas.microsoft.com/office/word/2018/wordml" xmlns:w16cid="http://schemas.microsoft.com/office/word/2016/wordml/cid" xmlns:w16cex="http://schemas.microsoft.com/office/word/2018/wordml/cex" xmlns:am3d="http://schemas.microsoft.com/office/drawing/2017/model3d" xmlns:aink="http://schemas.microsoft.com/office/drawing/2016/ink" xmlns:cx8="http://schemas.microsoft.com/office/drawing/2016/5/14/chartex" xmlns:cx7="http://schemas.microsoft.com/office/drawing/2016/5/13/chartex" xmlns:cx6="http://schemas.microsoft.com/office/drawing/2016/5/12/chartex" xmlns:cx5="http://schemas.microsoft.com/office/drawing/2016/5/11/chartex" xmlns:cx4="http://schemas.microsoft.com/office/drawing/2016/5/10/chartex" xmlns:cx3="http://schemas.microsoft.com/office/drawing/2016/5/9/chartex" xmlns:cx2="http://schemas.microsoft.com/office/drawing/2015/10/21/chartex" xmlns:cx1="http://schemas.microsoft.com/office/drawing/2015/9/8/chartex">
+          <mc:Fallback>
             <w:pict>
               <v:shapetype w14:anchorId="381E5DB5" id="_x0000_t202" coordsize="21600,21600" o:spt="202" path="m,l,21600r21600,l21600,xe">
                 <v:stroke joinstyle="miter"/>
@@ -577,7 +575,7 @@
         <mc:AlternateContent>
           <mc:Choice Requires="wps">
             <w:drawing>
-              <wp:anchor distT="0" distB="0" distL="114300" distR="114300" simplePos="0" relativeHeight="251663360" behindDoc="0" locked="0" layoutInCell="1" allowOverlap="1" wp14:anchorId="41731D2E" wp14:editId="78334C0B">
+              <wp:anchor distT="0" distB="0" distL="114300" distR="114300" simplePos="0" relativeHeight="251663360" behindDoc="0" locked="0" layoutInCell="1" allowOverlap="1" wp14:anchorId="7658539D" wp14:editId="358C930A">
                 <wp:simplePos x="0" y="0"/>
                 <wp:positionH relativeFrom="column">
                   <wp:posOffset>796290</wp:posOffset>
@@ -676,7 +674,7 @@
               </wp:anchor>
             </w:drawing>
           </mc:Choice>
-          <mc:Fallback xmlns:w16sdtdh="http://schemas.microsoft.com/office/word/2020/wordml/sdtdatahash" xmlns:w16="http://schemas.microsoft.com/office/word/2018/wordml" xmlns:w16cid="http://schemas.microsoft.com/office/word/2016/wordml/cid" xmlns:w16cex="http://schemas.microsoft.com/office/word/2018/wordml/cex" xmlns:am3d="http://schemas.microsoft.com/office/drawing/2017/model3d" xmlns:aink="http://schemas.microsoft.com/office/drawing/2016/ink" xmlns:cx8="http://schemas.microsoft.com/office/drawing/2016/5/14/chartex" xmlns:cx7="http://schemas.microsoft.com/office/drawing/2016/5/13/chartex" xmlns:cx6="http://schemas.microsoft.com/office/drawing/2016/5/12/chartex" xmlns:cx5="http://schemas.microsoft.com/office/drawing/2016/5/11/chartex" xmlns:cx4="http://schemas.microsoft.com/office/drawing/2016/5/10/chartex" xmlns:cx3="http://schemas.microsoft.com/office/drawing/2016/5/9/chartex" xmlns:cx2="http://schemas.microsoft.com/office/drawing/2015/10/21/chartex" xmlns:cx1="http://schemas.microsoft.com/office/drawing/2015/9/8/chartex">
+          <mc:Fallback>
             <w:pict>
               <v:shape w14:anchorId="41731D2E" id="Надпись 6" o:spid="_x0000_s1027" type="#_x0000_t202" style="position:absolute;left:0;text-align:left;margin-left:62.7pt;margin-top:14.05pt;width:387pt;height:26.25pt;z-index:251663360;visibility:visible;mso-wrap-style:square;mso-width-percent:0;mso-height-percent:0;mso-wrap-distance-left:9pt;mso-wrap-distance-top:0;mso-wrap-distance-right:9pt;mso-wrap-distance-bottom:0;mso-position-horizontal:absolute;mso-position-horizontal-relative:text;mso-position-vertical:absolute;mso-position-vertical-relative:text;mso-width-percent:0;mso-height-percent:0;mso-width-relative:margin;mso-height-relative:margin;v-text-anchor:top" o:gfxdata="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" filled="f" stroked="f" strokeweight=".5pt">
                 <v:textbox>
@@ -827,7 +825,7 @@
         <mc:AlternateContent>
           <mc:Choice Requires="wps">
             <w:drawing>
-              <wp:anchor distT="0" distB="0" distL="114300" distR="114300" simplePos="0" relativeHeight="251659264" behindDoc="0" locked="0" layoutInCell="1" allowOverlap="1" wp14:anchorId="62F93622" wp14:editId="0D9EA52D">
+              <wp:anchor distT="0" distB="0" distL="114300" distR="114300" simplePos="0" relativeHeight="251659264" behindDoc="0" locked="0" layoutInCell="1" allowOverlap="1" wp14:anchorId="6CF1BAC6" wp14:editId="10973D76">
                 <wp:simplePos x="0" y="0"/>
                 <wp:positionH relativeFrom="margin">
                   <wp:align>right</wp:align>
@@ -983,7 +981,7 @@
         <mc:AlternateContent>
           <mc:Choice Requires="wps">
             <w:drawing>
-              <wp:anchor distT="0" distB="0" distL="114300" distR="114300" simplePos="0" relativeHeight="251660288" behindDoc="0" locked="0" layoutInCell="1" allowOverlap="1" wp14:anchorId="1A335544" wp14:editId="584FCAC9">
+              <wp:anchor distT="0" distB="0" distL="114300" distR="114300" simplePos="0" relativeHeight="251660288" behindDoc="0" locked="0" layoutInCell="1" allowOverlap="1" wp14:anchorId="151D9157" wp14:editId="2A5D764C">
                 <wp:simplePos x="0" y="0"/>
                 <wp:positionH relativeFrom="column">
                   <wp:posOffset>3114169</wp:posOffset>
@@ -1043,6 +1041,7 @@
                                 </w14:textOutline>
                               </w:rPr>
                             </w:pPr>
+                            <w:proofErr w:type="spellStart"/>
                             <w:r>
                               <w:rPr>
                                 <w14:textOutline w14:w="9525" w14:cap="rnd" w14:cmpd="sng" w14:algn="ctr">
@@ -1053,7 +1052,68 @@
                                   <w14:bevel/>
                                 </w14:textOutline>
                               </w:rPr>
-                              <w:t>Ильичев Д.А.</w:t>
+                              <w:t>Белослудцев</w:t>
+                            </w:r>
+                            <w:proofErr w:type="spellEnd"/>
+                            <w:r>
+                              <w:rPr>
+                                <w14:textOutline w14:w="9525" w14:cap="rnd" w14:cmpd="sng" w14:algn="ctr">
+                                  <w14:solidFill>
+                                    <w14:srgbClr w14:val="000000"/>
+                                  </w14:solidFill>
+                                  <w14:prstDash w14:val="solid"/>
+                                  <w14:bevel/>
+                                </w14:textOutline>
+                              </w:rPr>
+                              <w:t xml:space="preserve"> </w:t>
+                            </w:r>
+                            <w:r>
+                              <w:rPr>
+                                <w14:textOutline w14:w="9525" w14:cap="rnd" w14:cmpd="sng" w14:algn="ctr">
+                                  <w14:solidFill>
+                                    <w14:srgbClr w14:val="000000"/>
+                                  </w14:solidFill>
+                                  <w14:prstDash w14:val="solid"/>
+                                  <w14:bevel/>
+                                </w14:textOutline>
+                              </w:rPr>
+                              <w:t>А</w:t>
+                            </w:r>
+                            <w:r>
+                              <w:rPr>
+                                <w14:textOutline w14:w="9525" w14:cap="rnd" w14:cmpd="sng" w14:algn="ctr">
+                                  <w14:solidFill>
+                                    <w14:srgbClr w14:val="000000"/>
+                                  </w14:solidFill>
+                                  <w14:prstDash w14:val="solid"/>
+                                  <w14:bevel/>
+                                </w14:textOutline>
+                              </w:rPr>
+                              <w:t>.</w:t>
+                            </w:r>
+                            <w:r>
+                              <w:rPr>
+                                <w14:textOutline w14:w="9525" w14:cap="rnd" w14:cmpd="sng" w14:algn="ctr">
+                                  <w14:solidFill>
+                                    <w14:srgbClr w14:val="000000"/>
+                                  </w14:solidFill>
+                                  <w14:prstDash w14:val="solid"/>
+                                  <w14:bevel/>
+                                </w14:textOutline>
+                              </w:rPr>
+                              <w:t>И</w:t>
+                            </w:r>
+                            <w:r>
+                              <w:rPr>
+                                <w14:textOutline w14:w="9525" w14:cap="rnd" w14:cmpd="sng" w14:algn="ctr">
+                                  <w14:solidFill>
+                                    <w14:srgbClr w14:val="000000"/>
+                                  </w14:solidFill>
+                                  <w14:prstDash w14:val="solid"/>
+                                  <w14:bevel/>
+                                </w14:textOutline>
+                              </w:rPr>
+                              <w:t>.</w:t>
                             </w:r>
                           </w:p>
                           <w:p>
@@ -1092,7 +1152,11 @@
           </mc:Choice>
           <mc:Fallback>
             <w:pict>
-              <v:shape w14:anchorId="1A335544" id="Надпись 8" o:spid="_x0000_s1029" type="#_x0000_t202" style="position:absolute;left:0;text-align:left;margin-left:245.2pt;margin-top:14.05pt;width:207pt;height:22.5pt;z-index:251660288;visibility:visible;mso-wrap-style:square;mso-width-percent:0;mso-height-percent:0;mso-wrap-distance-left:9pt;mso-wrap-distance-top:0;mso-wrap-distance-right:9pt;mso-wrap-distance-bottom:0;mso-position-horizontal:absolute;mso-position-horizontal-relative:text;mso-position-vertical:absolute;mso-position-vertical-relative:text;mso-width-percent:0;mso-height-percent:0;mso-width-relative:margin;mso-height-relative:margin;v-text-anchor:top" o:gfxdata="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" filled="f" stroked="f" strokeweight=".5pt">
+              <v:shapetype w14:anchorId="151D9157" id="_x0000_t202" coordsize="21600,21600" o:spt="202" path="m,l,21600r21600,l21600,xe">
+                <v:stroke joinstyle="miter"/>
+                <v:path gradientshapeok="t" o:connecttype="rect"/>
+              </v:shapetype>
+              <v:shape id="Надпись 8" o:spid="_x0000_s1029" type="#_x0000_t202" style="position:absolute;left:0;text-align:left;margin-left:245.2pt;margin-top:14.05pt;width:207pt;height:22.5pt;z-index:251660288;visibility:visible;mso-wrap-style:square;mso-width-percent:0;mso-height-percent:0;mso-wrap-distance-left:9pt;mso-wrap-distance-top:0;mso-wrap-distance-right:9pt;mso-wrap-distance-bottom:0;mso-position-horizontal:absolute;mso-position-horizontal-relative:text;mso-position-vertical:absolute;mso-position-vertical-relative:text;mso-width-percent:0;mso-height-percent:0;mso-width-relative:margin;mso-height-relative:margin;v-text-anchor:top" o:gfxdata="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" filled="f" stroked="f" strokeweight=".5pt">
                 <v:textbox>
                   <w:txbxContent>
                     <w:p>
@@ -1108,6 +1172,7 @@
                           </w14:textOutline>
                         </w:rPr>
                       </w:pPr>
+                      <w:proofErr w:type="spellStart"/>
                       <w:r>
                         <w:rPr>
                           <w14:textOutline w14:w="9525" w14:cap="rnd" w14:cmpd="sng" w14:algn="ctr">
@@ -1118,7 +1183,68 @@
                             <w14:bevel/>
                           </w14:textOutline>
                         </w:rPr>
-                        <w:t>Ильичев Д.А.</w:t>
+                        <w:t>Белослудцев</w:t>
+                      </w:r>
+                      <w:proofErr w:type="spellEnd"/>
+                      <w:r>
+                        <w:rPr>
+                          <w14:textOutline w14:w="9525" w14:cap="rnd" w14:cmpd="sng" w14:algn="ctr">
+                            <w14:solidFill>
+                              <w14:srgbClr w14:val="000000"/>
+                            </w14:solidFill>
+                            <w14:prstDash w14:val="solid"/>
+                            <w14:bevel/>
+                          </w14:textOutline>
+                        </w:rPr>
+                        <w:t xml:space="preserve"> </w:t>
+                      </w:r>
+                      <w:r>
+                        <w:rPr>
+                          <w14:textOutline w14:w="9525" w14:cap="rnd" w14:cmpd="sng" w14:algn="ctr">
+                            <w14:solidFill>
+                              <w14:srgbClr w14:val="000000"/>
+                            </w14:solidFill>
+                            <w14:prstDash w14:val="solid"/>
+                            <w14:bevel/>
+                          </w14:textOutline>
+                        </w:rPr>
+                        <w:t>А</w:t>
+                      </w:r>
+                      <w:r>
+                        <w:rPr>
+                          <w14:textOutline w14:w="9525" w14:cap="rnd" w14:cmpd="sng" w14:algn="ctr">
+                            <w14:solidFill>
+                              <w14:srgbClr w14:val="000000"/>
+                            </w14:solidFill>
+                            <w14:prstDash w14:val="solid"/>
+                            <w14:bevel/>
+                          </w14:textOutline>
+                        </w:rPr>
+                        <w:t>.</w:t>
+                      </w:r>
+                      <w:r>
+                        <w:rPr>
+                          <w14:textOutline w14:w="9525" w14:cap="rnd" w14:cmpd="sng" w14:algn="ctr">
+                            <w14:solidFill>
+                              <w14:srgbClr w14:val="000000"/>
+                            </w14:solidFill>
+                            <w14:prstDash w14:val="solid"/>
+                            <w14:bevel/>
+                          </w14:textOutline>
+                        </w:rPr>
+                        <w:t>И</w:t>
+                      </w:r>
+                      <w:r>
+                        <w:rPr>
+                          <w14:textOutline w14:w="9525" w14:cap="rnd" w14:cmpd="sng" w14:algn="ctr">
+                            <w14:solidFill>
+                              <w14:srgbClr w14:val="000000"/>
+                            </w14:solidFill>
+                            <w14:prstDash w14:val="solid"/>
+                            <w14:bevel/>
+                          </w14:textOutline>
+                        </w:rPr>
+                        <w:t>.</w:t>
                       </w:r>
                     </w:p>
                     <w:p>
@@ -1295,7 +1421,7 @@
         <mc:AlternateContent>
           <mc:Choice Requires="wps">
             <w:drawing>
-              <wp:anchor distT="0" distB="0" distL="114300" distR="114300" simplePos="0" relativeHeight="251661312" behindDoc="0" locked="0" layoutInCell="1" allowOverlap="1" wp14:anchorId="3AC70D55" wp14:editId="01574D06">
+              <wp:anchor distT="0" distB="0" distL="114300" distR="114300" simplePos="0" relativeHeight="251661312" behindDoc="0" locked="0" layoutInCell="1" allowOverlap="1" wp14:anchorId="5E900438" wp14:editId="55FEC48A">
                 <wp:simplePos x="0" y="0"/>
                 <wp:positionH relativeFrom="column">
                   <wp:posOffset>3187065</wp:posOffset>
@@ -1402,7 +1528,7 @@
               </wp:anchor>
             </w:drawing>
           </mc:Choice>
-          <mc:Fallback xmlns:w16sdtdh="http://schemas.microsoft.com/office/word/2020/wordml/sdtdatahash" xmlns:w16="http://schemas.microsoft.com/office/word/2018/wordml" xmlns:w16cid="http://schemas.microsoft.com/office/word/2016/wordml/cid" xmlns:w16cex="http://schemas.microsoft.com/office/word/2018/wordml/cex" xmlns:am3d="http://schemas.microsoft.com/office/drawing/2017/model3d" xmlns:aink="http://schemas.microsoft.com/office/drawing/2016/ink" xmlns:cx8="http://schemas.microsoft.com/office/drawing/2016/5/14/chartex" xmlns:cx7="http://schemas.microsoft.com/office/drawing/2016/5/13/chartex" xmlns:cx6="http://schemas.microsoft.com/office/drawing/2016/5/12/chartex" xmlns:cx5="http://schemas.microsoft.com/office/drawing/2016/5/11/chartex" xmlns:cx4="http://schemas.microsoft.com/office/drawing/2016/5/10/chartex" xmlns:cx3="http://schemas.microsoft.com/office/drawing/2016/5/9/chartex" xmlns:cx2="http://schemas.microsoft.com/office/drawing/2015/10/21/chartex" xmlns:cx1="http://schemas.microsoft.com/office/drawing/2015/9/8/chartex">
+          <mc:Fallback>
             <w:pict>
               <v:shape w14:anchorId="3AC70D55" id="Надпись 10" o:spid="_x0000_s1030" type="#_x0000_t202" style="position:absolute;left:0;text-align:left;margin-left:250.95pt;margin-top:1.35pt;width:211.5pt;height:21pt;z-index:251661312;visibility:visible;mso-wrap-style:square;mso-width-percent:0;mso-height-percent:0;mso-wrap-distance-left:9pt;mso-wrap-distance-top:0;mso-wrap-distance-right:9pt;mso-wrap-distance-bottom:0;mso-position-horizontal:absolute;mso-position-horizontal-relative:text;mso-position-vertical:absolute;mso-position-vertical-relative:text;mso-width-percent:0;mso-height-percent:0;mso-width-relative:margin;mso-height-relative:margin;v-text-anchor:top" o:gfxdata="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" filled="f" stroked="f" strokeweight=".5pt">
                 <v:textbox>
@@ -1753,7 +1879,7 @@
               <w:jc w:val="center"/>
             </w:pPr>
             <w:r>
-              <w:object w:dxaOrig="316" w:dyaOrig="391" w14:anchorId="1FE61E07">
+              <w:object w:dxaOrig="316" w:dyaOrig="391" w14:anchorId="29C6C710">
                 <v:shapetype id="_x0000_t75" coordsize="21600,21600" o:spt="75" o:preferrelative="t" path="m@4@5l@4@11@9@11@9@5xe" filled="f" stroked="f">
                   <v:stroke joinstyle="miter"/>
                   <v:formulas>
@@ -1776,7 +1902,7 @@
                 <v:shape id="_x0000_i1025" type="#_x0000_t75" style="width:43.2pt;height:28.8pt" o:ole="">
                   <v:imagedata r:id="rId6" o:title=""/>
                 </v:shape>
-                <o:OLEObject Type="Embed" ProgID="Visio.Drawing.15" ShapeID="_x0000_i1025" DrawAspect="Content" ObjectID="_1726560603" r:id="rId7"/>
+                <o:OLEObject Type="Embed" ProgID="Visio.Drawing.15" ShapeID="_x0000_i1025" DrawAspect="Content" ObjectID="_1850545030" r:id="rId7"/>
               </w:object>
             </w:r>
           </w:p>
@@ -1822,11 +1948,11 @@
               <w:jc w:val="center"/>
             </w:pPr>
             <w:r>
-              <w:object w:dxaOrig="316" w:dyaOrig="391" w14:anchorId="5A1AC81C">
+              <w:object w:dxaOrig="316" w:dyaOrig="391" w14:anchorId="49CF7DFD">
                 <v:shape id="_x0000_i1026" type="#_x0000_t75" style="width:50.4pt;height:35.4pt" o:ole="">
                   <v:imagedata r:id="rId8" o:title=""/>
                 </v:shape>
-                <o:OLEObject Type="Embed" ProgID="Visio.Drawing.15" ShapeID="_x0000_i1026" DrawAspect="Content" ObjectID="_1726560604" r:id="rId9"/>
+                <o:OLEObject Type="Embed" ProgID="Visio.Drawing.15" ShapeID="_x0000_i1026" DrawAspect="Content" ObjectID="_1850545031" r:id="rId9"/>
               </w:object>
             </w:r>
           </w:p>
@@ -1872,11 +1998,11 @@
               <w:jc w:val="center"/>
             </w:pPr>
             <w:r>
-              <w:object w:dxaOrig="361" w:dyaOrig="406" w14:anchorId="507BC4A5">
+              <w:object w:dxaOrig="361" w:dyaOrig="406" w14:anchorId="38213032">
                 <v:shape id="_x0000_i1027" type="#_x0000_t75" style="width:50.4pt;height:36pt" o:ole="">
                   <v:imagedata r:id="rId10" o:title=""/>
                 </v:shape>
-                <o:OLEObject Type="Embed" ProgID="Visio.Drawing.15" ShapeID="_x0000_i1027" DrawAspect="Content" ObjectID="_1726560605" r:id="rId11"/>
+                <o:OLEObject Type="Embed" ProgID="Visio.Drawing.15" ShapeID="_x0000_i1027" DrawAspect="Content" ObjectID="_1850545032" r:id="rId11"/>
               </w:object>
             </w:r>
           </w:p>
@@ -1930,7 +2056,7 @@
                 <w:lang w:eastAsia="ru-RU"/>
               </w:rPr>
               <w:drawing>
-                <wp:inline distT="0" distB="0" distL="0" distR="0" wp14:anchorId="00D328A7" wp14:editId="3FCB2E96">
+                <wp:inline distT="0" distB="0" distL="0" distR="0" wp14:anchorId="6C42CD78" wp14:editId="59D17698">
                   <wp:extent cx="638175" cy="400050"/>
                   <wp:effectExtent l="0" t="0" r="9525" b="0"/>
                   <wp:docPr id="4" name="Рисунок 4"/>
@@ -2011,11 +2137,11 @@
               <w:jc w:val="center"/>
             </w:pPr>
             <w:r>
-              <w:object w:dxaOrig="601" w:dyaOrig="435" w14:anchorId="3733CC0D">
+              <w:object w:dxaOrig="601" w:dyaOrig="435" w14:anchorId="53BF84C0">
                 <v:shape id="_x0000_i1028" type="#_x0000_t75" style="width:43.2pt;height:35.4pt" o:ole="">
                   <v:imagedata r:id="rId13" o:title=""/>
                 </v:shape>
-                <o:OLEObject Type="Embed" ProgID="Visio.Drawing.15" ShapeID="_x0000_i1028" DrawAspect="Content" ObjectID="_1726560606" r:id="rId14"/>
+                <o:OLEObject Type="Embed" ProgID="Visio.Drawing.15" ShapeID="_x0000_i1028" DrawAspect="Content" ObjectID="_1850545033" r:id="rId14"/>
               </w:object>
             </w:r>
           </w:p>
@@ -2061,11 +2187,11 @@
               <w:jc w:val="center"/>
             </w:pPr>
             <w:r>
-              <w:object w:dxaOrig="601" w:dyaOrig="435" w14:anchorId="5927EDF5">
+              <w:object w:dxaOrig="601" w:dyaOrig="435" w14:anchorId="7554AA4A">
                 <v:shape id="_x0000_i1029" type="#_x0000_t75" style="width:49.8pt;height:28.8pt" o:ole="">
                   <v:imagedata r:id="rId15" o:title=""/>
                 </v:shape>
-                <o:OLEObject Type="Embed" ProgID="Visio.Drawing.15" ShapeID="_x0000_i1029" DrawAspect="Content" ObjectID="_1726560607" r:id="rId16"/>
+                <o:OLEObject Type="Embed" ProgID="Visio.Drawing.15" ShapeID="_x0000_i1029" DrawAspect="Content" ObjectID="_1850545034" r:id="rId16"/>
               </w:object>
             </w:r>
           </w:p>
@@ -2114,11 +2240,11 @@
               <w:jc w:val="center"/>
             </w:pPr>
             <w:r>
-              <w:object w:dxaOrig="601" w:dyaOrig="465" w14:anchorId="6BE0A4AC">
+              <w:object w:dxaOrig="601" w:dyaOrig="465" w14:anchorId="4C15D257">
                 <v:shape id="_x0000_i1030" type="#_x0000_t75" style="width:28.8pt;height:22.2pt" o:ole="">
                   <v:imagedata r:id="rId17" o:title=""/>
                 </v:shape>
-                <o:OLEObject Type="Embed" ProgID="Visio.Drawing.15" ShapeID="_x0000_i1030" DrawAspect="Content" ObjectID="_1726560608" r:id="rId18"/>
+                <o:OLEObject Type="Embed" ProgID="Visio.Drawing.15" ShapeID="_x0000_i1030" DrawAspect="Content" ObjectID="_1850545035" r:id="rId18"/>
               </w:object>
             </w:r>
           </w:p>
@@ -2164,11 +2290,11 @@
               <w:jc w:val="center"/>
             </w:pPr>
             <w:r>
-              <w:object w:dxaOrig="601" w:dyaOrig="465" w14:anchorId="241A3E11">
+              <w:object w:dxaOrig="601" w:dyaOrig="465" w14:anchorId="7C333E60">
                 <v:shape id="_x0000_i1031" type="#_x0000_t75" style="width:28.8pt;height:22.2pt" o:ole="">
                   <v:imagedata r:id="rId19" o:title=""/>
                 </v:shape>
-                <o:OLEObject Type="Embed" ProgID="Visio.Drawing.15" ShapeID="_x0000_i1031" DrawAspect="Content" ObjectID="_1726560609" r:id="rId20"/>
+                <o:OLEObject Type="Embed" ProgID="Visio.Drawing.15" ShapeID="_x0000_i1031" DrawAspect="Content" ObjectID="_1850545036" r:id="rId20"/>
               </w:object>
             </w:r>
           </w:p>
@@ -2217,11 +2343,11 @@
               <w:jc w:val="center"/>
             </w:pPr>
             <w:r>
-              <w:object w:dxaOrig="196" w:dyaOrig="556" w14:anchorId="1DCBD517">
+              <w:object w:dxaOrig="196" w:dyaOrig="556" w14:anchorId="54ECE2DB">
                 <v:shape id="_x0000_i1032" type="#_x0000_t75" style="width:8.4pt;height:28.8pt" o:ole="">
                   <v:imagedata r:id="rId21" o:title=""/>
                 </v:shape>
-                <o:OLEObject Type="Embed" ProgID="Visio.Drawing.15" ShapeID="_x0000_i1032" DrawAspect="Content" ObjectID="_1726560610" r:id="rId22"/>
+                <o:OLEObject Type="Embed" ProgID="Visio.Drawing.15" ShapeID="_x0000_i1032" DrawAspect="Content" ObjectID="_1850545037" r:id="rId22"/>
               </w:object>
             </w:r>
           </w:p>
@@ -2267,11 +2393,11 @@
               <w:jc w:val="center"/>
             </w:pPr>
             <w:r>
-              <w:object w:dxaOrig="196" w:dyaOrig="556" w14:anchorId="2FBA8EB3">
+              <w:object w:dxaOrig="196" w:dyaOrig="556" w14:anchorId="1EC7E0AD">
                 <v:shape id="_x0000_i1033" type="#_x0000_t75" style="width:8.4pt;height:28.8pt" o:ole="">
                   <v:imagedata r:id="rId23" o:title=""/>
                 </v:shape>
-                <o:OLEObject Type="Embed" ProgID="Visio.Drawing.15" ShapeID="_x0000_i1033" DrawAspect="Content" ObjectID="_1726560611" r:id="rId24"/>
+                <o:OLEObject Type="Embed" ProgID="Visio.Drawing.15" ShapeID="_x0000_i1033" DrawAspect="Content" ObjectID="_1850545038" r:id="rId24"/>
               </w:object>
             </w:r>
           </w:p>
@@ -2317,11 +2443,11 @@
               <w:jc w:val="center"/>
             </w:pPr>
             <w:r>
-              <w:object w:dxaOrig="196" w:dyaOrig="556" w14:anchorId="23013D79">
+              <w:object w:dxaOrig="196" w:dyaOrig="556" w14:anchorId="7502FCA6">
                 <v:shape id="_x0000_i1034" type="#_x0000_t75" style="width:8.4pt;height:28.8pt" o:ole="">
                   <v:imagedata r:id="rId25" o:title=""/>
                 </v:shape>
-                <o:OLEObject Type="Embed" ProgID="Visio.Drawing.15" ShapeID="_x0000_i1034" DrawAspect="Content" ObjectID="_1726560612" r:id="rId26"/>
+                <o:OLEObject Type="Embed" ProgID="Visio.Drawing.15" ShapeID="_x0000_i1034" DrawAspect="Content" ObjectID="_1850545039" r:id="rId26"/>
               </w:object>
             </w:r>
           </w:p>
@@ -2367,11 +2493,11 @@
               <w:jc w:val="center"/>
             </w:pPr>
             <w:r>
-              <w:object w:dxaOrig="196" w:dyaOrig="556" w14:anchorId="01A019A3">
+              <w:object w:dxaOrig="196" w:dyaOrig="556" w14:anchorId="0EA3682A">
                 <v:shape id="_x0000_i1035" type="#_x0000_t75" style="width:8.4pt;height:28.8pt" o:ole="">
                   <v:imagedata r:id="rId27" o:title=""/>
                 </v:shape>
-                <o:OLEObject Type="Embed" ProgID="Visio.Drawing.15" ShapeID="_x0000_i1035" DrawAspect="Content" ObjectID="_1726560613" r:id="rId28"/>
+                <o:OLEObject Type="Embed" ProgID="Visio.Drawing.15" ShapeID="_x0000_i1035" DrawAspect="Content" ObjectID="_1850545040" r:id="rId28"/>
               </w:object>
             </w:r>
           </w:p>
@@ -2417,11 +2543,11 @@
               <w:jc w:val="center"/>
             </w:pPr>
             <w:r>
-              <w:object w:dxaOrig="196" w:dyaOrig="376" w14:anchorId="76042B0C">
+              <w:object w:dxaOrig="196" w:dyaOrig="376" w14:anchorId="2DDFD07A">
                 <v:shape id="_x0000_i1036" type="#_x0000_t75" style="width:18pt;height:22.2pt" o:ole="">
                   <v:imagedata r:id="rId29" o:title=""/>
                 </v:shape>
-                <o:OLEObject Type="Embed" ProgID="Visio.Drawing.15" ShapeID="_x0000_i1036" DrawAspect="Content" ObjectID="_1726560614" r:id="rId30"/>
+                <o:OLEObject Type="Embed" ProgID="Visio.Drawing.15" ShapeID="_x0000_i1036" DrawAspect="Content" ObjectID="_1850545041" r:id="rId30"/>
               </w:object>
             </w:r>
           </w:p>
@@ -2472,7 +2598,7 @@
                 <w:lang w:eastAsia="ru-RU"/>
               </w:rPr>
               <w:drawing>
-                <wp:inline distT="0" distB="0" distL="0" distR="0" wp14:anchorId="70C718DE" wp14:editId="2111E2EE">
+                <wp:inline distT="0" distB="0" distL="0" distR="0" wp14:anchorId="7E4D9B27" wp14:editId="02462846">
                   <wp:extent cx="581025" cy="676275"/>
                   <wp:effectExtent l="0" t="0" r="9525" b="9525"/>
                   <wp:docPr id="29" name="Рисунок 29"/>
@@ -2552,11 +2678,11 @@
               <w:jc w:val="center"/>
             </w:pPr>
             <w:r>
-              <w:object w:dxaOrig="316" w:dyaOrig="496" w14:anchorId="18F46B57">
+              <w:object w:dxaOrig="316" w:dyaOrig="496" w14:anchorId="5883B7B5">
                 <v:shape id="_x0000_i1037" type="#_x0000_t75" style="width:43.2pt;height:36.6pt" o:ole="">
                   <v:imagedata r:id="rId32" o:title=""/>
                 </v:shape>
-                <o:OLEObject Type="Embed" ProgID="Visio.Drawing.15" ShapeID="_x0000_i1037" DrawAspect="Content" ObjectID="_1726560615" r:id="rId33"/>
+                <o:OLEObject Type="Embed" ProgID="Visio.Drawing.15" ShapeID="_x0000_i1037" DrawAspect="Content" ObjectID="_1850545042" r:id="rId33"/>
               </w:object>
             </w:r>
           </w:p>
@@ -2609,7 +2735,7 @@
                 <w:lang w:eastAsia="ru-RU"/>
               </w:rPr>
               <w:drawing>
-                <wp:inline distT="0" distB="0" distL="0" distR="0" wp14:anchorId="463B75B0" wp14:editId="721EC7BD">
+                <wp:inline distT="0" distB="0" distL="0" distR="0" wp14:anchorId="502B7006" wp14:editId="2D757BC9">
                   <wp:extent cx="314325" cy="333375"/>
                   <wp:effectExtent l="0" t="0" r="9525" b="9525"/>
                   <wp:docPr id="30" name="Рисунок 30"/>
@@ -2715,7 +2841,7 @@
                 <w:lang w:eastAsia="ru-RU"/>
               </w:rPr>
               <w:drawing>
-                <wp:inline distT="0" distB="0" distL="0" distR="0" wp14:anchorId="21E17F98" wp14:editId="62E8AD47">
+                <wp:inline distT="0" distB="0" distL="0" distR="0" wp14:anchorId="0F1A8D30" wp14:editId="08A722A3">
                   <wp:extent cx="838200" cy="333375"/>
                   <wp:effectExtent l="0" t="0" r="0" b="9525"/>
                   <wp:docPr id="7" name="Рисунок 7"/>
@@ -2795,11 +2921,11 @@
               <w:jc w:val="center"/>
             </w:pPr>
             <w:r>
-              <w:object w:dxaOrig="601" w:dyaOrig="586" w14:anchorId="73C6B0E9">
+              <w:object w:dxaOrig="601" w:dyaOrig="586" w14:anchorId="0EE88389">
                 <v:shape id="_x0000_i1038" type="#_x0000_t75" style="width:28.8pt;height:28.8pt" o:ole="">
                   <v:imagedata r:id="rId36" o:title=""/>
                 </v:shape>
-                <o:OLEObject Type="Embed" ProgID="Visio.Drawing.15" ShapeID="_x0000_i1038" DrawAspect="Content" ObjectID="_1726560616" r:id="rId37"/>
+                <o:OLEObject Type="Embed" ProgID="Visio.Drawing.15" ShapeID="_x0000_i1038" DrawAspect="Content" ObjectID="_1850545043" r:id="rId37"/>
               </w:object>
             </w:r>
           </w:p>
@@ -2852,7 +2978,7 @@
                 <w:lang w:eastAsia="ru-RU"/>
               </w:rPr>
               <w:drawing>
-                <wp:inline distT="0" distB="0" distL="0" distR="0" wp14:anchorId="134C6C70" wp14:editId="75E8D0E3">
+                <wp:inline distT="0" distB="0" distL="0" distR="0" wp14:anchorId="090ADAB7" wp14:editId="00755DF3">
                   <wp:extent cx="619125" cy="290454"/>
                   <wp:effectExtent l="0" t="0" r="0" b="0"/>
                   <wp:docPr id="1" name="Рисунок 1"/>
@@ -2944,7 +3070,7 @@
                 <w:lang w:eastAsia="ru-RU"/>
               </w:rPr>
               <w:drawing>
-                <wp:inline distT="0" distB="0" distL="0" distR="0" wp14:anchorId="7FA28A40" wp14:editId="199EA7C6">
+                <wp:inline distT="0" distB="0" distL="0" distR="0" wp14:anchorId="31A1E0FC" wp14:editId="2A40F5BF">
                   <wp:extent cx="866775" cy="647700"/>
                   <wp:effectExtent l="0" t="0" r="9525" b="0"/>
                   <wp:docPr id="9" name="Рисунок 9"/>
@@ -3035,7 +3161,7 @@
                 <w:lang w:eastAsia="ru-RU"/>
               </w:rPr>
               <w:drawing>
-                <wp:inline distT="0" distB="0" distL="0" distR="0" wp14:anchorId="76970768" wp14:editId="1B040EA1">
+                <wp:inline distT="0" distB="0" distL="0" distR="0" wp14:anchorId="19206955" wp14:editId="0B75A1E9">
                   <wp:extent cx="933450" cy="771525"/>
                   <wp:effectExtent l="0" t="0" r="0" b="9525"/>
                   <wp:docPr id="11" name="Рисунок 11"/>
@@ -3118,11 +3244,11 @@
               <w:jc w:val="center"/>
             </w:pPr>
             <w:r>
-              <w:object w:dxaOrig="240" w:dyaOrig="600" w14:anchorId="287DBF5A">
+              <w:object w:dxaOrig="240" w:dyaOrig="600" w14:anchorId="3AD11012">
                 <v:shape id="_x0000_i1039" type="#_x0000_t75" style="width:14.4pt;height:28.8pt" o:ole="">
                   <v:imagedata r:id="rId41" o:title=""/>
                 </v:shape>
-                <o:OLEObject Type="Embed" ProgID="Visio.Drawing.15" ShapeID="_x0000_i1039" DrawAspect="Content" ObjectID="_1726560617" r:id="rId42"/>
+                <o:OLEObject Type="Embed" ProgID="Visio.Drawing.15" ShapeID="_x0000_i1039" DrawAspect="Content" ObjectID="_1850545044" r:id="rId42"/>
               </w:object>
             </w:r>
           </w:p>
@@ -3171,11 +3297,11 @@
               <w:jc w:val="center"/>
             </w:pPr>
             <w:r>
-              <w:object w:dxaOrig="316" w:dyaOrig="496" w14:anchorId="7B2297F7">
+              <w:object w:dxaOrig="316" w:dyaOrig="496" w14:anchorId="01624903">
                 <v:shape id="_x0000_i1040" type="#_x0000_t75" style="width:35.4pt;height:43.2pt" o:ole="">
                   <v:imagedata r:id="rId43" o:title=""/>
                 </v:shape>
-                <o:OLEObject Type="Embed" ProgID="Visio.Drawing.15" ShapeID="_x0000_i1040" DrawAspect="Content" ObjectID="_1726560618" r:id="rId44"/>
+                <o:OLEObject Type="Embed" ProgID="Visio.Drawing.15" ShapeID="_x0000_i1040" DrawAspect="Content" ObjectID="_1850545045" r:id="rId44"/>
               </w:object>
             </w:r>
           </w:p>
@@ -3221,11 +3347,11 @@
               <w:jc w:val="center"/>
             </w:pPr>
             <w:r>
-              <w:object w:dxaOrig="316" w:dyaOrig="496" w14:anchorId="792CC860">
+              <w:object w:dxaOrig="316" w:dyaOrig="496" w14:anchorId="3297B861">
                 <v:shape id="_x0000_i1041" type="#_x0000_t75" style="width:35.4pt;height:49.8pt" o:ole="">
                   <v:imagedata r:id="rId45" o:title=""/>
                 </v:shape>
-                <o:OLEObject Type="Embed" ProgID="Visio.Drawing.15" ShapeID="_x0000_i1041" DrawAspect="Content" ObjectID="_1726560619" r:id="rId46"/>
+                <o:OLEObject Type="Embed" ProgID="Visio.Drawing.15" ShapeID="_x0000_i1041" DrawAspect="Content" ObjectID="_1850545046" r:id="rId46"/>
               </w:object>
             </w:r>
           </w:p>
@@ -3276,7 +3402,7 @@
                 <w:lang w:eastAsia="ru-RU"/>
               </w:rPr>
               <w:drawing>
-                <wp:inline distT="0" distB="0" distL="0" distR="0" wp14:anchorId="05B1F50F" wp14:editId="1712E744">
+                <wp:inline distT="0" distB="0" distL="0" distR="0" wp14:anchorId="0189353D" wp14:editId="07CC1588">
                   <wp:extent cx="533400" cy="400050"/>
                   <wp:effectExtent l="0" t="9525" r="9525" b="9525"/>
                   <wp:docPr id="31" name="Рисунок 31"/>
@@ -3363,11 +3489,11 @@
               <w:jc w:val="center"/>
             </w:pPr>
             <w:r>
-              <w:object w:dxaOrig="346" w:dyaOrig="316" w14:anchorId="46100F93">
+              <w:object w:dxaOrig="346" w:dyaOrig="316" w14:anchorId="3B62AC41">
                 <v:shape id="_x0000_i1042" type="#_x0000_t75" style="width:14.4pt;height:14.4pt" o:ole="">
                   <v:imagedata r:id="rId48" o:title=""/>
                 </v:shape>
-                <o:OLEObject Type="Embed" ProgID="Visio.Drawing.15" ShapeID="_x0000_i1042" DrawAspect="Content" ObjectID="_1726560620" r:id="rId49"/>
+                <o:OLEObject Type="Embed" ProgID="Visio.Drawing.15" ShapeID="_x0000_i1042" DrawAspect="Content" ObjectID="_1850545047" r:id="rId49"/>
               </w:object>
             </w:r>
           </w:p>
@@ -3413,11 +3539,11 @@
               <w:jc w:val="center"/>
             </w:pPr>
             <w:r>
-              <w:object w:dxaOrig="346" w:dyaOrig="316" w14:anchorId="71324840">
+              <w:object w:dxaOrig="346" w:dyaOrig="316" w14:anchorId="53771CE4">
                 <v:shape id="_x0000_i1043" type="#_x0000_t75" style="width:14.4pt;height:14.4pt" o:ole="">
                   <v:imagedata r:id="rId50" o:title=""/>
                 </v:shape>
-                <o:OLEObject Type="Embed" ProgID="Visio.Drawing.15" ShapeID="_x0000_i1043" DrawAspect="Content" ObjectID="_1726560621" r:id="rId51"/>
+                <o:OLEObject Type="Embed" ProgID="Visio.Drawing.15" ShapeID="_x0000_i1043" DrawAspect="Content" ObjectID="_1850545048" r:id="rId51"/>
               </w:object>
             </w:r>
           </w:p>
@@ -3466,11 +3592,11 @@
               <w:jc w:val="center"/>
             </w:pPr>
             <w:r>
-              <w:object w:dxaOrig="286" w:dyaOrig="496" w14:anchorId="310AB4E3">
+              <w:object w:dxaOrig="286" w:dyaOrig="496" w14:anchorId="1B9C4A85">
                 <v:shape id="_x0000_i1044" type="#_x0000_t75" style="width:14.4pt;height:21.6pt" o:ole="">
                   <v:imagedata r:id="rId52" o:title=""/>
                 </v:shape>
-                <o:OLEObject Type="Embed" ProgID="Visio.Drawing.15" ShapeID="_x0000_i1044" DrawAspect="Content" ObjectID="_1726560622" r:id="rId53"/>
+                <o:OLEObject Type="Embed" ProgID="Visio.Drawing.15" ShapeID="_x0000_i1044" DrawAspect="Content" ObjectID="_1850545049" r:id="rId53"/>
               </w:object>
             </w:r>
           </w:p>
@@ -3516,11 +3642,11 @@
               <w:jc w:val="center"/>
             </w:pPr>
             <w:r>
-              <w:object w:dxaOrig="286" w:dyaOrig="496" w14:anchorId="02CA4934">
+              <w:object w:dxaOrig="286" w:dyaOrig="496" w14:anchorId="55E3952D">
                 <v:shape id="_x0000_i1045" type="#_x0000_t75" style="width:14.4pt;height:21.6pt" o:ole="">
                   <v:imagedata r:id="rId54" o:title=""/>
                 </v:shape>
-                <o:OLEObject Type="Embed" ProgID="Visio.Drawing.15" ShapeID="_x0000_i1045" DrawAspect="Content" ObjectID="_1726560623" r:id="rId55"/>
+                <o:OLEObject Type="Embed" ProgID="Visio.Drawing.15" ShapeID="_x0000_i1045" DrawAspect="Content" ObjectID="_1850545050" r:id="rId55"/>
               </w:object>
             </w:r>
           </w:p>
@@ -3569,11 +3695,11 @@
               <w:jc w:val="center"/>
             </w:pPr>
             <w:r>
-              <w:object w:dxaOrig="466" w:dyaOrig="435" w14:anchorId="2566F01D">
+              <w:object w:dxaOrig="466" w:dyaOrig="435" w14:anchorId="16DEB66B">
                 <v:shape id="_x0000_i1046" type="#_x0000_t75" style="width:22.2pt;height:22.2pt" o:ole="">
                   <v:imagedata r:id="rId56" o:title=""/>
                 </v:shape>
-                <o:OLEObject Type="Embed" ProgID="Visio.Drawing.15" ShapeID="_x0000_i1046" DrawAspect="Content" ObjectID="_1726560624" r:id="rId57"/>
+                <o:OLEObject Type="Embed" ProgID="Visio.Drawing.15" ShapeID="_x0000_i1046" DrawAspect="Content" ObjectID="_1850545051" r:id="rId57"/>
               </w:object>
             </w:r>
           </w:p>
@@ -3619,11 +3745,11 @@
               <w:jc w:val="center"/>
             </w:pPr>
             <w:r>
-              <w:object w:dxaOrig="466" w:dyaOrig="435" w14:anchorId="7916400E">
+              <w:object w:dxaOrig="466" w:dyaOrig="435" w14:anchorId="7908DCE4">
                 <v:shape id="_x0000_i1047" type="#_x0000_t75" style="width:22.2pt;height:22.2pt" o:ole="">
                   <v:imagedata r:id="rId58" o:title=""/>
                 </v:shape>
-                <o:OLEObject Type="Embed" ProgID="Visio.Drawing.15" ShapeID="_x0000_i1047" DrawAspect="Content" ObjectID="_1726560625" r:id="rId59"/>
+                <o:OLEObject Type="Embed" ProgID="Visio.Drawing.15" ShapeID="_x0000_i1047" DrawAspect="Content" ObjectID="_1850545052" r:id="rId59"/>
               </w:object>
             </w:r>
           </w:p>
@@ -3679,7 +3805,7 @@
                 <w:lang w:eastAsia="ru-RU"/>
               </w:rPr>
               <w:drawing>
-                <wp:inline distT="0" distB="0" distL="0" distR="0" wp14:anchorId="4B3ED2A0" wp14:editId="4423236F">
+                <wp:inline distT="0" distB="0" distL="0" distR="0" wp14:anchorId="640F159B" wp14:editId="31BCC209">
                   <wp:extent cx="619125" cy="542925"/>
                   <wp:effectExtent l="0" t="0" r="9525" b="9525"/>
                   <wp:docPr id="32" name="Рисунок 32"/>
@@ -3770,7 +3896,7 @@
                 <w:lang w:eastAsia="ru-RU"/>
               </w:rPr>
               <w:drawing>
-                <wp:inline distT="0" distB="0" distL="0" distR="0" wp14:anchorId="131334F7" wp14:editId="62E3A0D3">
+                <wp:inline distT="0" distB="0" distL="0" distR="0" wp14:anchorId="316CAE3C" wp14:editId="3164FAE8">
                   <wp:extent cx="581025" cy="561975"/>
                   <wp:effectExtent l="0" t="0" r="9525" b="9525"/>
                   <wp:docPr id="19" name="Рисунок 19"/>
@@ -3858,7 +3984,7 @@
                 <w:lang w:eastAsia="ru-RU"/>
               </w:rPr>
               <w:drawing>
-                <wp:inline distT="0" distB="0" distL="0" distR="0" wp14:anchorId="519DA83A" wp14:editId="284B904A">
+                <wp:inline distT="0" distB="0" distL="0" distR="0" wp14:anchorId="09FA5839" wp14:editId="64173030">
                   <wp:extent cx="1028700" cy="419100"/>
                   <wp:effectExtent l="0" t="0" r="0" b="0"/>
                   <wp:docPr id="20" name="Рисунок 20"/>
@@ -3946,7 +4072,7 @@
                 <w:lang w:eastAsia="ru-RU"/>
               </w:rPr>
               <w:drawing>
-                <wp:inline distT="0" distB="0" distL="0" distR="0" wp14:anchorId="75EB2AD7" wp14:editId="59D770A4">
+                <wp:inline distT="0" distB="0" distL="0" distR="0" wp14:anchorId="68A08517" wp14:editId="711EB385">
                   <wp:extent cx="589609" cy="738835"/>
                   <wp:effectExtent l="0" t="0" r="1270" b="4445"/>
                   <wp:docPr id="21" name="Рисунок 21"/>
@@ -4034,7 +4160,7 @@
                 <w:lang w:eastAsia="ru-RU"/>
               </w:rPr>
               <w:drawing>
-                <wp:inline distT="0" distB="0" distL="0" distR="0" wp14:anchorId="39092B34" wp14:editId="2FCB4BC0">
+                <wp:inline distT="0" distB="0" distL="0" distR="0" wp14:anchorId="41D9F24C" wp14:editId="6131268C">
                   <wp:extent cx="1219200" cy="866775"/>
                   <wp:effectExtent l="0" t="0" r="0" b="9525"/>
                   <wp:docPr id="33" name="Рисунок 33"/>
@@ -4129,7 +4255,7 @@
                 <w:lang w:eastAsia="ru-RU"/>
               </w:rPr>
               <w:drawing>
-                <wp:inline distT="0" distB="0" distL="0" distR="0" wp14:anchorId="2525C0C5" wp14:editId="34610C00">
+                <wp:inline distT="0" distB="0" distL="0" distR="0" wp14:anchorId="35A0BA01" wp14:editId="720C767A">
                   <wp:extent cx="2143125" cy="828675"/>
                   <wp:effectExtent l="0" t="0" r="9525" b="9525"/>
                   <wp:docPr id="28" name="Рисунок 28"/>
@@ -4217,7 +4343,7 @@
                 <w:lang w:eastAsia="ru-RU"/>
               </w:rPr>
               <w:drawing>
-                <wp:inline distT="0" distB="0" distL="0" distR="0" wp14:anchorId="0A162BF4" wp14:editId="0FA0DBDA">
+                <wp:inline distT="0" distB="0" distL="0" distR="0" wp14:anchorId="632A1669" wp14:editId="60AAB028">
                   <wp:extent cx="781050" cy="695325"/>
                   <wp:effectExtent l="0" t="0" r="0" b="9525"/>
                   <wp:docPr id="24" name="Рисунок 24"/>
@@ -4311,7 +4437,7 @@
                 <w:lang w:eastAsia="ru-RU"/>
               </w:rPr>
               <w:drawing>
-                <wp:inline distT="0" distB="0" distL="0" distR="0" wp14:anchorId="291EF41E" wp14:editId="2387E609">
+                <wp:inline distT="0" distB="0" distL="0" distR="0" wp14:anchorId="0F34CB98" wp14:editId="7773509F">
                   <wp:extent cx="438150" cy="352425"/>
                   <wp:effectExtent l="0" t="0" r="0" b="9525"/>
                   <wp:docPr id="35" name="Рисунок 35"/>
@@ -4405,7 +4531,7 @@
                 <w:lang w:eastAsia="ru-RU"/>
               </w:rPr>
               <w:drawing>
-                <wp:inline distT="0" distB="0" distL="0" distR="0" wp14:anchorId="2F90B785" wp14:editId="5DDD3165">
+                <wp:inline distT="0" distB="0" distL="0" distR="0" wp14:anchorId="1DE8CBC4" wp14:editId="06DDD62E">
                   <wp:extent cx="438150" cy="276225"/>
                   <wp:effectExtent l="0" t="0" r="0" b="9525"/>
                   <wp:docPr id="26" name="Рисунок 26"/>
@@ -4499,7 +4625,7 @@
                 <w:lang w:eastAsia="ru-RU"/>
               </w:rPr>
               <w:drawing>
-                <wp:inline distT="0" distB="0" distL="0" distR="0" wp14:anchorId="09BCE5DB" wp14:editId="2ECAC732">
+                <wp:inline distT="0" distB="0" distL="0" distR="0" wp14:anchorId="076E4A21" wp14:editId="2D1E75EF">
                   <wp:extent cx="495300" cy="390525"/>
                   <wp:effectExtent l="0" t="0" r="0" b="9525"/>
                   <wp:docPr id="27" name="Рисунок 27"/>
@@ -4593,7 +4719,7 @@
                 <w:lang w:eastAsia="ru-RU"/>
               </w:rPr>
               <w:drawing>
-                <wp:inline distT="0" distB="0" distL="0" distR="0" wp14:anchorId="34488B54" wp14:editId="5E15D7E7">
+                <wp:inline distT="0" distB="0" distL="0" distR="0" wp14:anchorId="049F102B" wp14:editId="653BF9E4">
                   <wp:extent cx="866775" cy="828675"/>
                   <wp:effectExtent l="0" t="0" r="9525" b="9525"/>
                   <wp:docPr id="38" name="Рисунок 38"/>
@@ -4684,7 +4810,7 @@
                 <w:lang w:eastAsia="ru-RU"/>
               </w:rPr>
               <w:drawing>
-                <wp:inline distT="0" distB="0" distL="0" distR="0" wp14:anchorId="07089037" wp14:editId="6E91328B">
+                <wp:inline distT="0" distB="0" distL="0" distR="0" wp14:anchorId="48EE897A" wp14:editId="021CEB82">
                   <wp:extent cx="542925" cy="552450"/>
                   <wp:effectExtent l="0" t="0" r="9525" b="0"/>
                   <wp:docPr id="14" name="Рисунок 14"/>
@@ -5337,7 +5463,7 @@
           <w:noProof/>
         </w:rPr>
         <w:drawing>
-          <wp:inline distT="0" distB="0" distL="0" distR="0" wp14:anchorId="534CF0E9" wp14:editId="49C30292">
+          <wp:inline distT="0" distB="0" distL="0" distR="0" wp14:anchorId="2A839A11" wp14:editId="15BA4EBB">
             <wp:extent cx="114300" cy="142875"/>
             <wp:effectExtent l="0" t="0" r="0" b="9525"/>
             <wp:docPr id="34" name="Рисунок 34" descr="\vec v\!"/>
@@ -6679,7 +6805,7 @@
                 <w:lang w:eastAsia="ru-RU"/>
               </w:rPr>
               <w:drawing>
-                <wp:anchor distT="0" distB="0" distL="114300" distR="114300" simplePos="0" relativeHeight="251679744" behindDoc="1" locked="0" layoutInCell="1" allowOverlap="1" wp14:anchorId="59467267" wp14:editId="7E9FD1AD">
+                <wp:anchor distT="0" distB="0" distL="114300" distR="114300" simplePos="0" relativeHeight="251679744" behindDoc="1" locked="0" layoutInCell="1" allowOverlap="1" wp14:anchorId="276B0A2B" wp14:editId="5071C9DE">
                   <wp:simplePos x="0" y="0"/>
                   <wp:positionH relativeFrom="column">
                     <wp:posOffset>234315</wp:posOffset>
@@ -6823,7 +6949,29 @@
                         <w:sz w:val="28"/>
                         <w:szCs w:val="28"/>
                       </w:rPr>
-                      <m:t>i=1</m:t>
+                      <m:t>i</m:t>
+                    </m:r>
+                    <m:r>
+                      <m:rPr>
+                        <m:sty m:val="bi"/>
+                      </m:rPr>
+                      <w:rPr>
+                        <w:rFonts w:ascii="Cambria Math" w:hAnsi="Cambria Math"/>
+                        <w:sz w:val="28"/>
+                        <w:szCs w:val="28"/>
+                      </w:rPr>
+                      <m:t>=</m:t>
+                    </m:r>
+                    <m:r>
+                      <m:rPr>
+                        <m:sty m:val="bi"/>
+                      </m:rPr>
+                      <w:rPr>
+                        <w:rFonts w:ascii="Cambria Math" w:hAnsi="Cambria Math"/>
+                        <w:sz w:val="28"/>
+                        <w:szCs w:val="28"/>
+                      </w:rPr>
+                      <m:t>1</m:t>
                     </m:r>
                   </m:sub>
                   <m:sup>
@@ -6888,7 +7036,18 @@
                         <w:sz w:val="28"/>
                         <w:szCs w:val="28"/>
                       </w:rPr>
-                      <m:t>=0</m:t>
+                      <m:t>=</m:t>
+                    </m:r>
+                    <m:r>
+                      <m:rPr>
+                        <m:sty m:val="bi"/>
+                      </m:rPr>
+                      <w:rPr>
+                        <w:rFonts w:ascii="Cambria Math" w:hAnsi="Cambria Math"/>
+                        <w:sz w:val="28"/>
+                        <w:szCs w:val="28"/>
+                      </w:rPr>
+                      <m:t>0</m:t>
                     </m:r>
                   </m:e>
                 </m:nary>
@@ -6915,7 +7074,7 @@
                 <w:lang w:eastAsia="ru-RU"/>
               </w:rPr>
               <w:drawing>
-                <wp:anchor distT="0" distB="0" distL="114300" distR="114300" simplePos="0" relativeHeight="251681792" behindDoc="1" locked="0" layoutInCell="1" allowOverlap="1" wp14:anchorId="543BC824" wp14:editId="1479F54E">
+                <wp:anchor distT="0" distB="0" distL="114300" distR="114300" simplePos="0" relativeHeight="251681792" behindDoc="1" locked="0" layoutInCell="1" allowOverlap="1" wp14:anchorId="385A36F8" wp14:editId="77FBA274">
                   <wp:simplePos x="0" y="0"/>
                   <wp:positionH relativeFrom="column">
                     <wp:posOffset>320040</wp:posOffset>
@@ -7083,7 +7242,29 @@
                         <w:sz w:val="28"/>
                         <w:szCs w:val="28"/>
                       </w:rPr>
-                      <m:t>i=1</m:t>
+                      <m:t>i</m:t>
+                    </m:r>
+                    <m:r>
+                      <m:rPr>
+                        <m:sty m:val="bi"/>
+                      </m:rPr>
+                      <w:rPr>
+                        <w:rFonts w:ascii="Cambria Math" w:hAnsi="Cambria Math"/>
+                        <w:sz w:val="28"/>
+                        <w:szCs w:val="28"/>
+                      </w:rPr>
+                      <m:t>=</m:t>
+                    </m:r>
+                    <m:r>
+                      <m:rPr>
+                        <m:sty m:val="bi"/>
+                      </m:rPr>
+                      <w:rPr>
+                        <w:rFonts w:ascii="Cambria Math" w:hAnsi="Cambria Math"/>
+                        <w:sz w:val="28"/>
+                        <w:szCs w:val="28"/>
+                      </w:rPr>
+                      <m:t>1</m:t>
                     </m:r>
                   </m:sub>
                   <m:sup>
@@ -7150,7 +7331,18 @@
                     <w:sz w:val="28"/>
                     <w:szCs w:val="28"/>
                   </w:rPr>
-                  <m:t>=0</m:t>
+                  <m:t>=</m:t>
+                </m:r>
+                <m:r>
+                  <m:rPr>
+                    <m:sty m:val="bi"/>
+                  </m:rPr>
+                  <w:rPr>
+                    <w:rFonts w:ascii="Cambria Math" w:hAnsi="Cambria Math"/>
+                    <w:sz w:val="28"/>
+                    <w:szCs w:val="28"/>
+                  </w:rPr>
+                  <m:t>0</m:t>
                 </m:r>
               </m:oMath>
             </m:oMathPara>
@@ -7175,7 +7367,7 @@
                 <w:lang w:eastAsia="ru-RU"/>
               </w:rPr>
               <w:drawing>
-                <wp:anchor distT="0" distB="0" distL="114300" distR="114300" simplePos="0" relativeHeight="251682816" behindDoc="1" locked="0" layoutInCell="1" allowOverlap="1" wp14:anchorId="25C47E37" wp14:editId="7E2AC564">
+                <wp:anchor distT="0" distB="0" distL="114300" distR="114300" simplePos="0" relativeHeight="251682816" behindDoc="1" locked="0" layoutInCell="1" allowOverlap="1" wp14:anchorId="0B943E98" wp14:editId="513209D6">
                   <wp:simplePos x="0" y="0"/>
                   <wp:positionH relativeFrom="column">
                     <wp:posOffset>43180</wp:posOffset>
@@ -7391,7 +7583,18 @@
                         <w:sz w:val="28"/>
                         <w:szCs w:val="28"/>
                       </w:rPr>
-                      <m:t>I`</m:t>
+                      <m:t>I</m:t>
+                    </m:r>
+                    <m:r>
+                      <m:rPr>
+                        <m:sty m:val="bi"/>
+                      </m:rPr>
+                      <w:rPr>
+                        <w:rFonts w:ascii="Cambria Math" w:hAnsi="Cambria Math"/>
+                        <w:sz w:val="28"/>
+                        <w:szCs w:val="28"/>
+                      </w:rPr>
+                      <m:t>`</m:t>
                     </m:r>
                   </m:e>
                   <m:sub>
@@ -7450,7 +7653,7 @@
                 <w:szCs w:val="22"/>
               </w:rPr>
               <w:drawing>
-                <wp:anchor distT="0" distB="0" distL="114300" distR="114300" simplePos="0" relativeHeight="251680768" behindDoc="1" locked="0" layoutInCell="1" allowOverlap="1" wp14:anchorId="49E37D1F" wp14:editId="3743E867">
+                <wp:anchor distT="0" distB="0" distL="114300" distR="114300" simplePos="0" relativeHeight="251680768" behindDoc="1" locked="0" layoutInCell="1" allowOverlap="1" wp14:anchorId="07B02E90" wp14:editId="0CF6F94C">
                   <wp:simplePos x="0" y="0"/>
                   <wp:positionH relativeFrom="column">
                     <wp:posOffset>251460</wp:posOffset>
@@ -7686,7 +7889,19 @@
                         <w:sz w:val="28"/>
                         <w:szCs w:val="28"/>
                       </w:rPr>
-                      <m:t>U`</m:t>
+                      <m:t>U</m:t>
+                    </m:r>
+                    <m:r>
+                      <m:rPr>
+                        <m:sty m:val="bi"/>
+                      </m:rPr>
+                      <w:rPr>
+                        <w:rFonts w:ascii="Cambria Math" w:hAnsi="Cambria Math"/>
+                        <w:color w:val="000000"/>
+                        <w:sz w:val="28"/>
+                        <w:szCs w:val="28"/>
+                      </w:rPr>
+                      <m:t>`</m:t>
                     </m:r>
                   </m:e>
                   <m:sub>
@@ -7775,11 +7990,11 @@
               </w:rPr>
             </w:pPr>
             <w:r>
-              <w:object w:dxaOrig="2460" w:dyaOrig="1965" w14:anchorId="65A460C7">
+              <w:object w:dxaOrig="2460" w:dyaOrig="1965" w14:anchorId="79C687D0">
                 <v:shape id="_x0000_i1048" type="#_x0000_t75" style="width:97.2pt;height:88.2pt" o:ole="">
                   <v:imagedata r:id="rId77" o:title="" cropbottom="5436f" cropright="12291f"/>
                 </v:shape>
-                <o:OLEObject Type="Embed" ProgID="PBrush" ShapeID="_x0000_i1048" DrawAspect="Content" ObjectID="_1726560626" r:id="rId78"/>
+                <o:OLEObject Type="Embed" ProgID="PBrush" ShapeID="_x0000_i1048" DrawAspect="Content" ObjectID="_1850545053" r:id="rId78"/>
               </w:object>
             </w:r>
           </w:p>
@@ -8310,7 +8525,7 @@
                 <w:noProof/>
               </w:rPr>
               <w:drawing>
-                <wp:inline distT="0" distB="0" distL="0" distR="0" wp14:anchorId="43377E9A" wp14:editId="4300A2DA">
+                <wp:inline distT="0" distB="0" distL="0" distR="0" wp14:anchorId="50552109" wp14:editId="6CE13474">
                   <wp:extent cx="1522730" cy="1153795"/>
                   <wp:effectExtent l="0" t="0" r="1270" b="8255"/>
                   <wp:docPr id="15" name="Рисунок 15"/>
@@ -8683,7 +8898,7 @@
         <mc:AlternateContent>
           <mc:Choice Requires="wps">
             <w:drawing>
-              <wp:anchor distT="0" distB="0" distL="114300" distR="114300" simplePos="0" relativeHeight="251671552" behindDoc="0" locked="0" layoutInCell="1" allowOverlap="1" wp14:anchorId="081C5EAA" wp14:editId="5FF03671">
+              <wp:anchor distT="0" distB="0" distL="114300" distR="114300" simplePos="0" relativeHeight="251671552" behindDoc="0" locked="0" layoutInCell="1" allowOverlap="1" wp14:anchorId="16A62C58" wp14:editId="7FFFFC83">
                 <wp:simplePos x="0" y="0"/>
                 <wp:positionH relativeFrom="column">
                   <wp:posOffset>4267835</wp:posOffset>
@@ -8742,7 +8957,7 @@
               </wp:anchor>
             </w:drawing>
           </mc:Choice>
-          <mc:Fallback xmlns:w16sdtdh="http://schemas.microsoft.com/office/word/2020/wordml/sdtdatahash" xmlns:w16="http://schemas.microsoft.com/office/word/2018/wordml" xmlns:w16cid="http://schemas.microsoft.com/office/word/2016/wordml/cid" xmlns:w16cex="http://schemas.microsoft.com/office/word/2018/wordml/cex" xmlns:am3d="http://schemas.microsoft.com/office/drawing/2017/model3d" xmlns:aink="http://schemas.microsoft.com/office/drawing/2016/ink" xmlns:cx8="http://schemas.microsoft.com/office/drawing/2016/5/14/chartex" xmlns:cx7="http://schemas.microsoft.com/office/drawing/2016/5/13/chartex" xmlns:cx6="http://schemas.microsoft.com/office/drawing/2016/5/12/chartex" xmlns:cx5="http://schemas.microsoft.com/office/drawing/2016/5/11/chartex" xmlns:cx4="http://schemas.microsoft.com/office/drawing/2016/5/10/chartex" xmlns:cx3="http://schemas.microsoft.com/office/drawing/2016/5/9/chartex" xmlns:cx2="http://schemas.microsoft.com/office/drawing/2015/10/21/chartex" xmlns:cx1="http://schemas.microsoft.com/office/drawing/2015/9/8/chartex">
+          <mc:Fallback>
             <w:pict>
               <v:shape w14:anchorId="081C5EAA" id="Надпись 13" o:spid="_x0000_s1031" type="#_x0000_t202" style="position:absolute;left:0;text-align:left;margin-left:336.05pt;margin-top:44.4pt;width:58.65pt;height:32.75pt;z-index:251671552;visibility:visible;mso-wrap-style:square;mso-width-percent:0;mso-height-percent:0;mso-wrap-distance-left:9pt;mso-wrap-distance-top:0;mso-wrap-distance-right:9pt;mso-wrap-distance-bottom:0;mso-position-horizontal:absolute;mso-position-horizontal-relative:text;mso-position-vertical:absolute;mso-position-vertical-relative:text;mso-width-percent:0;mso-height-percent:0;mso-width-relative:margin;mso-height-relative:margin;v-text-anchor:top" o:gfxdata="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" filled="f" stroked="f" strokeweight=".5pt">
                 <v:textbox>
@@ -8769,7 +8984,7 @@
         <mc:AlternateContent>
           <mc:Choice Requires="wps">
             <w:drawing>
-              <wp:anchor distT="0" distB="0" distL="114300" distR="114300" simplePos="0" relativeHeight="251669504" behindDoc="0" locked="0" layoutInCell="1" allowOverlap="1" wp14:anchorId="26B6AFA7" wp14:editId="5ED4BEF9">
+              <wp:anchor distT="0" distB="0" distL="114300" distR="114300" simplePos="0" relativeHeight="251669504" behindDoc="0" locked="0" layoutInCell="1" allowOverlap="1" wp14:anchorId="1A8737E9" wp14:editId="5078A51C">
                 <wp:simplePos x="0" y="0"/>
                 <wp:positionH relativeFrom="column">
                   <wp:posOffset>2881630</wp:posOffset>
@@ -8828,7 +9043,7 @@
               </wp:anchor>
             </w:drawing>
           </mc:Choice>
-          <mc:Fallback xmlns:w16sdtdh="http://schemas.microsoft.com/office/word/2020/wordml/sdtdatahash" xmlns:w16="http://schemas.microsoft.com/office/word/2018/wordml" xmlns:w16cid="http://schemas.microsoft.com/office/word/2016/wordml/cid" xmlns:w16cex="http://schemas.microsoft.com/office/word/2018/wordml/cex" xmlns:am3d="http://schemas.microsoft.com/office/drawing/2017/model3d" xmlns:aink="http://schemas.microsoft.com/office/drawing/2016/ink" xmlns:cx8="http://schemas.microsoft.com/office/drawing/2016/5/14/chartex" xmlns:cx7="http://schemas.microsoft.com/office/drawing/2016/5/13/chartex" xmlns:cx6="http://schemas.microsoft.com/office/drawing/2016/5/12/chartex" xmlns:cx5="http://schemas.microsoft.com/office/drawing/2016/5/11/chartex" xmlns:cx4="http://schemas.microsoft.com/office/drawing/2016/5/10/chartex" xmlns:cx3="http://schemas.microsoft.com/office/drawing/2016/5/9/chartex" xmlns:cx2="http://schemas.microsoft.com/office/drawing/2015/10/21/chartex" xmlns:cx1="http://schemas.microsoft.com/office/drawing/2015/9/8/chartex">
+          <mc:Fallback>
             <w:pict>
               <v:shape w14:anchorId="26B6AFA7" id="Надпись 12" o:spid="_x0000_s1032" type="#_x0000_t202" style="position:absolute;left:0;text-align:left;margin-left:226.9pt;margin-top:117.6pt;width:58.65pt;height:32.75pt;z-index:251669504;visibility:visible;mso-wrap-style:square;mso-width-percent:0;mso-height-percent:0;mso-wrap-distance-left:9pt;mso-wrap-distance-top:0;mso-wrap-distance-right:9pt;mso-wrap-distance-bottom:0;mso-position-horizontal:absolute;mso-position-horizontal-relative:text;mso-position-vertical:absolute;mso-position-vertical-relative:text;mso-width-percent:0;mso-height-percent:0;mso-width-relative:margin;mso-height-relative:margin;v-text-anchor:top" o:gfxdata="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" filled="f" stroked="f" strokeweight=".5pt">
                 <v:textbox>
@@ -8848,11 +9063,11 @@
         </mc:AlternateContent>
       </w:r>
       <w:r>
-        <w:object w:dxaOrig="9765" w:dyaOrig="6240" w14:anchorId="602A7107">
+        <w:object w:dxaOrig="9765" w:dyaOrig="6240" w14:anchorId="3F62F73E">
           <v:shape id="_x0000_i1049" type="#_x0000_t75" style="width:468pt;height:298.8pt" o:ole="">
             <v:imagedata r:id="rId80" o:title=""/>
           </v:shape>
-          <o:OLEObject Type="Embed" ProgID="PBrush" ShapeID="_x0000_i1049" DrawAspect="Content" ObjectID="_1726560627" r:id="rId81"/>
+          <o:OLEObject Type="Embed" ProgID="PBrush" ShapeID="_x0000_i1049" DrawAspect="Content" ObjectID="_1850545054" r:id="rId81"/>
         </w:object>
       </w:r>
     </w:p>
@@ -8889,203 +9104,502 @@
         <w:t>Исходные данные</w:t>
       </w:r>
     </w:p>
-    <w:p>
-      <w:pPr>
-        <w:pStyle w:val="a6"/>
-        <w:numPr>
-          <w:ilvl w:val="0"/>
-          <w:numId w:val="1"/>
-        </w:numPr>
-        <w:spacing w:before="0" w:beforeAutospacing="0" w:after="0" w:afterAutospacing="0"/>
-        <w:rPr>
-          <w:sz w:val="28"/>
-          <w:szCs w:val="28"/>
-        </w:rPr>
-      </w:pPr>
-      <m:oMath>
-        <m:r>
-          <w:rPr>
-            <w:rFonts w:ascii="Cambria Math" w:hAnsi="Cambria Math"/>
-            <w:sz w:val="28"/>
-            <w:szCs w:val="28"/>
-          </w:rPr>
-          <m:t xml:space="preserve">E=12 </m:t>
-        </m:r>
-        <m:r>
-          <w:rPr>
-            <w:rFonts w:ascii="Cambria Math" w:hAnsi="Cambria Math"/>
-            <w:sz w:val="28"/>
-            <w:szCs w:val="28"/>
-            <w:lang w:val="en-US"/>
-          </w:rPr>
-          <m:t>В</m:t>
-        </m:r>
-        <m:r>
-          <w:rPr>
-            <w:rFonts w:ascii="Cambria Math" w:hAnsi="Cambria Math"/>
-            <w:sz w:val="28"/>
-            <w:szCs w:val="28"/>
-          </w:rPr>
-          <m:t>;</m:t>
-        </m:r>
-      </m:oMath>
-    </w:p>
-    <w:p>
-      <w:pPr>
-        <w:pStyle w:val="a6"/>
-        <w:numPr>
-          <w:ilvl w:val="0"/>
-          <w:numId w:val="1"/>
-        </w:numPr>
-        <w:spacing w:before="0" w:beforeAutospacing="0" w:after="0" w:afterAutospacing="0"/>
-        <w:rPr>
-          <w:i/>
-          <w:sz w:val="28"/>
-          <w:szCs w:val="28"/>
-        </w:rPr>
-      </w:pPr>
-      <m:oMath>
-        <m:r>
-          <w:rPr>
-            <w:rFonts w:ascii="Cambria Math" w:hAnsi="Cambria Math"/>
-            <w:sz w:val="28"/>
-            <w:szCs w:val="28"/>
-            <w:lang w:val="en-US"/>
-          </w:rPr>
-          <m:t>C</m:t>
-        </m:r>
-        <m:r>
-          <w:rPr>
-            <w:rFonts w:ascii="Cambria Math" w:hAnsi="Cambria Math"/>
-            <w:sz w:val="28"/>
-            <w:szCs w:val="28"/>
-          </w:rPr>
-          <m:t>=4*</m:t>
-        </m:r>
-        <m:sSup>
-          <m:sSupPr>
-            <m:ctrlPr>
-              <w:rPr>
-                <w:rFonts w:ascii="Cambria Math" w:hAnsi="Cambria Math"/>
-                <w:i/>
-                <w:sz w:val="28"/>
-                <w:szCs w:val="28"/>
-              </w:rPr>
-            </m:ctrlPr>
-          </m:sSupPr>
-          <m:e>
-            <m:r>
-              <w:rPr>
-                <w:rFonts w:ascii="Cambria Math" w:hAnsi="Cambria Math"/>
-                <w:sz w:val="28"/>
-                <w:szCs w:val="28"/>
-              </w:rPr>
-              <m:t>10</m:t>
-            </m:r>
-          </m:e>
-          <m:sup>
-            <m:r>
-              <w:rPr>
-                <w:rFonts w:ascii="Cambria Math" w:hAnsi="Cambria Math"/>
-                <w:sz w:val="28"/>
-                <w:szCs w:val="28"/>
-              </w:rPr>
-              <m:t>-4</m:t>
-            </m:r>
-          </m:sup>
-        </m:sSup>
-        <m:r>
-          <w:rPr>
-            <w:rFonts w:ascii="Cambria Math" w:hAnsi="Cambria Math"/>
-            <w:sz w:val="28"/>
-            <w:szCs w:val="28"/>
-          </w:rPr>
-          <m:t xml:space="preserve"> Ф;</m:t>
-        </m:r>
-      </m:oMath>
-    </w:p>
-    <w:p>
-      <w:pPr>
-        <w:pStyle w:val="a6"/>
-        <w:numPr>
-          <w:ilvl w:val="0"/>
-          <w:numId w:val="1"/>
-        </w:numPr>
-        <w:spacing w:before="0" w:beforeAutospacing="0" w:after="0" w:afterAutospacing="0"/>
-        <w:rPr>
-          <w:i/>
-          <w:sz w:val="28"/>
-          <w:szCs w:val="28"/>
-        </w:rPr>
-      </w:pPr>
-      <m:oMath>
-        <m:r>
-          <w:rPr>
-            <w:rFonts w:ascii="Cambria Math" w:hAnsi="Cambria Math"/>
-            <w:sz w:val="28"/>
-            <w:szCs w:val="28"/>
-          </w:rPr>
-          <m:t>R=100 Ом;</m:t>
-        </m:r>
-      </m:oMath>
-    </w:p>
-    <w:p>
-      <w:pPr>
-        <w:pStyle w:val="a6"/>
-        <w:numPr>
-          <w:ilvl w:val="0"/>
-          <w:numId w:val="1"/>
-        </w:numPr>
-        <w:spacing w:before="0" w:beforeAutospacing="0" w:after="0" w:afterAutospacing="0"/>
-        <w:rPr>
-          <w:sz w:val="28"/>
-          <w:szCs w:val="28"/>
-        </w:rPr>
-      </w:pPr>
-      <m:oMath>
-        <m:r>
-          <w:rPr>
-            <w:rFonts w:ascii="Cambria Math" w:hAnsi="Cambria Math"/>
-            <w:sz w:val="28"/>
-            <w:szCs w:val="28"/>
-          </w:rPr>
-          <m:t>r1=4 Ом</m:t>
-        </m:r>
-        <m:r>
-          <w:rPr>
-            <w:rFonts w:ascii="Cambria Math" w:hAnsi="Cambria Math"/>
-            <w:sz w:val="28"/>
-            <w:szCs w:val="28"/>
-            <w:lang w:val="en-US"/>
-          </w:rPr>
-          <m:t>;</m:t>
-        </m:r>
-      </m:oMath>
-    </w:p>
-    <w:p>
-      <w:pPr>
-        <w:pStyle w:val="a6"/>
-        <w:numPr>
-          <w:ilvl w:val="0"/>
-          <w:numId w:val="1"/>
-        </w:numPr>
-        <w:spacing w:before="0" w:beforeAutospacing="0" w:after="0" w:afterAutospacing="0"/>
-        <w:rPr>
-          <w:sz w:val="28"/>
-          <w:szCs w:val="28"/>
-        </w:rPr>
-      </w:pPr>
-      <m:oMath>
-        <m:r>
-          <w:rPr>
-            <w:rFonts w:ascii="Cambria Math" w:hAnsi="Cambria Math"/>
-            <w:sz w:val="28"/>
-            <w:szCs w:val="28"/>
-          </w:rPr>
-          <m:t>r2=40 Ом.</m:t>
-        </m:r>
-      </m:oMath>
-    </w:p>
+    <w:tbl>
+      <w:tblPr>
+        <w:tblStyle w:val="a7"/>
+        <w:tblW w:w="8400" w:type="dxa"/>
+        <w:jc w:val="center"/>
+        <w:tblLook w:val="04A0" w:firstRow="1" w:lastRow="0" w:firstColumn="1" w:lastColumn="0" w:noHBand="0" w:noVBand="1"/>
+      </w:tblPr>
+      <w:tblGrid>
+        <w:gridCol w:w="2800"/>
+        <w:gridCol w:w="2800"/>
+        <w:gridCol w:w="2800"/>
+      </w:tblGrid>
+      <w:tr>
+        <w:trPr>
+          <w:jc w:val="center"/>
+        </w:trPr>
+        <w:tc>
+          <w:tcPr>
+            <w:tcW w:w="2800" w:type="dxa"/>
+            <w:tcBorders>
+              <w:top w:val="single" w:sz="8" w:space="0" w:color="6A0DAD"/>
+              <w:left w:val="single" w:sz="8" w:space="0" w:color="6A0DAD"/>
+              <w:bottom w:val="single" w:sz="8" w:space="0" w:color="6A0DAD"/>
+              <w:right w:val="single" w:sz="8" w:space="0" w:color="6A0DAD"/>
+            </w:tcBorders>
+            <w:shd w:val="clear" w:color="auto" w:fill="6A0DAD"/>
+          </w:tcPr>
+          <w:p>
+            <w:pPr>
+              <w:jc w:val="center"/>
+            </w:pPr>
+            <w:r>
+              <w:rPr>
+                <w:rFonts w:ascii="Times New Roman" w:eastAsia="Times New Roman" w:hAnsi="Times New Roman"/>
+                <w:b/>
+                <w:color w:val="FFFFFF"/>
+                <w:sz w:val="26"/>
+              </w:rPr>
+              <w:t>Параметр</w:t>
+            </w:r>
+          </w:p>
+        </w:tc>
+        <w:tc>
+          <w:tcPr>
+            <w:tcW w:w="2800" w:type="dxa"/>
+            <w:tcBorders>
+              <w:top w:val="single" w:sz="8" w:space="0" w:color="6A0DAD"/>
+              <w:left w:val="single" w:sz="8" w:space="0" w:color="6A0DAD"/>
+              <w:bottom w:val="single" w:sz="8" w:space="0" w:color="6A0DAD"/>
+              <w:right w:val="single" w:sz="8" w:space="0" w:color="6A0DAD"/>
+            </w:tcBorders>
+            <w:shd w:val="clear" w:color="auto" w:fill="6A0DAD"/>
+          </w:tcPr>
+          <w:p>
+            <w:pPr>
+              <w:jc w:val="center"/>
+            </w:pPr>
+            <w:r>
+              <w:rPr>
+                <w:rFonts w:ascii="Times New Roman" w:eastAsia="Times New Roman" w:hAnsi="Times New Roman"/>
+                <w:b/>
+                <w:color w:val="FFFFFF"/>
+                <w:sz w:val="26"/>
+              </w:rPr>
+              <w:t>Значение</w:t>
+            </w:r>
+          </w:p>
+        </w:tc>
+        <w:tc>
+          <w:tcPr>
+            <w:tcW w:w="2800" w:type="dxa"/>
+            <w:tcBorders>
+              <w:top w:val="single" w:sz="8" w:space="0" w:color="6A0DAD"/>
+              <w:left w:val="single" w:sz="8" w:space="0" w:color="6A0DAD"/>
+              <w:bottom w:val="single" w:sz="8" w:space="0" w:color="6A0DAD"/>
+              <w:right w:val="single" w:sz="8" w:space="0" w:color="6A0DAD"/>
+            </w:tcBorders>
+            <w:shd w:val="clear" w:color="auto" w:fill="6A0DAD"/>
+          </w:tcPr>
+          <w:p>
+            <w:pPr>
+              <w:jc w:val="center"/>
+            </w:pPr>
+            <w:r>
+              <w:rPr>
+                <w:rFonts w:ascii="Times New Roman" w:eastAsia="Times New Roman" w:hAnsi="Times New Roman"/>
+                <w:b/>
+                <w:color w:val="FFFFFF"/>
+                <w:sz w:val="26"/>
+              </w:rPr>
+              <w:t>Единица измерения</w:t>
+            </w:r>
+          </w:p>
+        </w:tc>
+      </w:tr>
+      <w:tr>
+        <w:trPr>
+          <w:jc w:val="center"/>
+        </w:trPr>
+        <w:tc>
+          <w:tcPr>
+            <w:tcW w:w="2800" w:type="dxa"/>
+            <w:tcBorders>
+              <w:top w:val="single" w:sz="8" w:space="0" w:color="6A0DAD"/>
+              <w:left w:val="single" w:sz="8" w:space="0" w:color="6A0DAD"/>
+              <w:bottom w:val="single" w:sz="8" w:space="0" w:color="6A0DAD"/>
+              <w:right w:val="single" w:sz="8" w:space="0" w:color="6A0DAD"/>
+            </w:tcBorders>
+            <w:shd w:val="clear" w:color="auto" w:fill="F5EEF8"/>
+          </w:tcPr>
+          <w:p>
+            <w:pPr>
+              <w:jc w:val="center"/>
+            </w:pPr>
+            <w:r>
+              <w:rPr>
+                <w:rFonts w:ascii="Times New Roman" w:eastAsia="Times New Roman" w:hAnsi="Times New Roman"/>
+                <w:color w:val="1C2833"/>
+                <w:sz w:val="26"/>
+              </w:rPr>
+              <w:t>ЭДС источника E</w:t>
+            </w:r>
+          </w:p>
+        </w:tc>
+        <w:tc>
+          <w:tcPr>
+            <w:tcW w:w="2800" w:type="dxa"/>
+            <w:tcBorders>
+              <w:top w:val="single" w:sz="8" w:space="0" w:color="6A0DAD"/>
+              <w:left w:val="single" w:sz="8" w:space="0" w:color="6A0DAD"/>
+              <w:bottom w:val="single" w:sz="8" w:space="0" w:color="6A0DAD"/>
+              <w:right w:val="single" w:sz="8" w:space="0" w:color="6A0DAD"/>
+            </w:tcBorders>
+            <w:shd w:val="clear" w:color="auto" w:fill="F5EEF8"/>
+          </w:tcPr>
+          <w:p>
+            <w:pPr>
+              <w:jc w:val="center"/>
+            </w:pPr>
+            <w:r>
+              <w:rPr>
+                <w:rFonts w:ascii="Times New Roman" w:eastAsia="Times New Roman" w:hAnsi="Times New Roman"/>
+                <w:color w:val="1C2833"/>
+                <w:sz w:val="26"/>
+              </w:rPr>
+              <w:t>12</w:t>
+            </w:r>
+          </w:p>
+        </w:tc>
+        <w:tc>
+          <w:tcPr>
+            <w:tcW w:w="2800" w:type="dxa"/>
+            <w:tcBorders>
+              <w:top w:val="single" w:sz="8" w:space="0" w:color="6A0DAD"/>
+              <w:left w:val="single" w:sz="8" w:space="0" w:color="6A0DAD"/>
+              <w:bottom w:val="single" w:sz="8" w:space="0" w:color="6A0DAD"/>
+              <w:right w:val="single" w:sz="8" w:space="0" w:color="6A0DAD"/>
+            </w:tcBorders>
+            <w:shd w:val="clear" w:color="auto" w:fill="F5EEF8"/>
+          </w:tcPr>
+          <w:p>
+            <w:pPr>
+              <w:jc w:val="center"/>
+            </w:pPr>
+            <w:r>
+              <w:rPr>
+                <w:rFonts w:ascii="Times New Roman" w:eastAsia="Times New Roman" w:hAnsi="Times New Roman"/>
+                <w:color w:val="1C2833"/>
+                <w:sz w:val="26"/>
+              </w:rPr>
+              <w:t>В</w:t>
+            </w:r>
+          </w:p>
+        </w:tc>
+      </w:tr>
+      <w:tr>
+        <w:trPr>
+          <w:jc w:val="center"/>
+        </w:trPr>
+        <w:tc>
+          <w:tcPr>
+            <w:tcW w:w="2800" w:type="dxa"/>
+            <w:tcBorders>
+              <w:top w:val="single" w:sz="8" w:space="0" w:color="6A0DAD"/>
+              <w:left w:val="single" w:sz="8" w:space="0" w:color="6A0DAD"/>
+              <w:bottom w:val="single" w:sz="8" w:space="0" w:color="6A0DAD"/>
+              <w:right w:val="single" w:sz="8" w:space="0" w:color="6A0DAD"/>
+            </w:tcBorders>
+            <w:shd w:val="clear" w:color="auto" w:fill="FFFFFF"/>
+          </w:tcPr>
+          <w:p>
+            <w:pPr>
+              <w:jc w:val="center"/>
+            </w:pPr>
+            <w:r>
+              <w:rPr>
+                <w:rFonts w:ascii="Times New Roman" w:eastAsia="Times New Roman" w:hAnsi="Times New Roman"/>
+                <w:color w:val="1C2833"/>
+                <w:sz w:val="26"/>
+              </w:rPr>
+              <w:t>Ёмкость конденсатора C</w:t>
+            </w:r>
+          </w:p>
+        </w:tc>
+        <w:tc>
+          <w:tcPr>
+            <w:tcW w:w="2800" w:type="dxa"/>
+            <w:tcBorders>
+              <w:top w:val="single" w:sz="8" w:space="0" w:color="6A0DAD"/>
+              <w:left w:val="single" w:sz="8" w:space="0" w:color="6A0DAD"/>
+              <w:bottom w:val="single" w:sz="8" w:space="0" w:color="6A0DAD"/>
+              <w:right w:val="single" w:sz="8" w:space="0" w:color="6A0DAD"/>
+            </w:tcBorders>
+            <w:shd w:val="clear" w:color="auto" w:fill="FFFFFF"/>
+          </w:tcPr>
+          <w:p>
+            <w:pPr>
+              <w:jc w:val="center"/>
+            </w:pPr>
+            <w:r>
+              <w:rPr>
+                <w:rFonts w:ascii="Times New Roman" w:eastAsia="Times New Roman" w:hAnsi="Times New Roman"/>
+                <w:color w:val="1C2833"/>
+                <w:sz w:val="26"/>
+              </w:rPr>
+              <w:t>4·10⁻⁴</w:t>
+            </w:r>
+          </w:p>
+        </w:tc>
+        <w:tc>
+          <w:tcPr>
+            <w:tcW w:w="2800" w:type="dxa"/>
+            <w:tcBorders>
+              <w:top w:val="single" w:sz="8" w:space="0" w:color="6A0DAD"/>
+              <w:left w:val="single" w:sz="8" w:space="0" w:color="6A0DAD"/>
+              <w:bottom w:val="single" w:sz="8" w:space="0" w:color="6A0DAD"/>
+              <w:right w:val="single" w:sz="8" w:space="0" w:color="6A0DAD"/>
+            </w:tcBorders>
+            <w:shd w:val="clear" w:color="auto" w:fill="FFFFFF"/>
+          </w:tcPr>
+          <w:p>
+            <w:pPr>
+              <w:jc w:val="center"/>
+            </w:pPr>
+            <w:r>
+              <w:rPr>
+                <w:rFonts w:ascii="Times New Roman" w:eastAsia="Times New Roman" w:hAnsi="Times New Roman"/>
+                <w:color w:val="1C2833"/>
+                <w:sz w:val="26"/>
+              </w:rPr>
+              <w:t>Ф</w:t>
+            </w:r>
+          </w:p>
+        </w:tc>
+      </w:tr>
+      <w:tr>
+        <w:trPr>
+          <w:jc w:val="center"/>
+        </w:trPr>
+        <w:tc>
+          <w:tcPr>
+            <w:tcW w:w="2800" w:type="dxa"/>
+            <w:tcBorders>
+              <w:top w:val="single" w:sz="8" w:space="0" w:color="6A0DAD"/>
+              <w:left w:val="single" w:sz="8" w:space="0" w:color="6A0DAD"/>
+              <w:bottom w:val="single" w:sz="8" w:space="0" w:color="6A0DAD"/>
+              <w:right w:val="single" w:sz="8" w:space="0" w:color="6A0DAD"/>
+            </w:tcBorders>
+            <w:shd w:val="clear" w:color="auto" w:fill="F5EEF8"/>
+          </w:tcPr>
+          <w:p>
+            <w:pPr>
+              <w:jc w:val="center"/>
+            </w:pPr>
+            <w:r>
+              <w:rPr>
+                <w:rFonts w:ascii="Times New Roman" w:eastAsia="Times New Roman" w:hAnsi="Times New Roman"/>
+                <w:color w:val="1C2833"/>
+                <w:sz w:val="26"/>
+              </w:rPr>
+              <w:t>Сопротивление резистора R</w:t>
+            </w:r>
+          </w:p>
+        </w:tc>
+        <w:tc>
+          <w:tcPr>
+            <w:tcW w:w="2800" w:type="dxa"/>
+            <w:tcBorders>
+              <w:top w:val="single" w:sz="8" w:space="0" w:color="6A0DAD"/>
+              <w:left w:val="single" w:sz="8" w:space="0" w:color="6A0DAD"/>
+              <w:bottom w:val="single" w:sz="8" w:space="0" w:color="6A0DAD"/>
+              <w:right w:val="single" w:sz="8" w:space="0" w:color="6A0DAD"/>
+            </w:tcBorders>
+            <w:shd w:val="clear" w:color="auto" w:fill="F5EEF8"/>
+          </w:tcPr>
+          <w:p>
+            <w:pPr>
+              <w:jc w:val="center"/>
+            </w:pPr>
+            <w:r>
+              <w:rPr>
+                <w:rFonts w:ascii="Times New Roman" w:eastAsia="Times New Roman" w:hAnsi="Times New Roman"/>
+                <w:color w:val="1C2833"/>
+                <w:sz w:val="26"/>
+              </w:rPr>
+              <w:t>100</w:t>
+            </w:r>
+          </w:p>
+        </w:tc>
+        <w:tc>
+          <w:tcPr>
+            <w:tcW w:w="2800" w:type="dxa"/>
+            <w:tcBorders>
+              <w:top w:val="single" w:sz="8" w:space="0" w:color="6A0DAD"/>
+              <w:left w:val="single" w:sz="8" w:space="0" w:color="6A0DAD"/>
+              <w:bottom w:val="single" w:sz="8" w:space="0" w:color="6A0DAD"/>
+              <w:right w:val="single" w:sz="8" w:space="0" w:color="6A0DAD"/>
+            </w:tcBorders>
+            <w:shd w:val="clear" w:color="auto" w:fill="F5EEF8"/>
+          </w:tcPr>
+          <w:p>
+            <w:pPr>
+              <w:jc w:val="center"/>
+            </w:pPr>
+            <w:r>
+              <w:rPr>
+                <w:rFonts w:ascii="Times New Roman" w:eastAsia="Times New Roman" w:hAnsi="Times New Roman"/>
+                <w:color w:val="1C2833"/>
+                <w:sz w:val="26"/>
+              </w:rPr>
+              <w:t>Ом</w:t>
+            </w:r>
+          </w:p>
+        </w:tc>
+      </w:tr>
+      <w:tr>
+        <w:trPr>
+          <w:jc w:val="center"/>
+        </w:trPr>
+        <w:tc>
+          <w:tcPr>
+            <w:tcW w:w="2800" w:type="dxa"/>
+            <w:tcBorders>
+              <w:top w:val="single" w:sz="8" w:space="0" w:color="6A0DAD"/>
+              <w:left w:val="single" w:sz="8" w:space="0" w:color="6A0DAD"/>
+              <w:bottom w:val="single" w:sz="8" w:space="0" w:color="6A0DAD"/>
+              <w:right w:val="single" w:sz="8" w:space="0" w:color="6A0DAD"/>
+            </w:tcBorders>
+            <w:shd w:val="clear" w:color="auto" w:fill="FFFFFF"/>
+          </w:tcPr>
+          <w:p>
+            <w:pPr>
+              <w:jc w:val="center"/>
+            </w:pPr>
+            <w:r>
+              <w:rPr>
+                <w:rFonts w:ascii="Times New Roman" w:eastAsia="Times New Roman" w:hAnsi="Times New Roman"/>
+                <w:color w:val="1C2833"/>
+                <w:sz w:val="26"/>
+              </w:rPr>
+              <w:t>Сопротивление лампы Л1  r1</w:t>
+            </w:r>
+          </w:p>
+        </w:tc>
+        <w:tc>
+          <w:tcPr>
+            <w:tcW w:w="2800" w:type="dxa"/>
+            <w:tcBorders>
+              <w:top w:val="single" w:sz="8" w:space="0" w:color="6A0DAD"/>
+              <w:left w:val="single" w:sz="8" w:space="0" w:color="6A0DAD"/>
+              <w:bottom w:val="single" w:sz="8" w:space="0" w:color="6A0DAD"/>
+              <w:right w:val="single" w:sz="8" w:space="0" w:color="6A0DAD"/>
+            </w:tcBorders>
+            <w:shd w:val="clear" w:color="auto" w:fill="FFFFFF"/>
+          </w:tcPr>
+          <w:p>
+            <w:pPr>
+              <w:jc w:val="center"/>
+            </w:pPr>
+            <w:r>
+              <w:rPr>
+                <w:rFonts w:ascii="Times New Roman" w:eastAsia="Times New Roman" w:hAnsi="Times New Roman"/>
+                <w:color w:val="1C2833"/>
+                <w:sz w:val="26"/>
+              </w:rPr>
+              <w:t>4</w:t>
+            </w:r>
+          </w:p>
+        </w:tc>
+        <w:tc>
+          <w:tcPr>
+            <w:tcW w:w="2800" w:type="dxa"/>
+            <w:tcBorders>
+              <w:top w:val="single" w:sz="8" w:space="0" w:color="6A0DAD"/>
+              <w:left w:val="single" w:sz="8" w:space="0" w:color="6A0DAD"/>
+              <w:bottom w:val="single" w:sz="8" w:space="0" w:color="6A0DAD"/>
+              <w:right w:val="single" w:sz="8" w:space="0" w:color="6A0DAD"/>
+            </w:tcBorders>
+            <w:shd w:val="clear" w:color="auto" w:fill="FFFFFF"/>
+          </w:tcPr>
+          <w:p>
+            <w:pPr>
+              <w:jc w:val="center"/>
+            </w:pPr>
+            <w:r>
+              <w:rPr>
+                <w:rFonts w:ascii="Times New Roman" w:eastAsia="Times New Roman" w:hAnsi="Times New Roman"/>
+                <w:color w:val="1C2833"/>
+                <w:sz w:val="26"/>
+              </w:rPr>
+              <w:t>Ом</w:t>
+            </w:r>
+          </w:p>
+        </w:tc>
+      </w:tr>
+      <w:tr>
+        <w:trPr>
+          <w:jc w:val="center"/>
+        </w:trPr>
+        <w:tc>
+          <w:tcPr>
+            <w:tcW w:w="2800" w:type="dxa"/>
+            <w:tcBorders>
+              <w:top w:val="single" w:sz="8" w:space="0" w:color="6A0DAD"/>
+              <w:left w:val="single" w:sz="8" w:space="0" w:color="6A0DAD"/>
+              <w:bottom w:val="single" w:sz="8" w:space="0" w:color="6A0DAD"/>
+              <w:right w:val="single" w:sz="8" w:space="0" w:color="6A0DAD"/>
+            </w:tcBorders>
+            <w:shd w:val="clear" w:color="auto" w:fill="F5EEF8"/>
+          </w:tcPr>
+          <w:p>
+            <w:pPr>
+              <w:jc w:val="center"/>
+            </w:pPr>
+            <w:r>
+              <w:rPr>
+                <w:rFonts w:ascii="Times New Roman" w:eastAsia="Times New Roman" w:hAnsi="Times New Roman"/>
+                <w:color w:val="1C2833"/>
+                <w:sz w:val="26"/>
+              </w:rPr>
+              <w:t>Сопротивление лампы Л2  r2</w:t>
+            </w:r>
+          </w:p>
+        </w:tc>
+        <w:tc>
+          <w:tcPr>
+            <w:tcW w:w="2800" w:type="dxa"/>
+            <w:tcBorders>
+              <w:top w:val="single" w:sz="8" w:space="0" w:color="6A0DAD"/>
+              <w:left w:val="single" w:sz="8" w:space="0" w:color="6A0DAD"/>
+              <w:bottom w:val="single" w:sz="8" w:space="0" w:color="6A0DAD"/>
+              <w:right w:val="single" w:sz="8" w:space="0" w:color="6A0DAD"/>
+            </w:tcBorders>
+            <w:shd w:val="clear" w:color="auto" w:fill="F5EEF8"/>
+          </w:tcPr>
+          <w:p>
+            <w:pPr>
+              <w:jc w:val="center"/>
+            </w:pPr>
+            <w:r>
+              <w:rPr>
+                <w:rFonts w:ascii="Times New Roman" w:eastAsia="Times New Roman" w:hAnsi="Times New Roman"/>
+                <w:color w:val="1C2833"/>
+                <w:sz w:val="26"/>
+              </w:rPr>
+              <w:t>40</w:t>
+            </w:r>
+          </w:p>
+        </w:tc>
+        <w:tc>
+          <w:tcPr>
+            <w:tcW w:w="2800" w:type="dxa"/>
+            <w:tcBorders>
+              <w:top w:val="single" w:sz="8" w:space="0" w:color="6A0DAD"/>
+              <w:left w:val="single" w:sz="8" w:space="0" w:color="6A0DAD"/>
+              <w:bottom w:val="single" w:sz="8" w:space="0" w:color="6A0DAD"/>
+              <w:right w:val="single" w:sz="8" w:space="0" w:color="6A0DAD"/>
+            </w:tcBorders>
+            <w:shd w:val="clear" w:color="auto" w:fill="F5EEF8"/>
+          </w:tcPr>
+          <w:p>
+            <w:pPr>
+              <w:jc w:val="center"/>
+            </w:pPr>
+            <w:r>
+              <w:rPr>
+                <w:rFonts w:ascii="Times New Roman" w:eastAsia="Times New Roman" w:hAnsi="Times New Roman"/>
+                <w:color w:val="1C2833"/>
+                <w:sz w:val="26"/>
+              </w:rPr>
+              <w:t>Ом</w:t>
+            </w:r>
+          </w:p>
+        </w:tc>
+      </w:tr>
+    </w:tbl>
     <w:p>
       <w:pPr>
         <w:spacing w:after="0"/>
@@ -9176,7 +9690,18 @@
                       <w:sz w:val="32"/>
                       <w:szCs w:val="32"/>
                     </w:rPr>
-                    <m:t>E=</m:t>
+                    <m:t>E</m:t>
+                  </m:r>
+                  <m:r>
+                    <m:rPr>
+                      <m:sty m:val="bi"/>
+                    </m:rPr>
+                    <w:rPr>
+                      <w:rFonts w:ascii="Cambria Math" w:hAnsi="Cambria Math"/>
+                      <w:sz w:val="32"/>
+                      <w:szCs w:val="32"/>
+                    </w:rPr>
+                    <m:t>=</m:t>
                   </m:r>
                   <m:sSub>
                     <m:sSubPr>
@@ -9214,7 +9739,18 @@
                           <w:sz w:val="32"/>
                           <w:szCs w:val="32"/>
                         </w:rPr>
-                        <m:t>л1</m:t>
+                        <m:t>л</m:t>
+                      </m:r>
+                      <m:r>
+                        <m:rPr>
+                          <m:sty m:val="bi"/>
+                        </m:rPr>
+                        <w:rPr>
+                          <w:rFonts w:ascii="Cambria Math" w:hAnsi="Cambria Math"/>
+                          <w:sz w:val="32"/>
+                          <w:szCs w:val="32"/>
+                        </w:rPr>
+                        <m:t>1</m:t>
                       </m:r>
                     </m:sub>
                   </m:sSub>
@@ -9318,7 +9854,18 @@
                           <w:sz w:val="32"/>
                           <w:szCs w:val="32"/>
                         </w:rPr>
-                        <m:t>л1</m:t>
+                        <m:t>л</m:t>
+                      </m:r>
+                      <m:r>
+                        <m:rPr>
+                          <m:sty m:val="bi"/>
+                        </m:rPr>
+                        <w:rPr>
+                          <w:rFonts w:ascii="Cambria Math" w:hAnsi="Cambria Math"/>
+                          <w:sz w:val="32"/>
+                          <w:szCs w:val="32"/>
+                        </w:rPr>
+                        <m:t>1</m:t>
                       </m:r>
                     </m:sub>
                   </m:sSub>
@@ -9382,7 +9929,7 @@
                       <w:sz w:val="32"/>
                       <w:szCs w:val="32"/>
                     </w:rPr>
-                    <m:t>*r</m:t>
+                    <m:t>*</m:t>
                   </m:r>
                   <m:r>
                     <m:rPr>
@@ -9393,7 +9940,29 @@
                       <w:sz w:val="32"/>
                       <w:szCs w:val="32"/>
                     </w:rPr>
-                    <m:t xml:space="preserve">1 </m:t>
+                    <m:t>r</m:t>
+                  </m:r>
+                  <m:r>
+                    <m:rPr>
+                      <m:sty m:val="bi"/>
+                    </m:rPr>
+                    <w:rPr>
+                      <w:rFonts w:ascii="Cambria Math" w:hAnsi="Cambria Math"/>
+                      <w:sz w:val="32"/>
+                      <w:szCs w:val="32"/>
+                    </w:rPr>
+                    <m:t>1</m:t>
+                  </m:r>
+                  <m:r>
+                    <m:rPr>
+                      <m:sty m:val="bi"/>
+                    </m:rPr>
+                    <w:rPr>
+                      <w:rFonts w:ascii="Cambria Math" w:hAnsi="Cambria Math"/>
+                      <w:sz w:val="32"/>
+                      <w:szCs w:val="32"/>
+                    </w:rPr>
+                    <m:t xml:space="preserve"> </m:t>
                   </m:r>
                   <m:r>
                     <m:rPr>
@@ -9458,7 +10027,29 @@
                       <w:sz w:val="32"/>
                       <w:szCs w:val="32"/>
                     </w:rPr>
-                    <m:t>=c*</m:t>
+                    <m:t>=</m:t>
+                  </m:r>
+                  <m:r>
+                    <m:rPr>
+                      <m:sty m:val="bi"/>
+                    </m:rPr>
+                    <w:rPr>
+                      <w:rFonts w:ascii="Cambria Math" w:hAnsi="Cambria Math"/>
+                      <w:sz w:val="32"/>
+                      <w:szCs w:val="32"/>
+                    </w:rPr>
+                    <m:t>c</m:t>
+                  </m:r>
+                  <m:r>
+                    <m:rPr>
+                      <m:sty m:val="bi"/>
+                    </m:rPr>
+                    <w:rPr>
+                      <w:rFonts w:ascii="Cambria Math" w:hAnsi="Cambria Math"/>
+                      <w:sz w:val="32"/>
+                      <w:szCs w:val="32"/>
+                    </w:rPr>
+                    <m:t>*</m:t>
                   </m:r>
                   <m:sSubSup>
                     <m:sSubSupPr>
@@ -9564,7 +10155,6 @@
           <w:sz w:val="28"/>
           <w:szCs w:val="28"/>
         </w:rPr>
-        <w:lastRenderedPageBreak/>
         <w:t xml:space="preserve">Подставляем третье уравнение во второе и потом второе в первое, далее находим производную </w:t>
       </w:r>
       <w:proofErr w:type="spellStart"/>
@@ -10137,7 +10727,16 @@
                 <w:szCs w:val="28"/>
                 <w:lang w:val="en-US"/>
               </w:rPr>
-              <m:t xml:space="preserve">- </m:t>
+              <m:t>-</m:t>
+            </m:r>
+            <m:r>
+              <w:rPr>
+                <w:rFonts w:ascii="Cambria Math" w:hAnsi="Cambria Math"/>
+                <w:sz w:val="28"/>
+                <w:szCs w:val="28"/>
+                <w:lang w:val="en-US"/>
+              </w:rPr>
+              <m:t xml:space="preserve"> </m:t>
             </m:r>
             <m:sSub>
               <m:sSubPr>
@@ -10197,7 +10796,16 @@
                 <w:szCs w:val="28"/>
                 <w:lang w:val="en-US"/>
               </w:rPr>
-              <m:t>*r</m:t>
+              <m:t>*</m:t>
+            </m:r>
+            <m:r>
+              <w:rPr>
+                <w:rFonts w:ascii="Cambria Math" w:hAnsi="Cambria Math"/>
+                <w:sz w:val="28"/>
+                <w:szCs w:val="28"/>
+                <w:lang w:val="en-US"/>
+              </w:rPr>
+              <m:t>r</m:t>
             </m:r>
           </m:den>
         </m:f>
@@ -10681,7 +11289,18 @@
                 <w:sz w:val="32"/>
                 <w:szCs w:val="32"/>
               </w:rPr>
-              <m:t>E-</m:t>
+              <m:t>E</m:t>
+            </m:r>
+            <m:r>
+              <m:rPr>
+                <m:sty m:val="bi"/>
+              </m:rPr>
+              <w:rPr>
+                <w:rFonts w:ascii="Cambria Math" w:hAnsi="Cambria Math"/>
+                <w:sz w:val="32"/>
+                <w:szCs w:val="32"/>
+              </w:rPr>
+              <m:t>-</m:t>
             </m:r>
             <m:sSub>
               <m:sSubPr>
@@ -10745,7 +11364,29 @@
                 <w:sz w:val="32"/>
                 <w:szCs w:val="32"/>
               </w:rPr>
-              <m:t>1*c</m:t>
+              <m:t>1</m:t>
+            </m:r>
+            <m:r>
+              <m:rPr>
+                <m:sty m:val="bi"/>
+              </m:rPr>
+              <w:rPr>
+                <w:rFonts w:ascii="Cambria Math" w:hAnsi="Cambria Math"/>
+                <w:sz w:val="32"/>
+                <w:szCs w:val="32"/>
+              </w:rPr>
+              <m:t>*</m:t>
+            </m:r>
+            <m:r>
+              <m:rPr>
+                <m:sty m:val="bi"/>
+              </m:rPr>
+              <w:rPr>
+                <w:rFonts w:ascii="Cambria Math" w:hAnsi="Cambria Math"/>
+                <w:sz w:val="32"/>
+                <w:szCs w:val="32"/>
+              </w:rPr>
+              <m:t>c</m:t>
             </m:r>
           </m:den>
         </m:f>
@@ -11555,7 +12196,15 @@
                     <w:sz w:val="28"/>
                     <w:szCs w:val="28"/>
                   </w:rPr>
-                  <m:t>-E</m:t>
+                  <m:t>-</m:t>
+                </m:r>
+                <m:r>
+                  <w:rPr>
+                    <w:rFonts w:ascii="Cambria Math" w:hAnsi="Cambria Math"/>
+                    <w:sz w:val="28"/>
+                    <w:szCs w:val="28"/>
+                  </w:rPr>
+                  <m:t>E</m:t>
                 </m:r>
               </m:e>
             </m:d>
@@ -11595,7 +12244,23 @@
                     <w:sz w:val="28"/>
                     <w:szCs w:val="28"/>
                   </w:rPr>
-                  <m:t>r1*c</m:t>
+                  <m:t>r</m:t>
+                </m:r>
+                <m:r>
+                  <w:rPr>
+                    <w:rFonts w:ascii="Cambria Math" w:hAnsi="Cambria Math"/>
+                    <w:sz w:val="28"/>
+                    <w:szCs w:val="28"/>
+                  </w:rPr>
+                  <m:t>1*</m:t>
+                </m:r>
+                <m:r>
+                  <w:rPr>
+                    <w:rFonts w:ascii="Cambria Math" w:hAnsi="Cambria Math"/>
+                    <w:sz w:val="28"/>
+                    <w:szCs w:val="28"/>
+                  </w:rPr>
+                  <m:t>c</m:t>
                 </m:r>
               </m:den>
             </m:f>
@@ -11778,7 +12443,23 @@
             <w:sz w:val="28"/>
             <w:szCs w:val="28"/>
           </w:rPr>
-          <m:t>=E+</m:t>
+          <m:t>=</m:t>
+        </m:r>
+        <m:r>
+          <w:rPr>
+            <w:rFonts w:ascii="Cambria Math" w:hAnsi="Cambria Math"/>
+            <w:sz w:val="28"/>
+            <w:szCs w:val="28"/>
+          </w:rPr>
+          <m:t>E</m:t>
+        </m:r>
+        <m:r>
+          <w:rPr>
+            <w:rFonts w:ascii="Cambria Math" w:hAnsi="Cambria Math"/>
+            <w:sz w:val="28"/>
+            <w:szCs w:val="28"/>
+          </w:rPr>
+          <m:t>+</m:t>
         </m:r>
         <m:sSup>
           <m:sSupPr>
@@ -11838,7 +12519,23 @@
                     <w:sz w:val="28"/>
                     <w:szCs w:val="28"/>
                   </w:rPr>
-                  <m:t>r1*c</m:t>
+                  <m:t>r</m:t>
+                </m:r>
+                <m:r>
+                  <w:rPr>
+                    <w:rFonts w:ascii="Cambria Math" w:hAnsi="Cambria Math"/>
+                    <w:sz w:val="28"/>
+                    <w:szCs w:val="28"/>
+                  </w:rPr>
+                  <m:t>1*</m:t>
+                </m:r>
+                <m:r>
+                  <w:rPr>
+                    <w:rFonts w:ascii="Cambria Math" w:hAnsi="Cambria Math"/>
+                    <w:sz w:val="28"/>
+                    <w:szCs w:val="28"/>
+                  </w:rPr>
+                  <m:t>c</m:t>
                 </m:r>
               </m:den>
             </m:f>
@@ -11923,7 +12620,23 @@
             <w:sz w:val="28"/>
             <w:szCs w:val="28"/>
           </w:rPr>
-          <m:t>-E=</m:t>
+          <m:t>-</m:t>
+        </m:r>
+        <m:r>
+          <w:rPr>
+            <w:rFonts w:ascii="Cambria Math" w:hAnsi="Cambria Math"/>
+            <w:sz w:val="28"/>
+            <w:szCs w:val="28"/>
+          </w:rPr>
+          <m:t>E</m:t>
+        </m:r>
+        <m:r>
+          <w:rPr>
+            <w:rFonts w:ascii="Cambria Math" w:hAnsi="Cambria Math"/>
+            <w:sz w:val="28"/>
+            <w:szCs w:val="28"/>
+          </w:rPr>
+          <m:t>=</m:t>
         </m:r>
         <m:sSup>
           <m:sSupPr>
@@ -12038,7 +12751,39 @@
             <w:sz w:val="28"/>
             <w:szCs w:val="28"/>
           </w:rPr>
-          <m:t>=E-E*</m:t>
+          <m:t>=</m:t>
+        </m:r>
+        <m:r>
+          <w:rPr>
+            <w:rFonts w:ascii="Cambria Math" w:hAnsi="Cambria Math"/>
+            <w:sz w:val="28"/>
+            <w:szCs w:val="28"/>
+          </w:rPr>
+          <m:t>E</m:t>
+        </m:r>
+        <m:r>
+          <w:rPr>
+            <w:rFonts w:ascii="Cambria Math" w:hAnsi="Cambria Math"/>
+            <w:sz w:val="28"/>
+            <w:szCs w:val="28"/>
+          </w:rPr>
+          <m:t>-</m:t>
+        </m:r>
+        <m:r>
+          <w:rPr>
+            <w:rFonts w:ascii="Cambria Math" w:hAnsi="Cambria Math"/>
+            <w:sz w:val="28"/>
+            <w:szCs w:val="28"/>
+          </w:rPr>
+          <m:t>E</m:t>
+        </m:r>
+        <m:r>
+          <w:rPr>
+            <w:rFonts w:ascii="Cambria Math" w:hAnsi="Cambria Math"/>
+            <w:sz w:val="28"/>
+            <w:szCs w:val="28"/>
+          </w:rPr>
+          <m:t>*</m:t>
         </m:r>
         <m:sSup>
           <m:sSupPr>
@@ -12098,7 +12843,23 @@
                     <w:sz w:val="28"/>
                     <w:szCs w:val="28"/>
                   </w:rPr>
-                  <m:t>r1*c</m:t>
+                  <m:t>r</m:t>
+                </m:r>
+                <m:r>
+                  <w:rPr>
+                    <w:rFonts w:ascii="Cambria Math" w:hAnsi="Cambria Math"/>
+                    <w:sz w:val="28"/>
+                    <w:szCs w:val="28"/>
+                  </w:rPr>
+                  <m:t>1*</m:t>
+                </m:r>
+                <m:r>
+                  <w:rPr>
+                    <w:rFonts w:ascii="Cambria Math" w:hAnsi="Cambria Math"/>
+                    <w:sz w:val="28"/>
+                    <w:szCs w:val="28"/>
+                  </w:rPr>
+                  <m:t>c</m:t>
                 </m:r>
               </m:den>
             </m:f>
@@ -12207,7 +12968,55 @@
             <w:sz w:val="28"/>
             <w:szCs w:val="28"/>
           </w:rPr>
-          <m:t>=E(1-</m:t>
+          <m:t>=</m:t>
+        </m:r>
+        <m:r>
+          <m:rPr>
+            <m:sty m:val="b"/>
+          </m:rPr>
+          <w:rPr>
+            <w:rFonts w:ascii="Cambria Math" w:hAnsi="Cambria Math"/>
+            <w:color w:val="000000" w:themeColor="text1"/>
+            <w:sz w:val="28"/>
+            <w:szCs w:val="28"/>
+          </w:rPr>
+          <m:t>E</m:t>
+        </m:r>
+        <m:r>
+          <m:rPr>
+            <m:sty m:val="b"/>
+          </m:rPr>
+          <w:rPr>
+            <w:rFonts w:ascii="Cambria Math" w:hAnsi="Cambria Math"/>
+            <w:color w:val="000000" w:themeColor="text1"/>
+            <w:sz w:val="28"/>
+            <w:szCs w:val="28"/>
+          </w:rPr>
+          <m:t>(</m:t>
+        </m:r>
+        <m:r>
+          <m:rPr>
+            <m:sty m:val="b"/>
+          </m:rPr>
+          <w:rPr>
+            <w:rFonts w:ascii="Cambria Math" w:hAnsi="Cambria Math"/>
+            <w:color w:val="000000" w:themeColor="text1"/>
+            <w:sz w:val="28"/>
+            <w:szCs w:val="28"/>
+          </w:rPr>
+          <m:t>1</m:t>
+        </m:r>
+        <m:r>
+          <m:rPr>
+            <m:sty m:val="b"/>
+          </m:rPr>
+          <w:rPr>
+            <w:rFonts w:ascii="Cambria Math" w:hAnsi="Cambria Math"/>
+            <w:color w:val="000000" w:themeColor="text1"/>
+            <w:sz w:val="28"/>
+            <w:szCs w:val="28"/>
+          </w:rPr>
+          <m:t>-</m:t>
         </m:r>
         <m:sSup>
           <m:sSupPr>
@@ -12287,7 +13096,31 @@
                     <w:sz w:val="28"/>
                     <w:szCs w:val="28"/>
                   </w:rPr>
-                  <m:t>r1*c</m:t>
+                  <m:t>r1</m:t>
+                </m:r>
+                <m:r>
+                  <m:rPr>
+                    <m:sty m:val="b"/>
+                  </m:rPr>
+                  <w:rPr>
+                    <w:rFonts w:ascii="Cambria Math" w:hAnsi="Cambria Math"/>
+                    <w:color w:val="000000" w:themeColor="text1"/>
+                    <w:sz w:val="28"/>
+                    <w:szCs w:val="28"/>
+                  </w:rPr>
+                  <m:t>*</m:t>
+                </m:r>
+                <m:r>
+                  <m:rPr>
+                    <m:sty m:val="b"/>
+                  </m:rPr>
+                  <w:rPr>
+                    <w:rFonts w:ascii="Cambria Math" w:hAnsi="Cambria Math"/>
+                    <w:color w:val="000000" w:themeColor="text1"/>
+                    <w:sz w:val="28"/>
+                    <w:szCs w:val="28"/>
+                  </w:rPr>
+                  <m:t>c</m:t>
                 </m:r>
               </m:den>
             </m:f>
@@ -12355,7 +13188,7 @@
         </w:rPr>
         <w:lastRenderedPageBreak/>
         <w:drawing>
-          <wp:inline distT="0" distB="0" distL="0" distR="0" wp14:anchorId="395A5375" wp14:editId="19F951AF">
+          <wp:inline distT="0" distB="0" distL="0" distR="0" wp14:anchorId="52B3D7B8" wp14:editId="586791A6">
             <wp:extent cx="5940425" cy="2931795"/>
             <wp:effectExtent l="0" t="0" r="3175" b="1905"/>
             <wp:docPr id="40" name="Рисунок 40"/>
@@ -12430,7 +13263,7 @@
           <w:lang w:eastAsia="ru-RU"/>
         </w:rPr>
         <w:drawing>
-          <wp:inline distT="0" distB="0" distL="0" distR="0" wp14:anchorId="24A14078" wp14:editId="3B63E5FA">
+          <wp:inline distT="0" distB="0" distL="0" distR="0" wp14:anchorId="184B650C" wp14:editId="1F704BBD">
             <wp:extent cx="5940425" cy="2925445"/>
             <wp:effectExtent l="0" t="0" r="3175" b="8255"/>
             <wp:docPr id="23" name="Рисунок 23"/>
@@ -12536,7 +13369,7 @@
         </w:rPr>
         <w:lastRenderedPageBreak/>
         <w:drawing>
-          <wp:inline distT="0" distB="0" distL="0" distR="0" wp14:anchorId="3C4FDFFD" wp14:editId="285C3AA5">
+          <wp:inline distT="0" distB="0" distL="0" distR="0" wp14:anchorId="321644FD" wp14:editId="1B6161A6">
             <wp:extent cx="5940425" cy="2966720"/>
             <wp:effectExtent l="0" t="0" r="3175" b="5080"/>
             <wp:docPr id="42" name="Рисунок 42"/>
@@ -12685,7 +13518,7 @@
           <w:lang w:eastAsia="ru-RU"/>
         </w:rPr>
         <w:drawing>
-          <wp:inline distT="0" distB="0" distL="0" distR="0" wp14:anchorId="1BD91352" wp14:editId="7CE1EC8A">
+          <wp:inline distT="0" distB="0" distL="0" distR="0" wp14:anchorId="01EBD894" wp14:editId="4FE04CE1">
             <wp:extent cx="5940425" cy="3794125"/>
             <wp:effectExtent l="0" t="0" r="3175" b="0"/>
             <wp:docPr id="17" name="Рисунок 17"/>
@@ -12984,7 +13817,18 @@
                           <w:sz w:val="28"/>
                           <w:szCs w:val="28"/>
                         </w:rPr>
-                        <m:t>л2</m:t>
+                        <m:t>л</m:t>
+                      </m:r>
+                      <m:r>
+                        <m:rPr>
+                          <m:sty m:val="bi"/>
+                        </m:rPr>
+                        <w:rPr>
+                          <w:rFonts w:ascii="Cambria Math" w:hAnsi="Cambria Math"/>
+                          <w:sz w:val="28"/>
+                          <w:szCs w:val="28"/>
+                        </w:rPr>
+                        <m:t>2</m:t>
                       </m:r>
                     </m:sub>
                   </m:sSub>
@@ -13037,7 +13881,18 @@
                           <w:sz w:val="28"/>
                           <w:szCs w:val="28"/>
                         </w:rPr>
-                        <m:t>л2</m:t>
+                        <m:t>л</m:t>
+                      </m:r>
+                      <m:r>
+                        <m:rPr>
+                          <m:sty m:val="bi"/>
+                        </m:rPr>
+                        <w:rPr>
+                          <w:rFonts w:ascii="Cambria Math" w:hAnsi="Cambria Math"/>
+                          <w:sz w:val="28"/>
+                          <w:szCs w:val="28"/>
+                        </w:rPr>
+                        <m:t>2</m:t>
                       </m:r>
                     </m:sub>
                   </m:sSub>
@@ -13101,7 +13956,7 @@
                       <w:sz w:val="28"/>
                       <w:szCs w:val="28"/>
                     </w:rPr>
-                    <m:t>*r</m:t>
+                    <m:t>*</m:t>
                   </m:r>
                   <m:r>
                     <m:rPr>
@@ -13112,7 +13967,29 @@
                       <w:sz w:val="28"/>
                       <w:szCs w:val="28"/>
                     </w:rPr>
-                    <m:t xml:space="preserve">2 </m:t>
+                    <m:t>r</m:t>
+                  </m:r>
+                  <m:r>
+                    <m:rPr>
+                      <m:sty m:val="bi"/>
+                    </m:rPr>
+                    <w:rPr>
+                      <w:rFonts w:ascii="Cambria Math" w:hAnsi="Cambria Math"/>
+                      <w:sz w:val="28"/>
+                      <w:szCs w:val="28"/>
+                    </w:rPr>
+                    <m:t>2</m:t>
+                  </m:r>
+                  <m:r>
+                    <m:rPr>
+                      <m:sty m:val="bi"/>
+                    </m:rPr>
+                    <w:rPr>
+                      <w:rFonts w:ascii="Cambria Math" w:hAnsi="Cambria Math"/>
+                      <w:sz w:val="28"/>
+                      <w:szCs w:val="28"/>
+                    </w:rPr>
+                    <m:t xml:space="preserve"> </m:t>
                   </m:r>
                   <m:r>
                     <m:rPr>
@@ -13238,7 +14115,29 @@
                       <w:sz w:val="28"/>
                       <w:szCs w:val="28"/>
                     </w:rPr>
-                    <m:t>*R | Закон Ома</m:t>
+                    <m:t>*</m:t>
+                  </m:r>
+                  <m:r>
+                    <m:rPr>
+                      <m:sty m:val="bi"/>
+                    </m:rPr>
+                    <w:rPr>
+                      <w:rFonts w:ascii="Cambria Math" w:hAnsi="Cambria Math"/>
+                      <w:sz w:val="28"/>
+                      <w:szCs w:val="28"/>
+                    </w:rPr>
+                    <m:t>R</m:t>
+                  </m:r>
+                  <m:r>
+                    <m:rPr>
+                      <m:sty m:val="bi"/>
+                    </m:rPr>
+                    <w:rPr>
+                      <w:rFonts w:ascii="Cambria Math" w:hAnsi="Cambria Math"/>
+                      <w:sz w:val="28"/>
+                      <w:szCs w:val="28"/>
+                    </w:rPr>
+                    <m:t xml:space="preserve"> | Закон Ома</m:t>
                   </m:r>
                 </m:e>
                 <m:e>
@@ -13508,7 +14407,19 @@
                     <w:rPr>
                       <w:rFonts w:ascii="Cambria Math" w:hAnsi="Cambria Math"/>
                     </w:rPr>
-                    <m:t>*R-</m:t>
+                    <m:t>*</m:t>
+                  </m:r>
+                  <m:r>
+                    <w:rPr>
+                      <w:rFonts w:ascii="Cambria Math" w:hAnsi="Cambria Math"/>
+                    </w:rPr>
+                    <m:t>R</m:t>
+                  </m:r>
+                  <m:r>
+                    <w:rPr>
+                      <w:rFonts w:ascii="Cambria Math" w:hAnsi="Cambria Math"/>
+                    </w:rPr>
+                    <m:t>-</m:t>
                   </m:r>
                   <m:sSub>
                     <m:sSubPr>
@@ -13540,7 +14451,19 @@
                     <w:rPr>
                       <w:rFonts w:ascii="Cambria Math" w:hAnsi="Cambria Math"/>
                     </w:rPr>
-                    <m:t>*r2</m:t>
+                    <m:t>*</m:t>
+                  </m:r>
+                  <m:r>
+                    <w:rPr>
+                      <w:rFonts w:ascii="Cambria Math" w:hAnsi="Cambria Math"/>
+                    </w:rPr>
+                    <m:t>r</m:t>
+                  </m:r>
+                  <m:r>
+                    <w:rPr>
+                      <w:rFonts w:ascii="Cambria Math" w:hAnsi="Cambria Math"/>
+                    </w:rPr>
+                    <m:t>2</m:t>
                   </m:r>
                   <m:r>
                     <w:rPr>
@@ -13649,7 +14572,23 @@
                       <w:sz w:val="28"/>
                       <w:lang w:val="en-US"/>
                     </w:rPr>
-                    <m:t>*R-</m:t>
+                    <m:t>*</m:t>
+                  </m:r>
+                  <m:r>
+                    <w:rPr>
+                      <w:rFonts w:ascii="Cambria Math" w:hAnsi="Cambria Math"/>
+                      <w:sz w:val="28"/>
+                      <w:lang w:val="en-US"/>
+                    </w:rPr>
+                    <m:t>R</m:t>
+                  </m:r>
+                  <m:r>
+                    <w:rPr>
+                      <w:rFonts w:ascii="Cambria Math" w:hAnsi="Cambria Math"/>
+                      <w:sz w:val="28"/>
+                      <w:lang w:val="en-US"/>
+                    </w:rPr>
+                    <m:t>-</m:t>
                   </m:r>
                   <m:r>
                     <w:rPr>
@@ -13705,7 +14644,19 @@
                     <w:rPr>
                       <w:rFonts w:ascii="Cambria Math" w:hAnsi="Cambria Math"/>
                     </w:rPr>
-                    <m:t>*r2</m:t>
+                    <m:t>*</m:t>
+                  </m:r>
+                  <m:r>
+                    <w:rPr>
+                      <w:rFonts w:ascii="Cambria Math" w:hAnsi="Cambria Math"/>
+                    </w:rPr>
+                    <m:t>r</m:t>
+                  </m:r>
+                  <m:r>
+                    <w:rPr>
+                      <w:rFonts w:ascii="Cambria Math" w:hAnsi="Cambria Math"/>
+                    </w:rPr>
+                    <m:t>2</m:t>
                   </m:r>
                 </m:e>
               </m:eqArr>
@@ -13824,7 +14775,42 @@
                 <w:rFonts w:ascii="Cambria Math" w:hAnsi="Cambria Math"/>
                 <w:sz w:val="28"/>
               </w:rPr>
-              <m:t>(R+r2)*c</m:t>
+              <m:t>(</m:t>
+            </m:r>
+            <m:r>
+              <w:rPr>
+                <w:rFonts w:ascii="Cambria Math" w:hAnsi="Cambria Math"/>
+                <w:sz w:val="28"/>
+              </w:rPr>
+              <m:t>R</m:t>
+            </m:r>
+            <m:r>
+              <w:rPr>
+                <w:rFonts w:ascii="Cambria Math" w:hAnsi="Cambria Math"/>
+                <w:sz w:val="28"/>
+              </w:rPr>
+              <m:t>+</m:t>
+            </m:r>
+            <m:r>
+              <w:rPr>
+                <w:rFonts w:ascii="Cambria Math" w:hAnsi="Cambria Math"/>
+                <w:sz w:val="28"/>
+              </w:rPr>
+              <m:t>r</m:t>
+            </m:r>
+            <m:r>
+              <w:rPr>
+                <w:rFonts w:ascii="Cambria Math" w:hAnsi="Cambria Math"/>
+                <w:sz w:val="28"/>
+              </w:rPr>
+              <m:t>2)*</m:t>
+            </m:r>
+            <m:r>
+              <w:rPr>
+                <w:rFonts w:ascii="Cambria Math" w:hAnsi="Cambria Math"/>
+                <w:sz w:val="28"/>
+              </w:rPr>
+              <m:t>c</m:t>
             </m:r>
           </m:den>
         </m:f>
@@ -14037,7 +15023,29 @@
                     <w:sz w:val="28"/>
                     <w:szCs w:val="28"/>
                   </w:rPr>
-                  <m:t>R+r</m:t>
+                  <m:t>R</m:t>
+                </m:r>
+                <m:r>
+                  <m:rPr>
+                    <m:sty m:val="bi"/>
+                  </m:rPr>
+                  <w:rPr>
+                    <w:rFonts w:ascii="Cambria Math" w:hAnsi="Cambria Math"/>
+                    <w:sz w:val="28"/>
+                    <w:szCs w:val="28"/>
+                  </w:rPr>
+                  <m:t>+</m:t>
+                </m:r>
+                <m:r>
+                  <m:rPr>
+                    <m:sty m:val="bi"/>
+                  </m:rPr>
+                  <w:rPr>
+                    <w:rFonts w:ascii="Cambria Math" w:hAnsi="Cambria Math"/>
+                    <w:sz w:val="28"/>
+                    <w:szCs w:val="28"/>
+                  </w:rPr>
+                  <m:t>r</m:t>
                 </m:r>
                 <m:r>
                   <m:rPr>
@@ -14061,7 +15069,18 @@
                 <w:sz w:val="28"/>
                 <w:szCs w:val="28"/>
               </w:rPr>
-              <m:t>*c</m:t>
+              <m:t>*</m:t>
+            </m:r>
+            <m:r>
+              <m:rPr>
+                <m:sty m:val="bi"/>
+              </m:rPr>
+              <w:rPr>
+                <w:rFonts w:ascii="Cambria Math" w:hAnsi="Cambria Math"/>
+                <w:sz w:val="28"/>
+                <w:szCs w:val="28"/>
+              </w:rPr>
+              <m:t>c</m:t>
             </m:r>
           </m:den>
         </m:f>
@@ -14339,7 +15358,13 @@
               <w:rPr>
                 <w:rFonts w:ascii="Cambria Math" w:hAnsi="Cambria Math"/>
               </w:rPr>
-              <m:t>-dt</m:t>
+              <m:t>-</m:t>
+            </m:r>
+            <m:r>
+              <w:rPr>
+                <w:rFonts w:ascii="Cambria Math" w:hAnsi="Cambria Math"/>
+              </w:rPr>
+              <m:t>dt</m:t>
             </m:r>
           </m:num>
           <m:den>
@@ -14347,7 +15372,37 @@
               <w:rPr>
                 <w:rFonts w:ascii="Cambria Math" w:hAnsi="Cambria Math"/>
               </w:rPr>
-              <m:t>(R+r2)*c</m:t>
+              <m:t>(</m:t>
+            </m:r>
+            <m:r>
+              <w:rPr>
+                <w:rFonts w:ascii="Cambria Math" w:hAnsi="Cambria Math"/>
+              </w:rPr>
+              <m:t>R</m:t>
+            </m:r>
+            <m:r>
+              <w:rPr>
+                <w:rFonts w:ascii="Cambria Math" w:hAnsi="Cambria Math"/>
+              </w:rPr>
+              <m:t>+</m:t>
+            </m:r>
+            <m:r>
+              <w:rPr>
+                <w:rFonts w:ascii="Cambria Math" w:hAnsi="Cambria Math"/>
+              </w:rPr>
+              <m:t>r</m:t>
+            </m:r>
+            <m:r>
+              <w:rPr>
+                <w:rFonts w:ascii="Cambria Math" w:hAnsi="Cambria Math"/>
+              </w:rPr>
+              <m:t>2)*</m:t>
+            </m:r>
+            <m:r>
+              <w:rPr>
+                <w:rFonts w:ascii="Cambria Math" w:hAnsi="Cambria Math"/>
+              </w:rPr>
+              <m:t>c</m:t>
             </m:r>
           </m:den>
         </m:f>
@@ -14494,7 +15549,43 @@
                       <w:rPr>
                         <w:rFonts w:ascii="Cambria Math" w:hAnsi="Cambria Math"/>
                       </w:rPr>
-                      <m:t>c*(R+r2)</m:t>
+                      <m:t>c</m:t>
+                    </m:r>
+                    <m:r>
+                      <w:rPr>
+                        <w:rFonts w:ascii="Cambria Math" w:hAnsi="Cambria Math"/>
+                      </w:rPr>
+                      <m:t>*</m:t>
+                    </m:r>
+                    <m:r>
+                      <w:rPr>
+                        <w:rFonts w:ascii="Cambria Math" w:hAnsi="Cambria Math"/>
+                      </w:rPr>
+                      <m:t>(</m:t>
+                    </m:r>
+                    <m:r>
+                      <w:rPr>
+                        <w:rFonts w:ascii="Cambria Math" w:hAnsi="Cambria Math"/>
+                      </w:rPr>
+                      <m:t>R</m:t>
+                    </m:r>
+                    <m:r>
+                      <w:rPr>
+                        <w:rFonts w:ascii="Cambria Math" w:hAnsi="Cambria Math"/>
+                      </w:rPr>
+                      <m:t>+</m:t>
+                    </m:r>
+                    <m:r>
+                      <w:rPr>
+                        <w:rFonts w:ascii="Cambria Math" w:hAnsi="Cambria Math"/>
+                      </w:rPr>
+                      <m:t>r</m:t>
+                    </m:r>
+                    <m:r>
+                      <w:rPr>
+                        <w:rFonts w:ascii="Cambria Math" w:hAnsi="Cambria Math"/>
+                      </w:rPr>
+                      <m:t>2)</m:t>
                     </m:r>
                   </m:den>
                 </m:f>
@@ -14737,7 +15828,37 @@
                   <w:rPr>
                     <w:rFonts w:ascii="Cambria Math" w:hAnsi="Cambria Math"/>
                   </w:rPr>
-                  <m:t>(R+r2)*c</m:t>
+                  <m:t>(</m:t>
+                </m:r>
+                <m:r>
+                  <w:rPr>
+                    <w:rFonts w:ascii="Cambria Math" w:hAnsi="Cambria Math"/>
+                  </w:rPr>
+                  <m:t>R</m:t>
+                </m:r>
+                <m:r>
+                  <w:rPr>
+                    <w:rFonts w:ascii="Cambria Math" w:hAnsi="Cambria Math"/>
+                  </w:rPr>
+                  <m:t>+</m:t>
+                </m:r>
+                <m:r>
+                  <w:rPr>
+                    <w:rFonts w:ascii="Cambria Math" w:hAnsi="Cambria Math"/>
+                  </w:rPr>
+                  <m:t>r</m:t>
+                </m:r>
+                <m:r>
+                  <w:rPr>
+                    <w:rFonts w:ascii="Cambria Math" w:hAnsi="Cambria Math"/>
+                  </w:rPr>
+                  <m:t>2)*</m:t>
+                </m:r>
+                <m:r>
+                  <w:rPr>
+                    <w:rFonts w:ascii="Cambria Math" w:hAnsi="Cambria Math"/>
+                  </w:rPr>
+                  <m:t>c</m:t>
                 </m:r>
               </m:den>
             </m:f>
@@ -14954,7 +16075,37 @@
                     <w:rPr>
                       <w:rFonts w:ascii="Cambria Math" w:hAnsi="Cambria Math"/>
                     </w:rPr>
-                    <m:t>(R+r2)*c</m:t>
+                    <m:t>(</m:t>
+                  </m:r>
+                  <m:r>
+                    <w:rPr>
+                      <w:rFonts w:ascii="Cambria Math" w:hAnsi="Cambria Math"/>
+                    </w:rPr>
+                    <m:t>R</m:t>
+                  </m:r>
+                  <m:r>
+                    <w:rPr>
+                      <w:rFonts w:ascii="Cambria Math" w:hAnsi="Cambria Math"/>
+                    </w:rPr>
+                    <m:t>+</m:t>
+                  </m:r>
+                  <m:r>
+                    <w:rPr>
+                      <w:rFonts w:ascii="Cambria Math" w:hAnsi="Cambria Math"/>
+                    </w:rPr>
+                    <m:t>r</m:t>
+                  </m:r>
+                  <m:r>
+                    <w:rPr>
+                      <w:rFonts w:ascii="Cambria Math" w:hAnsi="Cambria Math"/>
+                    </w:rPr>
+                    <m:t>2)*</m:t>
+                  </m:r>
+                  <m:r>
+                    <w:rPr>
+                      <w:rFonts w:ascii="Cambria Math" w:hAnsi="Cambria Math"/>
+                    </w:rPr>
+                    <m:t>c</m:t>
                   </m:r>
                 </m:den>
               </m:f>
@@ -15035,7 +16186,13 @@
                 <w:rPr>
                   <w:rFonts w:ascii="Cambria Math" w:hAnsi="Cambria Math"/>
                 </w:rPr>
-                <m:t>c0</m:t>
+                <m:t>c</m:t>
+              </m:r>
+              <m:r>
+                <w:rPr>
+                  <w:rFonts w:ascii="Cambria Math" w:hAnsi="Cambria Math"/>
+                </w:rPr>
+                <m:t>0</m:t>
               </m:r>
             </m:sub>
           </m:sSub>
@@ -15075,7 +16232,19 @@
             <w:rPr>
               <w:rFonts w:ascii="Cambria Math" w:hAnsi="Cambria Math"/>
             </w:rPr>
-            <m:t>=E;</m:t>
+            <m:t>=</m:t>
+          </m:r>
+          <m:r>
+            <w:rPr>
+              <w:rFonts w:ascii="Cambria Math" w:hAnsi="Cambria Math"/>
+            </w:rPr>
+            <m:t>E</m:t>
+          </m:r>
+          <m:r>
+            <w:rPr>
+              <w:rFonts w:ascii="Cambria Math" w:hAnsi="Cambria Math"/>
+            </w:rPr>
+            <m:t>;</m:t>
           </m:r>
         </m:oMath>
       </m:oMathPara>
@@ -15256,7 +16425,18 @@
                 <w:sz w:val="32"/>
                 <w:szCs w:val="44"/>
               </w:rPr>
-              <m:t>*e</m:t>
+              <m:t>*</m:t>
+            </m:r>
+            <m:r>
+              <m:rPr>
+                <m:sty m:val="bi"/>
+              </m:rPr>
+              <w:rPr>
+                <w:rFonts w:ascii="Cambria Math" w:hAnsi="Cambria Math"/>
+                <w:sz w:val="32"/>
+                <w:szCs w:val="44"/>
+              </w:rPr>
+              <m:t>e</m:t>
             </m:r>
           </m:e>
           <m:sup>
@@ -15282,7 +16462,18 @@
                     <w:sz w:val="32"/>
                     <w:szCs w:val="44"/>
                   </w:rPr>
-                  <m:t>-t</m:t>
+                  <m:t>-</m:t>
+                </m:r>
+                <m:r>
+                  <m:rPr>
+                    <m:sty m:val="bi"/>
+                  </m:rPr>
+                  <w:rPr>
+                    <w:rFonts w:ascii="Cambria Math" w:hAnsi="Cambria Math"/>
+                    <w:sz w:val="32"/>
+                    <w:szCs w:val="44"/>
+                  </w:rPr>
+                  <m:t>t</m:t>
                 </m:r>
               </m:num>
               <m:den>
@@ -15295,7 +16486,7 @@
                     <w:sz w:val="28"/>
                     <w:szCs w:val="28"/>
                   </w:rPr>
-                  <m:t>(R+r</m:t>
+                  <m:t>(</m:t>
                 </m:r>
                 <m:r>
                   <m:rPr>
@@ -15306,7 +16497,51 @@
                     <w:sz w:val="28"/>
                     <w:szCs w:val="28"/>
                   </w:rPr>
-                  <m:t>2)</m:t>
+                  <m:t>R</m:t>
+                </m:r>
+                <m:r>
+                  <m:rPr>
+                    <m:sty m:val="bi"/>
+                  </m:rPr>
+                  <w:rPr>
+                    <w:rFonts w:ascii="Cambria Math" w:hAnsi="Cambria Math"/>
+                    <w:sz w:val="28"/>
+                    <w:szCs w:val="28"/>
+                  </w:rPr>
+                  <m:t>+</m:t>
+                </m:r>
+                <m:r>
+                  <m:rPr>
+                    <m:sty m:val="bi"/>
+                  </m:rPr>
+                  <w:rPr>
+                    <w:rFonts w:ascii="Cambria Math" w:hAnsi="Cambria Math"/>
+                    <w:sz w:val="28"/>
+                    <w:szCs w:val="28"/>
+                  </w:rPr>
+                  <m:t>r</m:t>
+                </m:r>
+                <m:r>
+                  <m:rPr>
+                    <m:sty m:val="bi"/>
+                  </m:rPr>
+                  <w:rPr>
+                    <w:rFonts w:ascii="Cambria Math" w:hAnsi="Cambria Math"/>
+                    <w:sz w:val="28"/>
+                    <w:szCs w:val="28"/>
+                  </w:rPr>
+                  <m:t>2</m:t>
+                </m:r>
+                <m:r>
+                  <m:rPr>
+                    <m:sty m:val="bi"/>
+                  </m:rPr>
+                  <w:rPr>
+                    <w:rFonts w:ascii="Cambria Math" w:hAnsi="Cambria Math"/>
+                    <w:sz w:val="28"/>
+                    <w:szCs w:val="28"/>
+                  </w:rPr>
+                  <m:t>)</m:t>
                 </m:r>
                 <m:r>
                   <m:rPr>
@@ -15317,7 +16552,18 @@
                     <w:sz w:val="32"/>
                     <w:szCs w:val="44"/>
                   </w:rPr>
-                  <m:t>*c</m:t>
+                  <m:t>*</m:t>
+                </m:r>
+                <m:r>
+                  <m:rPr>
+                    <m:sty m:val="bi"/>
+                  </m:rPr>
+                  <w:rPr>
+                    <w:rFonts w:ascii="Cambria Math" w:hAnsi="Cambria Math"/>
+                    <w:sz w:val="32"/>
+                    <w:szCs w:val="44"/>
+                  </w:rPr>
+                  <m:t>c</m:t>
                 </m:r>
               </m:den>
             </m:f>
@@ -15355,7 +16601,7 @@
         </w:rPr>
         <w:lastRenderedPageBreak/>
         <w:drawing>
-          <wp:inline distT="0" distB="0" distL="0" distR="0" wp14:anchorId="53FE66A6" wp14:editId="5AC6C5ED">
+          <wp:inline distT="0" distB="0" distL="0" distR="0" wp14:anchorId="6AF22689" wp14:editId="66BD3B98">
             <wp:extent cx="5940425" cy="3323590"/>
             <wp:effectExtent l="0" t="0" r="3175" b="0"/>
             <wp:docPr id="25" name="Рисунок 25"/>
@@ -15426,7 +16672,7 @@
           <w:lang w:eastAsia="ru-RU"/>
         </w:rPr>
         <w:drawing>
-          <wp:inline distT="0" distB="0" distL="0" distR="0" wp14:anchorId="59A8FA23" wp14:editId="74AF0142">
+          <wp:inline distT="0" distB="0" distL="0" distR="0" wp14:anchorId="04A430BB" wp14:editId="29EE28BD">
             <wp:extent cx="5940425" cy="3681730"/>
             <wp:effectExtent l="0" t="0" r="3175" b="0"/>
             <wp:docPr id="43" name="Рисунок 43"/>
@@ -15572,175 +16818,10 @@
       </w:pPr>
       <w:r>
         <w:rPr>
-          <w:rFonts w:ascii="Times New Roman" w:hAnsi="Times New Roman" w:cs="Times New Roman"/>
+          <w:rFonts w:ascii="Times New Roman" w:eastAsia="Times New Roman" w:hAnsi="Times New Roman"/>
           <w:sz w:val="28"/>
         </w:rPr>
-        <w:t>Изменения силы тока и напряжения при заряде (разряде) происходит по экспоненциальному закону. Увеличивая</w:t>
-      </w:r>
-      <w:r>
-        <w:rPr>
-          <w:rFonts w:ascii="Times New Roman" w:hAnsi="Times New Roman" w:cs="Times New Roman"/>
-          <w:sz w:val="28"/>
-        </w:rPr>
-        <w:t xml:space="preserve"> ем</w:t>
-      </w:r>
-      <w:r>
-        <w:rPr>
-          <w:rFonts w:ascii="Times New Roman" w:hAnsi="Times New Roman" w:cs="Times New Roman"/>
-          <w:sz w:val="28"/>
-        </w:rPr>
-        <w:t>кость</w:t>
-      </w:r>
-      <w:r>
-        <w:rPr>
-          <w:rFonts w:ascii="Times New Roman" w:hAnsi="Times New Roman" w:cs="Times New Roman"/>
-          <w:sz w:val="28"/>
-        </w:rPr>
-        <w:t xml:space="preserve"> конденсатора и его сопротивлени</w:t>
-      </w:r>
-      <w:r>
-        <w:rPr>
-          <w:rFonts w:ascii="Times New Roman" w:hAnsi="Times New Roman" w:cs="Times New Roman"/>
-          <w:sz w:val="28"/>
-        </w:rPr>
-        <w:t>е,</w:t>
-      </w:r>
-      <w:r>
-        <w:rPr>
-          <w:rFonts w:ascii="Times New Roman" w:hAnsi="Times New Roman" w:cs="Times New Roman"/>
-          <w:sz w:val="28"/>
-        </w:rPr>
-        <w:t xml:space="preserve"> время заряда (разряда) </w:t>
-      </w:r>
-      <w:r>
-        <w:rPr>
-          <w:rFonts w:ascii="Times New Roman" w:hAnsi="Times New Roman" w:cs="Times New Roman"/>
-          <w:bCs/>
-          <w:sz w:val="28"/>
-        </w:rPr>
-        <w:t>увеличивается</w:t>
-      </w:r>
-      <w:r>
-        <w:rPr>
-          <w:rFonts w:ascii="Times New Roman" w:hAnsi="Times New Roman" w:cs="Times New Roman"/>
-          <w:sz w:val="28"/>
-        </w:rPr>
-        <w:t xml:space="preserve">. При уменьшении емкости конденсатора и его сопротивления время его заряда (разряда) </w:t>
-      </w:r>
-      <w:r>
-        <w:rPr>
-          <w:rFonts w:ascii="Times New Roman" w:hAnsi="Times New Roman" w:cs="Times New Roman"/>
-          <w:bCs/>
-          <w:sz w:val="28"/>
-        </w:rPr>
-        <w:t>уменьшается</w:t>
-      </w:r>
-      <w:r>
-        <w:rPr>
-          <w:rFonts w:ascii="Times New Roman" w:hAnsi="Times New Roman" w:cs="Times New Roman"/>
-          <w:sz w:val="28"/>
-        </w:rPr>
-        <w:t>.</w:t>
-      </w:r>
-      <w:r>
-        <w:rPr>
-          <w:rFonts w:ascii="Times New Roman" w:hAnsi="Times New Roman" w:cs="Times New Roman"/>
-          <w:sz w:val="28"/>
-        </w:rPr>
-        <w:t xml:space="preserve"> Длительность переходного процесса определяется </w:t>
-      </w:r>
-      <w:r>
-        <w:rPr>
-          <w:rFonts w:ascii="Times New Roman" w:hAnsi="Times New Roman" w:cs="Times New Roman"/>
-          <w:sz w:val="28"/>
-        </w:rPr>
-        <w:t>показателем релаксации</w:t>
-      </w:r>
-      <w:r>
-        <w:rPr>
-          <w:rFonts w:ascii="Times New Roman" w:hAnsi="Times New Roman" w:cs="Times New Roman"/>
-          <w:sz w:val="28"/>
-        </w:rPr>
-        <w:t xml:space="preserve"> </w:t>
-      </w:r>
-      <w:r>
-        <w:rPr>
-          <w:rFonts w:ascii="Times New Roman" w:hAnsi="Times New Roman" w:cs="Times New Roman"/>
-          <w:sz w:val="28"/>
-        </w:rPr>
-        <w:t>[</w:t>
-      </w:r>
-      <w:r>
-        <w:rPr>
-          <w:rFonts w:ascii="Times New Roman" w:hAnsi="Times New Roman" w:cs="Times New Roman"/>
-          <w:sz w:val="28"/>
-          <w:lang w:val="en-US"/>
-        </w:rPr>
-        <w:t>R</w:t>
-      </w:r>
-      <w:r>
-        <w:rPr>
-          <w:rFonts w:ascii="Times New Roman" w:hAnsi="Times New Roman" w:cs="Times New Roman"/>
-          <w:sz w:val="28"/>
-        </w:rPr>
-        <w:t>*</w:t>
-      </w:r>
-      <w:r>
-        <w:rPr>
-          <w:rFonts w:ascii="Times New Roman" w:hAnsi="Times New Roman" w:cs="Times New Roman"/>
-          <w:sz w:val="28"/>
-          <w:lang w:val="en-US"/>
-        </w:rPr>
-        <w:t>c</w:t>
-      </w:r>
-      <w:r>
-        <w:rPr>
-          <w:rFonts w:ascii="Times New Roman" w:hAnsi="Times New Roman" w:cs="Times New Roman"/>
-          <w:sz w:val="28"/>
-        </w:rPr>
-        <w:t>]</w:t>
-      </w:r>
-      <w:r>
-        <w:rPr>
-          <w:rFonts w:ascii="Times New Roman" w:hAnsi="Times New Roman" w:cs="Times New Roman"/>
-          <w:sz w:val="28"/>
-        </w:rPr>
-        <w:t xml:space="preserve"> </w:t>
-      </w:r>
-      <w:r>
-        <w:rPr>
-          <w:rFonts w:ascii="Times New Roman" w:hAnsi="Times New Roman" w:cs="Times New Roman"/>
-          <w:sz w:val="28"/>
-        </w:rPr>
-        <w:t>=</w:t>
-      </w:r>
-      <w:r>
-        <w:rPr>
-          <w:rFonts w:ascii="Times New Roman" w:hAnsi="Times New Roman" w:cs="Times New Roman"/>
-          <w:sz w:val="28"/>
-        </w:rPr>
-        <w:t xml:space="preserve"> </w:t>
-      </w:r>
-      <w:r>
-        <w:rPr>
-          <w:rFonts w:ascii="Times New Roman" w:hAnsi="Times New Roman" w:cs="Times New Roman"/>
-          <w:sz w:val="28"/>
-        </w:rPr>
-        <w:t>сек</w:t>
-      </w:r>
-      <w:r>
-        <w:rPr>
-          <w:rFonts w:ascii="Times New Roman" w:hAnsi="Times New Roman" w:cs="Times New Roman"/>
-          <w:sz w:val="28"/>
-        </w:rPr>
-        <w:t>унды</w:t>
-      </w:r>
-      <w:r>
-        <w:rPr>
-          <w:rFonts w:ascii="Times New Roman" w:hAnsi="Times New Roman" w:cs="Times New Roman"/>
-          <w:sz w:val="28"/>
-        </w:rPr>
-        <w:t>.</w:t>
+        <w:t>Сила тока и напряжение на конденсаторе при заряде и разряде изменяются по экспоненциальному закону. Рост ёмкости конденсатора и сопротивления цепи растягивает переходный процесс во времени, а уменьшение этих величин, напротив, ускоряет заряд и разряд. Длительность переходного процесса определяется постоянной времени RC, которая измеряется в секундах.</w:t>
       </w:r>
     </w:p>
     <w:p>
@@ -15770,7 +16851,7 @@
 </file>
 
 <file path=word/numbering.xml><?xml version="1.0" encoding="utf-8"?>
-<w:numbering xmlns:wpc="http://schemas.microsoft.com/office/word/2010/wordprocessingCanvas" xmlns:cx="http://schemas.microsoft.com/office/drawing/2014/chartex" xmlns:mc="http://schemas.openxmlformats.org/markup-compatibility/2006" xmlns:o="urn:schemas-microsoft-com:office:office" xmlns:r="http://schemas.openxmlformats.org/officeDocument/2006/relationships" xmlns:m="http://schemas.openxmlformats.org/officeDocument/2006/math" xmlns:v="urn:schemas-microsoft-com:vml" xmlns:wp14="http://schemas.microsoft.com/office/word/2010/wordprocessingDrawing" xmlns:wp="http://schemas.openxmlformats.org/drawingml/2006/wordprocessingDrawing" xmlns:w10="urn:schemas-microsoft-com:office:word" xmlns:w="http://schemas.openxmlformats.org/wordprocessingml/2006/main" xmlns:w14="http://schemas.microsoft.com/office/word/2010/wordml" xmlns:w15="http://schemas.microsoft.com/office/word/2012/wordml" xmlns:w16se="http://schemas.microsoft.com/office/word/2015/wordml/symex" xmlns:wpg="http://schemas.microsoft.com/office/word/2010/wordprocessingGroup" xmlns:wpi="http://schemas.microsoft.com/office/word/2010/wordprocessingInk" xmlns:wne="http://schemas.microsoft.com/office/word/2006/wordml" xmlns:wps="http://schemas.microsoft.com/office/word/2010/wordprocessingShape" mc:Ignorable="w14 w15 w16se wp14">
+<w:numbering xmlns:wpc="http://schemas.microsoft.com/office/word/2010/wordprocessingCanvas" xmlns:cx="http://schemas.microsoft.com/office/drawing/2014/chartex" xmlns:cx1="http://schemas.microsoft.com/office/drawing/2015/9/8/chartex" xmlns:cx2="http://schemas.microsoft.com/office/drawing/2015/10/21/chartex" xmlns:cx3="http://schemas.microsoft.com/office/drawing/2016/5/9/chartex" xmlns:cx4="http://schemas.microsoft.com/office/drawing/2016/5/10/chartex" xmlns:cx5="http://schemas.microsoft.com/office/drawing/2016/5/11/chartex" xmlns:cx6="http://schemas.microsoft.com/office/drawing/2016/5/12/chartex" xmlns:cx7="http://schemas.microsoft.com/office/drawing/2016/5/13/chartex" xmlns:cx8="http://schemas.microsoft.com/office/drawing/2016/5/14/chartex" xmlns:mc="http://schemas.openxmlformats.org/markup-compatibility/2006" xmlns:aink="http://schemas.microsoft.com/office/drawing/2016/ink" xmlns:am3d="http://schemas.microsoft.com/office/drawing/2017/model3d" xmlns:o="urn:schemas-microsoft-com:office:office" xmlns:oel="http://schemas.microsoft.com/office/2019/extlst" xmlns:r="http://schemas.openxmlformats.org/officeDocument/2006/relationships" xmlns:m="http://schemas.openxmlformats.org/officeDocument/2006/math" xmlns:v="urn:schemas-microsoft-com:vml" xmlns:wp14="http://schemas.microsoft.com/office/word/2010/wordprocessingDrawing" xmlns:wp="http://schemas.openxmlformats.org/drawingml/2006/wordprocessingDrawing" xmlns:w10="urn:schemas-microsoft-com:office:word" xmlns:w="http://schemas.openxmlformats.org/wordprocessingml/2006/main" xmlns:w14="http://schemas.microsoft.com/office/word/2010/wordml" xmlns:w15="http://schemas.microsoft.com/office/word/2012/wordml" xmlns:w16cex="http://schemas.microsoft.com/office/word/2018/wordml/cex" xmlns:w16cid="http://schemas.microsoft.com/office/word/2016/wordml/cid" xmlns:w16="http://schemas.microsoft.com/office/word/2018/wordml" xmlns:w16sdtdh="http://schemas.microsoft.com/office/word/2020/wordml/sdtdatahash" xmlns:w16se="http://schemas.microsoft.com/office/word/2015/wordml/symex" xmlns:wpg="http://schemas.microsoft.com/office/word/2010/wordprocessingGroup" xmlns:wpi="http://schemas.microsoft.com/office/word/2010/wordprocessingInk" xmlns:wne="http://schemas.microsoft.com/office/word/2006/wordml" xmlns:wps="http://schemas.microsoft.com/office/word/2010/wordprocessingShape" mc:Ignorable="w14 w15 w16se w16cid w16 w16cex w16sdtdh wp14">
   <w:abstractNum w:abstractNumId="0" w15:restartNumberingAfterBreak="0">
     <w:nsid w:val="14F40FC1"/>
     <w:multiLevelType w:val="hybridMultilevel"/>
@@ -15980,7 +17061,7 @@
 </file>
 
 <file path=word/styles.xml><?xml version="1.0" encoding="utf-8"?>
-<w:styles xmlns:mc="http://schemas.openxmlformats.org/markup-compatibility/2006" xmlns:r="http://schemas.openxmlformats.org/officeDocument/2006/relationships" xmlns:w="http://schemas.openxmlformats.org/wordprocessingml/2006/main" xmlns:w14="http://schemas.microsoft.com/office/word/2010/wordml" xmlns:w15="http://schemas.microsoft.com/office/word/2012/wordml" xmlns:w16se="http://schemas.microsoft.com/office/word/2015/wordml/symex" mc:Ignorable="w14 w15 w16se">
+<w:styles xmlns:mc="http://schemas.openxmlformats.org/markup-compatibility/2006" xmlns:r="http://schemas.openxmlformats.org/officeDocument/2006/relationships" xmlns:w="http://schemas.openxmlformats.org/wordprocessingml/2006/main" xmlns:w14="http://schemas.microsoft.com/office/word/2010/wordml" xmlns:w15="http://schemas.microsoft.com/office/word/2012/wordml" xmlns:w16cex="http://schemas.microsoft.com/office/word/2018/wordml/cex" xmlns:w16cid="http://schemas.microsoft.com/office/word/2016/wordml/cid" xmlns:w16="http://schemas.microsoft.com/office/word/2018/wordml" xmlns:w16sdtdh="http://schemas.microsoft.com/office/word/2020/wordml/sdtdatahash" xmlns:w16se="http://schemas.microsoft.com/office/word/2015/wordml/symex" mc:Ignorable="w14 w15 w16se w16cid w16 w16cex w16sdtdh">
   <w:docDefaults>
     <w:rPrDefault>
       <w:rPr>
@@ -15996,7 +17077,7 @@
       </w:pPr>
     </w:pPrDefault>
   </w:docDefaults>
-  <w:latentStyles w:defLockedState="0" w:defUIPriority="99" w:defSemiHidden="0" w:defUnhideWhenUsed="0" w:defQFormat="0" w:count="371">
+  <w:latentStyles w:defLockedState="0" w:defUIPriority="99" w:defSemiHidden="0" w:defUnhideWhenUsed="0" w:defQFormat="0" w:count="376">
     <w:lsdException w:name="Normal" w:uiPriority="0" w:qFormat="1"/>
     <w:lsdException w:name="heading 1" w:uiPriority="9" w:qFormat="1"/>
     <w:lsdException w:name="heading 2" w:semiHidden="1" w:uiPriority="9" w:unhideWhenUsed="1" w:qFormat="1"/>
@@ -16102,7 +17183,6 @@
     <w:lsdException w:name="HTML Sample" w:semiHidden="1" w:unhideWhenUsed="1"/>
     <w:lsdException w:name="HTML Typewriter" w:semiHidden="1" w:unhideWhenUsed="1"/>
     <w:lsdException w:name="HTML Variable" w:semiHidden="1" w:unhideWhenUsed="1"/>
-    <w:lsdException w:name="Normal Table" w:semiHidden="1" w:unhideWhenUsed="1"/>
     <w:lsdException w:name="annotation subject" w:semiHidden="1" w:unhideWhenUsed="1"/>
     <w:lsdException w:name="No List" w:semiHidden="1" w:unhideWhenUsed="1"/>
     <w:lsdException w:name="Outline List 1" w:semiHidden="1" w:unhideWhenUsed="1"/>
@@ -16145,11 +17225,8 @@
     <w:lsdException w:name="Table Contemporary" w:semiHidden="1" w:unhideWhenUsed="1"/>
     <w:lsdException w:name="Table Elegant" w:semiHidden="1" w:unhideWhenUsed="1"/>
     <w:lsdException w:name="Table Professional" w:semiHidden="1" w:unhideWhenUsed="1"/>
-    <w:lsdException w:name="Table Subtle 1" w:semiHidden="1" w:unhideWhenUsed="1"/>
     <w:lsdException w:name="Table Subtle 2" w:semiHidden="1" w:unhideWhenUsed="1"/>
     <w:lsdException w:name="Table Web 1" w:semiHidden="1" w:unhideWhenUsed="1"/>
-    <w:lsdException w:name="Table Web 2" w:semiHidden="1" w:unhideWhenUsed="1"/>
-    <w:lsdException w:name="Table Web 3" w:semiHidden="1" w:unhideWhenUsed="1"/>
     <w:lsdException w:name="Balloon Text" w:semiHidden="1" w:unhideWhenUsed="1"/>
     <w:lsdException w:name="Table Grid" w:uiPriority="39"/>
     <w:lsdException w:name="Table Theme" w:semiHidden="1" w:unhideWhenUsed="1"/>
@@ -16368,6 +17445,11 @@
     <w:lsdException w:name="List Table 5 Dark Accent 6" w:uiPriority="50"/>
     <w:lsdException w:name="List Table 6 Colorful Accent 6" w:uiPriority="51"/>
     <w:lsdException w:name="List Table 7 Colorful Accent 6" w:uiPriority="52"/>
+    <w:lsdException w:name="Mention" w:semiHidden="1" w:unhideWhenUsed="1"/>
+    <w:lsdException w:name="Smart Hyperlink" w:semiHidden="1" w:unhideWhenUsed="1"/>
+    <w:lsdException w:name="Hashtag" w:semiHidden="1" w:unhideWhenUsed="1"/>
+    <w:lsdException w:name="Unresolved Mention" w:semiHidden="1" w:unhideWhenUsed="1"/>
+    <w:lsdException w:name="Smart Link" w:semiHidden="1" w:unhideWhenUsed="1"/>
   </w:latentStyles>
   <w:style w:type="paragraph" w:default="1" w:styleId="a">
     <w:name w:val="Normal"/>

</xml_diff>